<commit_message>
ran subcortical growth models
</commit_message>
<xml_diff>
--- a/GMV_timing_tempo_models/DCN analyses/GMV_fit_indices.docx
+++ b/GMV_timing_tempo_models/DCN analyses/GMV_fit_indices.docx
@@ -1418,8 +1418,16 @@
                 <w:ilvl w:val="0"/>
                 <w:numId w:val="1"/>
               </w:numPr>
-            </w:pPr>
-            <w:r>
+              <w:rPr>
+                <w:b/>
+                <w:bCs/>
+              </w:rPr>
+            </w:pPr>
+            <w:r>
+              <w:rPr>
+                <w:b/>
+                <w:bCs/>
+              </w:rPr>
               <w:t>Latent basis growth model</w:t>
             </w:r>
           </w:p>
@@ -2381,8 +2389,16 @@
                 <w:ilvl w:val="0"/>
                 <w:numId w:val="1"/>
               </w:numPr>
-            </w:pPr>
-            <w:r>
+              <w:rPr>
+                <w:b/>
+                <w:bCs/>
+              </w:rPr>
+            </w:pPr>
+            <w:r>
+              <w:rPr>
+                <w:b/>
+                <w:bCs/>
+              </w:rPr>
               <w:t>Quadratic growth model</w:t>
             </w:r>
           </w:p>
@@ -2396,11 +2412,13 @@
             <w:pPr>
               <w:jc w:val="center"/>
               <w:rPr>
-                <w:bCs/>
-              </w:rPr>
-            </w:pPr>
-            <w:r>
-              <w:rPr>
+                <w:b/>
+                <w:bCs/>
+              </w:rPr>
+            </w:pPr>
+            <w:r>
+              <w:rPr>
+                <w:b/>
                 <w:bCs/>
               </w:rPr>
               <w:t>31.62</w:t>
@@ -2416,11 +2434,13 @@
             <w:pPr>
               <w:jc w:val="center"/>
               <w:rPr>
-                <w:bCs/>
-              </w:rPr>
-            </w:pPr>
-            <w:r>
-              <w:rPr>
+                <w:b/>
+                <w:bCs/>
+              </w:rPr>
+            </w:pPr>
+            <w:r>
+              <w:rPr>
+                <w:b/>
                 <w:bCs/>
               </w:rPr>
               <w:t>4</w:t>
@@ -2436,11 +2456,13 @@
             <w:pPr>
               <w:jc w:val="center"/>
               <w:rPr>
-                <w:bCs/>
-              </w:rPr>
-            </w:pPr>
-            <w:r>
-              <w:rPr>
+                <w:b/>
+                <w:bCs/>
+              </w:rPr>
+            </w:pPr>
+            <w:r>
+              <w:rPr>
+                <w:b/>
                 <w:bCs/>
               </w:rPr>
               <w:t>&lt; .001</w:t>
@@ -2456,11 +2478,13 @@
             <w:pPr>
               <w:jc w:val="center"/>
               <w:rPr>
-                <w:bCs/>
-              </w:rPr>
-            </w:pPr>
-            <w:r>
-              <w:rPr>
+                <w:b/>
+                <w:bCs/>
+              </w:rPr>
+            </w:pPr>
+            <w:r>
+              <w:rPr>
+                <w:b/>
                 <w:bCs/>
               </w:rPr>
               <w:t>2.49</w:t>
@@ -2476,11 +2500,13 @@
             <w:pPr>
               <w:jc w:val="center"/>
               <w:rPr>
-                <w:bCs/>
-              </w:rPr>
-            </w:pPr>
-            <w:r>
-              <w:rPr>
+                <w:b/>
+                <w:bCs/>
+              </w:rPr>
+            </w:pPr>
+            <w:r>
+              <w:rPr>
+                <w:b/>
                 <w:bCs/>
               </w:rPr>
               <w:t>0.05</w:t>
@@ -2496,11 +2522,13 @@
             <w:pPr>
               <w:jc w:val="center"/>
               <w:rPr>
-                <w:bCs/>
-              </w:rPr>
-            </w:pPr>
-            <w:r>
-              <w:rPr>
+                <w:b/>
+                <w:bCs/>
+              </w:rPr>
+            </w:pPr>
+            <w:r>
+              <w:rPr>
+                <w:b/>
                 <w:bCs/>
               </w:rPr>
               <w:t>.99</w:t>
@@ -2516,11 +2544,13 @@
             <w:pPr>
               <w:jc w:val="center"/>
               <w:rPr>
-                <w:bCs/>
-              </w:rPr>
-            </w:pPr>
-            <w:r>
-              <w:rPr>
+                <w:b/>
+                <w:bCs/>
+              </w:rPr>
+            </w:pPr>
+            <w:r>
+              <w:rPr>
+                <w:b/>
                 <w:bCs/>
               </w:rPr>
               <w:t>79516.67</w:t>
@@ -2536,11 +2566,13 @@
             <w:pPr>
               <w:jc w:val="center"/>
               <w:rPr>
-                <w:bCs/>
-              </w:rPr>
-            </w:pPr>
-            <w:r>
-              <w:rPr>
+                <w:b/>
+                <w:bCs/>
+              </w:rPr>
+            </w:pPr>
+            <w:r>
+              <w:rPr>
+                <w:b/>
                 <w:bCs/>
               </w:rPr>
               <w:t>79575.47</w:t>
@@ -2556,17 +2588,20 @@
             <w:pPr>
               <w:jc w:val="center"/>
               <w:rPr>
-                <w:bCs/>
-              </w:rPr>
-            </w:pPr>
-            <w:r>
-              <w:rPr>
+                <w:b/>
+                <w:bCs/>
+              </w:rPr>
+            </w:pPr>
+            <w:r>
+              <w:rPr>
+                <w:b/>
                 <w:bCs/>
               </w:rPr>
               <w:t>79543.</w:t>
             </w:r>
             <w:r>
               <w:rPr>
+                <w:b/>
                 <w:bCs/>
               </w:rPr>
               <w:t>70</w:t>
@@ -2634,11 +2669,23 @@
                 <w:ilvl w:val="0"/>
                 <w:numId w:val="1"/>
               </w:numPr>
-            </w:pPr>
-            <w:r>
+              <w:rPr>
+                <w:b/>
+                <w:bCs/>
+              </w:rPr>
+            </w:pPr>
+            <w:r>
+              <w:rPr>
+                <w:b/>
+                <w:bCs/>
+              </w:rPr>
               <w:t>Latent basis growth model</w:t>
             </w:r>
             <w:r>
+              <w:rPr>
+                <w:b/>
+                <w:bCs/>
+              </w:rPr>
               <w:t>**</w:t>
             </w:r>
           </w:p>
@@ -2655,11 +2702,13 @@
             <w:pPr>
               <w:jc w:val="center"/>
               <w:rPr>
-                <w:bCs/>
-              </w:rPr>
-            </w:pPr>
-            <w:r>
-              <w:rPr>
+                <w:b/>
+                <w:bCs/>
+              </w:rPr>
+            </w:pPr>
+            <w:r>
+              <w:rPr>
+                <w:b/>
                 <w:bCs/>
               </w:rPr>
               <w:t>36.30</w:t>
@@ -2678,11 +2727,13 @@
             <w:pPr>
               <w:jc w:val="center"/>
               <w:rPr>
-                <w:bCs/>
-              </w:rPr>
-            </w:pPr>
-            <w:r>
-              <w:rPr>
+                <w:b/>
+                <w:bCs/>
+              </w:rPr>
+            </w:pPr>
+            <w:r>
+              <w:rPr>
+                <w:b/>
                 <w:bCs/>
               </w:rPr>
               <w:t>6</w:t>
@@ -2701,11 +2752,13 @@
             <w:pPr>
               <w:jc w:val="center"/>
               <w:rPr>
-                <w:bCs/>
-              </w:rPr>
-            </w:pPr>
-            <w:r>
-              <w:rPr>
+                <w:b/>
+                <w:bCs/>
+              </w:rPr>
+            </w:pPr>
+            <w:r>
+              <w:rPr>
+                <w:b/>
                 <w:bCs/>
               </w:rPr>
               <w:t>&lt;.001</w:t>
@@ -2724,11 +2777,13 @@
             <w:pPr>
               <w:jc w:val="center"/>
               <w:rPr>
-                <w:bCs/>
-              </w:rPr>
-            </w:pPr>
-            <w:r>
-              <w:rPr>
+                <w:b/>
+                <w:bCs/>
+              </w:rPr>
+            </w:pPr>
+            <w:r>
+              <w:rPr>
+                <w:b/>
                 <w:bCs/>
               </w:rPr>
               <w:t>2.50</w:t>
@@ -2747,11 +2802,13 @@
             <w:pPr>
               <w:jc w:val="center"/>
               <w:rPr>
-                <w:bCs/>
-              </w:rPr>
-            </w:pPr>
-            <w:r>
-              <w:rPr>
+                <w:b/>
+                <w:bCs/>
+              </w:rPr>
+            </w:pPr>
+            <w:r>
+              <w:rPr>
+                <w:b/>
                 <w:bCs/>
               </w:rPr>
               <w:t>0.04</w:t>
@@ -2770,11 +2827,13 @@
             <w:pPr>
               <w:jc w:val="center"/>
               <w:rPr>
-                <w:bCs/>
-              </w:rPr>
-            </w:pPr>
-            <w:r>
-              <w:rPr>
+                <w:b/>
+                <w:bCs/>
+              </w:rPr>
+            </w:pPr>
+            <w:r>
+              <w:rPr>
+                <w:b/>
                 <w:bCs/>
               </w:rPr>
               <w:t>.99</w:t>
@@ -2793,20 +2852,16 @@
             <w:pPr>
               <w:jc w:val="center"/>
               <w:rPr>
-                <w:bCs/>
-              </w:rPr>
-            </w:pPr>
-            <w:r>
-              <w:rPr>
-                <w:bCs/>
-              </w:rPr>
-              <w:t>79524.8</w:t>
-            </w:r>
-            <w:r>
-              <w:rPr>
-                <w:bCs/>
-              </w:rPr>
-              <w:t>4</w:t>
+                <w:b/>
+                <w:bCs/>
+              </w:rPr>
+            </w:pPr>
+            <w:r>
+              <w:rPr>
+                <w:b/>
+                <w:bCs/>
+              </w:rPr>
+              <w:t>79524.84</w:t>
             </w:r>
           </w:p>
         </w:tc>
@@ -2822,20 +2877,16 @@
             <w:pPr>
               <w:jc w:val="center"/>
               <w:rPr>
-                <w:bCs/>
-              </w:rPr>
-            </w:pPr>
-            <w:r>
-              <w:rPr>
-                <w:bCs/>
-              </w:rPr>
-              <w:t>79571.8</w:t>
-            </w:r>
-            <w:r>
-              <w:rPr>
-                <w:bCs/>
-              </w:rPr>
-              <w:t>8</w:t>
+                <w:b/>
+                <w:bCs/>
+              </w:rPr>
+            </w:pPr>
+            <w:r>
+              <w:rPr>
+                <w:b/>
+                <w:bCs/>
+              </w:rPr>
+              <w:t>79571.88</w:t>
             </w:r>
           </w:p>
         </w:tc>
@@ -2851,11 +2902,13 @@
             <w:pPr>
               <w:jc w:val="center"/>
               <w:rPr>
-                <w:bCs/>
-              </w:rPr>
-            </w:pPr>
-            <w:r>
-              <w:rPr>
+                <w:b/>
+                <w:bCs/>
+              </w:rPr>
+            </w:pPr>
+            <w:r>
+              <w:rPr>
+                <w:b/>
                 <w:bCs/>
               </w:rPr>
               <w:t>79546.46</w:t>
@@ -3074,7 +3127,2969 @@
         <w:t>.</w:t>
       </w:r>
     </w:p>
-    <w:p/>
+    <w:p>
+      <w:pPr>
+        <w:spacing w:after="160" w:line="259" w:lineRule="auto"/>
+        <w:rPr>
+          <w:rFonts w:eastAsia="Calibri"/>
+        </w:rPr>
+      </w:pPr>
+      <w:r>
+        <w:rPr>
+          <w:rFonts w:eastAsia="Calibri"/>
+          <w:i/>
+        </w:rPr>
+        <w:lastRenderedPageBreak/>
+        <w:t xml:space="preserve">Fit Indices of </w:t>
+      </w:r>
+      <w:r>
+        <w:rPr>
+          <w:rFonts w:eastAsia="Calibri"/>
+          <w:i/>
+        </w:rPr>
+        <w:t>Univariate</w:t>
+      </w:r>
+      <w:r>
+        <w:rPr>
+          <w:rFonts w:eastAsia="Calibri"/>
+          <w:i/>
+        </w:rPr>
+        <w:t xml:space="preserve"> Growth Curve Models for </w:t>
+      </w:r>
+      <w:r>
+        <w:rPr>
+          <w:rFonts w:eastAsia="Calibri"/>
+          <w:b/>
+          <w:bCs/>
+          <w:i/>
+          <w:u w:val="single"/>
+        </w:rPr>
+        <w:t>Subc</w:t>
+      </w:r>
+      <w:r>
+        <w:rPr>
+          <w:rFonts w:eastAsia="Calibri"/>
+          <w:b/>
+          <w:bCs/>
+          <w:i/>
+          <w:u w:val="single"/>
+        </w:rPr>
+        <w:t xml:space="preserve">ortical </w:t>
+      </w:r>
+      <w:r>
+        <w:rPr>
+          <w:rFonts w:eastAsia="Calibri"/>
+          <w:i/>
+        </w:rPr>
+        <w:t>Gray Matter Volume</w:t>
+      </w:r>
+    </w:p>
+    <w:p>
+      <w:pPr>
+        <w:spacing w:after="160" w:line="259" w:lineRule="auto"/>
+        <w:contextualSpacing/>
+        <w:rPr>
+          <w:rFonts w:eastAsia="Calibri"/>
+        </w:rPr>
+      </w:pPr>
+    </w:p>
+    <w:tbl>
+      <w:tblPr>
+        <w:tblStyle w:val="TableGrid3"/>
+        <w:tblW w:w="14504" w:type="dxa"/>
+        <w:tblInd w:w="-761" w:type="dxa"/>
+        <w:tblBorders>
+          <w:top w:val="none" w:sz="0" w:space="0" w:color="auto"/>
+          <w:left w:val="none" w:sz="0" w:space="0" w:color="auto"/>
+          <w:bottom w:val="none" w:sz="0" w:space="0" w:color="auto"/>
+          <w:right w:val="none" w:sz="0" w:space="0" w:color="auto"/>
+          <w:insideH w:val="none" w:sz="0" w:space="0" w:color="auto"/>
+          <w:insideV w:val="none" w:sz="0" w:space="0" w:color="auto"/>
+        </w:tblBorders>
+        <w:tblLook w:val="04A0" w:firstRow="1" w:lastRow="0" w:firstColumn="1" w:lastColumn="0" w:noHBand="0" w:noVBand="1"/>
+      </w:tblPr>
+      <w:tblGrid>
+        <w:gridCol w:w="2549"/>
+        <w:gridCol w:w="1109"/>
+        <w:gridCol w:w="887"/>
+        <w:gridCol w:w="923"/>
+        <w:gridCol w:w="1108"/>
+        <w:gridCol w:w="982"/>
+        <w:gridCol w:w="915"/>
+        <w:gridCol w:w="1041"/>
+        <w:gridCol w:w="1041"/>
+        <w:gridCol w:w="1041"/>
+        <w:gridCol w:w="1091"/>
+        <w:gridCol w:w="904"/>
+        <w:gridCol w:w="913"/>
+      </w:tblGrid>
+      <w:tr>
+        <w:trPr>
+          <w:trHeight w:val="334"/>
+        </w:trPr>
+        <w:tc>
+          <w:tcPr>
+            <w:tcW w:w="2549" w:type="dxa"/>
+            <w:tcBorders>
+              <w:top w:val="single" w:sz="4" w:space="0" w:color="auto"/>
+              <w:bottom w:val="single" w:sz="4" w:space="0" w:color="auto"/>
+            </w:tcBorders>
+            <w:vAlign w:val="center"/>
+          </w:tcPr>
+          <w:p>
+            <w:r>
+              <w:t>Model Label</w:t>
+            </w:r>
+          </w:p>
+        </w:tc>
+        <w:tc>
+          <w:tcPr>
+            <w:tcW w:w="1109" w:type="dxa"/>
+            <w:tcBorders>
+              <w:top w:val="single" w:sz="4" w:space="0" w:color="auto"/>
+              <w:bottom w:val="single" w:sz="4" w:space="0" w:color="auto"/>
+            </w:tcBorders>
+            <w:vAlign w:val="center"/>
+          </w:tcPr>
+          <w:p>
+            <w:pPr>
+              <w:jc w:val="center"/>
+              <w:rPr>
+                <w:vertAlign w:val="superscript"/>
+              </w:rPr>
+            </w:pPr>
+            <w:r>
+              <w:t>χ</w:t>
+            </w:r>
+            <w:r>
+              <w:rPr>
+                <w:vertAlign w:val="superscript"/>
+              </w:rPr>
+              <w:t>2</w:t>
+            </w:r>
+          </w:p>
+        </w:tc>
+        <w:tc>
+          <w:tcPr>
+            <w:tcW w:w="887" w:type="dxa"/>
+            <w:tcBorders>
+              <w:top w:val="single" w:sz="4" w:space="0" w:color="auto"/>
+              <w:bottom w:val="single" w:sz="4" w:space="0" w:color="auto"/>
+            </w:tcBorders>
+            <w:vAlign w:val="center"/>
+          </w:tcPr>
+          <w:p>
+            <w:pPr>
+              <w:jc w:val="center"/>
+              <w:rPr>
+                <w:i/>
+              </w:rPr>
+            </w:pPr>
+            <w:proofErr w:type="spellStart"/>
+            <w:r>
+              <w:rPr>
+                <w:i/>
+              </w:rPr>
+              <w:t>df</w:t>
+            </w:r>
+            <w:proofErr w:type="spellEnd"/>
+          </w:p>
+        </w:tc>
+        <w:tc>
+          <w:tcPr>
+            <w:tcW w:w="923" w:type="dxa"/>
+            <w:tcBorders>
+              <w:top w:val="single" w:sz="4" w:space="0" w:color="auto"/>
+              <w:bottom w:val="single" w:sz="4" w:space="0" w:color="auto"/>
+            </w:tcBorders>
+            <w:vAlign w:val="center"/>
+          </w:tcPr>
+          <w:p>
+            <w:pPr>
+              <w:jc w:val="center"/>
+            </w:pPr>
+            <w:r>
+              <w:rPr>
+                <w:i/>
+              </w:rPr>
+              <w:t>p</w:t>
+            </w:r>
+          </w:p>
+        </w:tc>
+        <w:tc>
+          <w:tcPr>
+            <w:tcW w:w="1108" w:type="dxa"/>
+            <w:tcBorders>
+              <w:top w:val="single" w:sz="4" w:space="0" w:color="auto"/>
+              <w:bottom w:val="single" w:sz="4" w:space="0" w:color="auto"/>
+            </w:tcBorders>
+            <w:vAlign w:val="center"/>
+          </w:tcPr>
+          <w:p>
+            <w:pPr>
+              <w:jc w:val="center"/>
+            </w:pPr>
+            <w:r>
+              <w:t>Scaling correction factor for MLR</w:t>
+            </w:r>
+          </w:p>
+        </w:tc>
+        <w:tc>
+          <w:tcPr>
+            <w:tcW w:w="982" w:type="dxa"/>
+            <w:tcBorders>
+              <w:top w:val="single" w:sz="4" w:space="0" w:color="auto"/>
+              <w:bottom w:val="single" w:sz="4" w:space="0" w:color="auto"/>
+            </w:tcBorders>
+            <w:vAlign w:val="center"/>
+          </w:tcPr>
+          <w:p>
+            <w:pPr>
+              <w:jc w:val="center"/>
+            </w:pPr>
+            <w:r>
+              <w:t>RMSEA</w:t>
+            </w:r>
+          </w:p>
+        </w:tc>
+        <w:tc>
+          <w:tcPr>
+            <w:tcW w:w="915" w:type="dxa"/>
+            <w:tcBorders>
+              <w:top w:val="single" w:sz="4" w:space="0" w:color="auto"/>
+              <w:bottom w:val="single" w:sz="4" w:space="0" w:color="auto"/>
+            </w:tcBorders>
+            <w:vAlign w:val="center"/>
+          </w:tcPr>
+          <w:p>
+            <w:pPr>
+              <w:jc w:val="center"/>
+            </w:pPr>
+            <w:r>
+              <w:t>CFI</w:t>
+            </w:r>
+          </w:p>
+        </w:tc>
+        <w:tc>
+          <w:tcPr>
+            <w:tcW w:w="1041" w:type="dxa"/>
+            <w:tcBorders>
+              <w:top w:val="single" w:sz="4" w:space="0" w:color="auto"/>
+              <w:bottom w:val="single" w:sz="4" w:space="0" w:color="auto"/>
+            </w:tcBorders>
+            <w:vAlign w:val="center"/>
+          </w:tcPr>
+          <w:p>
+            <w:pPr>
+              <w:jc w:val="center"/>
+              <w:rPr>
+                <w:color w:val="000000"/>
+              </w:rPr>
+            </w:pPr>
+            <w:r>
+              <w:rPr>
+                <w:color w:val="000000"/>
+              </w:rPr>
+              <w:t>AIC</w:t>
+            </w:r>
+          </w:p>
+        </w:tc>
+        <w:tc>
+          <w:tcPr>
+            <w:tcW w:w="1041" w:type="dxa"/>
+            <w:tcBorders>
+              <w:top w:val="single" w:sz="4" w:space="0" w:color="auto"/>
+              <w:bottom w:val="single" w:sz="4" w:space="0" w:color="auto"/>
+            </w:tcBorders>
+            <w:vAlign w:val="center"/>
+          </w:tcPr>
+          <w:p>
+            <w:pPr>
+              <w:jc w:val="center"/>
+              <w:rPr>
+                <w:color w:val="000000"/>
+              </w:rPr>
+            </w:pPr>
+            <w:r>
+              <w:rPr>
+                <w:color w:val="000000"/>
+              </w:rPr>
+              <w:t>BIC</w:t>
+            </w:r>
+          </w:p>
+        </w:tc>
+        <w:tc>
+          <w:tcPr>
+            <w:tcW w:w="1041" w:type="dxa"/>
+            <w:tcBorders>
+              <w:top w:val="single" w:sz="4" w:space="0" w:color="auto"/>
+              <w:bottom w:val="single" w:sz="4" w:space="0" w:color="auto"/>
+            </w:tcBorders>
+            <w:vAlign w:val="center"/>
+          </w:tcPr>
+          <w:p>
+            <w:pPr>
+              <w:jc w:val="center"/>
+              <w:rPr>
+                <w:color w:val="000000"/>
+              </w:rPr>
+            </w:pPr>
+            <w:r>
+              <w:rPr>
+                <w:color w:val="000000"/>
+              </w:rPr>
+              <w:t>SABIC</w:t>
+            </w:r>
+          </w:p>
+        </w:tc>
+        <w:tc>
+          <w:tcPr>
+            <w:tcW w:w="1091" w:type="dxa"/>
+            <w:tcBorders>
+              <w:top w:val="single" w:sz="4" w:space="0" w:color="auto"/>
+              <w:bottom w:val="single" w:sz="4" w:space="0" w:color="auto"/>
+            </w:tcBorders>
+            <w:vAlign w:val="center"/>
+          </w:tcPr>
+          <w:p>
+            <w:pPr>
+              <w:jc w:val="center"/>
+              <w:rPr>
+                <w:rFonts w:ascii="Calibri" w:hAnsi="Calibri" w:cs="Calibri"/>
+                <w:color w:val="000000"/>
+              </w:rPr>
+            </w:pPr>
+            <w:commentRangeStart w:id="2"/>
+            <w:proofErr w:type="spellStart"/>
+            <w:r>
+              <w:rPr>
+                <w:color w:val="000000"/>
+              </w:rPr>
+              <w:t>Satorra</w:t>
+            </w:r>
+            <w:proofErr w:type="spellEnd"/>
+            <w:r>
+              <w:rPr>
+                <w:color w:val="000000"/>
+              </w:rPr>
+              <w:t xml:space="preserve">-Bentler Scaled Chi Sq </w:t>
+            </w:r>
+            <w:r>
+              <w:rPr>
+                <w:rFonts w:ascii="Calibri" w:hAnsi="Calibri" w:cs="Calibri"/>
+                <w:color w:val="000000"/>
+              </w:rPr>
+              <w:t>(</w:t>
+            </w:r>
+            <w:r>
+              <w:rPr>
+                <w:rFonts w:ascii="Symbol" w:hAnsi="Symbol" w:cs="Calibri"/>
+                <w:color w:val="000000"/>
+              </w:rPr>
+              <w:t>Dc</w:t>
+            </w:r>
+            <w:r>
+              <w:rPr>
+                <w:rFonts w:ascii="Symbol" w:hAnsi="Symbol" w:cs="Calibri"/>
+                <w:color w:val="000000"/>
+                <w:vertAlign w:val="superscript"/>
+              </w:rPr>
+              <w:t>2</w:t>
+            </w:r>
+            <w:r>
+              <w:rPr>
+                <w:rFonts w:ascii="Symbol" w:hAnsi="Symbol" w:cs="Calibri"/>
+                <w:color w:val="000000"/>
+              </w:rPr>
+              <w:t>)</w:t>
+            </w:r>
+            <w:commentRangeEnd w:id="2"/>
+            <w:r>
+              <w:rPr>
+                <w:rStyle w:val="CommentReference"/>
+              </w:rPr>
+              <w:commentReference w:id="2"/>
+            </w:r>
+          </w:p>
+        </w:tc>
+        <w:tc>
+          <w:tcPr>
+            <w:tcW w:w="904" w:type="dxa"/>
+            <w:tcBorders>
+              <w:top w:val="single" w:sz="4" w:space="0" w:color="auto"/>
+              <w:bottom w:val="single" w:sz="4" w:space="0" w:color="auto"/>
+            </w:tcBorders>
+            <w:vAlign w:val="center"/>
+          </w:tcPr>
+          <w:p>
+            <w:pPr>
+              <w:jc w:val="center"/>
+              <w:rPr>
+                <w:i/>
+              </w:rPr>
+            </w:pPr>
+            <w:proofErr w:type="spellStart"/>
+            <w:r>
+              <w:t>Δ</w:t>
+            </w:r>
+            <w:r>
+              <w:rPr>
+                <w:i/>
+              </w:rPr>
+              <w:t>df</w:t>
+            </w:r>
+            <w:proofErr w:type="spellEnd"/>
+          </w:p>
+        </w:tc>
+        <w:tc>
+          <w:tcPr>
+            <w:tcW w:w="913" w:type="dxa"/>
+            <w:tcBorders>
+              <w:top w:val="single" w:sz="4" w:space="0" w:color="auto"/>
+              <w:bottom w:val="single" w:sz="4" w:space="0" w:color="auto"/>
+            </w:tcBorders>
+            <w:vAlign w:val="center"/>
+          </w:tcPr>
+          <w:p>
+            <w:pPr>
+              <w:jc w:val="center"/>
+            </w:pPr>
+            <w:r>
+              <w:rPr>
+                <w:i/>
+              </w:rPr>
+              <w:t>p</w:t>
+            </w:r>
+            <w:r>
+              <w:t>(d)</w:t>
+            </w:r>
+          </w:p>
+        </w:tc>
+      </w:tr>
+      <w:tr>
+        <w:trPr>
+          <w:trHeight w:val="315"/>
+        </w:trPr>
+        <w:tc>
+          <w:tcPr>
+            <w:tcW w:w="2549" w:type="dxa"/>
+            <w:tcBorders>
+              <w:top w:val="single" w:sz="4" w:space="0" w:color="auto"/>
+            </w:tcBorders>
+            <w:vAlign w:val="center"/>
+          </w:tcPr>
+          <w:p>
+            <w:commentRangeStart w:id="3"/>
+            <w:r>
+              <w:t>Female</w:t>
+            </w:r>
+            <w:r>
+              <w:t xml:space="preserve"> (n = 2397)</w:t>
+            </w:r>
+            <w:commentRangeEnd w:id="3"/>
+            <w:r>
+              <w:rPr>
+                <w:rStyle w:val="CommentReference"/>
+              </w:rPr>
+              <w:commentReference w:id="3"/>
+            </w:r>
+          </w:p>
+        </w:tc>
+        <w:tc>
+          <w:tcPr>
+            <w:tcW w:w="1109" w:type="dxa"/>
+            <w:tcBorders>
+              <w:top w:val="single" w:sz="4" w:space="0" w:color="auto"/>
+            </w:tcBorders>
+            <w:vAlign w:val="center"/>
+          </w:tcPr>
+          <w:p>
+            <w:pPr>
+              <w:jc w:val="center"/>
+            </w:pPr>
+          </w:p>
+        </w:tc>
+        <w:tc>
+          <w:tcPr>
+            <w:tcW w:w="887" w:type="dxa"/>
+            <w:tcBorders>
+              <w:top w:val="single" w:sz="4" w:space="0" w:color="auto"/>
+            </w:tcBorders>
+            <w:vAlign w:val="center"/>
+          </w:tcPr>
+          <w:p>
+            <w:pPr>
+              <w:jc w:val="center"/>
+            </w:pPr>
+          </w:p>
+        </w:tc>
+        <w:tc>
+          <w:tcPr>
+            <w:tcW w:w="923" w:type="dxa"/>
+            <w:tcBorders>
+              <w:top w:val="single" w:sz="4" w:space="0" w:color="auto"/>
+            </w:tcBorders>
+            <w:vAlign w:val="center"/>
+          </w:tcPr>
+          <w:p>
+            <w:pPr>
+              <w:jc w:val="center"/>
+            </w:pPr>
+          </w:p>
+        </w:tc>
+        <w:tc>
+          <w:tcPr>
+            <w:tcW w:w="1108" w:type="dxa"/>
+            <w:tcBorders>
+              <w:top w:val="single" w:sz="4" w:space="0" w:color="auto"/>
+            </w:tcBorders>
+            <w:vAlign w:val="center"/>
+          </w:tcPr>
+          <w:p>
+            <w:pPr>
+              <w:jc w:val="center"/>
+            </w:pPr>
+          </w:p>
+        </w:tc>
+        <w:tc>
+          <w:tcPr>
+            <w:tcW w:w="982" w:type="dxa"/>
+            <w:tcBorders>
+              <w:top w:val="single" w:sz="4" w:space="0" w:color="auto"/>
+            </w:tcBorders>
+            <w:vAlign w:val="center"/>
+          </w:tcPr>
+          <w:p>
+            <w:pPr>
+              <w:jc w:val="center"/>
+            </w:pPr>
+          </w:p>
+        </w:tc>
+        <w:tc>
+          <w:tcPr>
+            <w:tcW w:w="915" w:type="dxa"/>
+            <w:tcBorders>
+              <w:top w:val="single" w:sz="4" w:space="0" w:color="auto"/>
+            </w:tcBorders>
+            <w:vAlign w:val="center"/>
+          </w:tcPr>
+          <w:p>
+            <w:pPr>
+              <w:jc w:val="center"/>
+            </w:pPr>
+          </w:p>
+        </w:tc>
+        <w:tc>
+          <w:tcPr>
+            <w:tcW w:w="1041" w:type="dxa"/>
+            <w:tcBorders>
+              <w:top w:val="single" w:sz="4" w:space="0" w:color="auto"/>
+            </w:tcBorders>
+            <w:vAlign w:val="center"/>
+          </w:tcPr>
+          <w:p>
+            <w:pPr>
+              <w:jc w:val="center"/>
+            </w:pPr>
+          </w:p>
+        </w:tc>
+        <w:tc>
+          <w:tcPr>
+            <w:tcW w:w="1041" w:type="dxa"/>
+            <w:tcBorders>
+              <w:top w:val="single" w:sz="4" w:space="0" w:color="auto"/>
+            </w:tcBorders>
+            <w:vAlign w:val="center"/>
+          </w:tcPr>
+          <w:p>
+            <w:pPr>
+              <w:jc w:val="center"/>
+            </w:pPr>
+          </w:p>
+        </w:tc>
+        <w:tc>
+          <w:tcPr>
+            <w:tcW w:w="1041" w:type="dxa"/>
+            <w:tcBorders>
+              <w:top w:val="single" w:sz="4" w:space="0" w:color="auto"/>
+            </w:tcBorders>
+            <w:vAlign w:val="center"/>
+          </w:tcPr>
+          <w:p>
+            <w:pPr>
+              <w:jc w:val="center"/>
+            </w:pPr>
+          </w:p>
+        </w:tc>
+        <w:tc>
+          <w:tcPr>
+            <w:tcW w:w="1091" w:type="dxa"/>
+            <w:tcBorders>
+              <w:top w:val="single" w:sz="4" w:space="0" w:color="auto"/>
+            </w:tcBorders>
+            <w:vAlign w:val="center"/>
+          </w:tcPr>
+          <w:p>
+            <w:pPr>
+              <w:jc w:val="center"/>
+            </w:pPr>
+          </w:p>
+        </w:tc>
+        <w:tc>
+          <w:tcPr>
+            <w:tcW w:w="904" w:type="dxa"/>
+            <w:tcBorders>
+              <w:top w:val="single" w:sz="4" w:space="0" w:color="auto"/>
+            </w:tcBorders>
+            <w:vAlign w:val="center"/>
+          </w:tcPr>
+          <w:p>
+            <w:pPr>
+              <w:jc w:val="center"/>
+            </w:pPr>
+          </w:p>
+        </w:tc>
+        <w:tc>
+          <w:tcPr>
+            <w:tcW w:w="913" w:type="dxa"/>
+            <w:tcBorders>
+              <w:top w:val="single" w:sz="4" w:space="0" w:color="auto"/>
+            </w:tcBorders>
+            <w:vAlign w:val="center"/>
+          </w:tcPr>
+          <w:p>
+            <w:pPr>
+              <w:jc w:val="center"/>
+            </w:pPr>
+          </w:p>
+        </w:tc>
+      </w:tr>
+      <w:tr>
+        <w:trPr>
+          <w:trHeight w:val="411"/>
+        </w:trPr>
+        <w:tc>
+          <w:tcPr>
+            <w:tcW w:w="2549" w:type="dxa"/>
+            <w:vAlign w:val="center"/>
+          </w:tcPr>
+          <w:p>
+            <w:pPr>
+              <w:numPr>
+                <w:ilvl w:val="0"/>
+                <w:numId w:val="2"/>
+              </w:numPr>
+            </w:pPr>
+            <w:r>
+              <w:t>No growth</w:t>
+            </w:r>
+          </w:p>
+        </w:tc>
+        <w:tc>
+          <w:tcPr>
+            <w:tcW w:w="1109" w:type="dxa"/>
+            <w:vAlign w:val="center"/>
+          </w:tcPr>
+          <w:p>
+            <w:pPr>
+              <w:jc w:val="center"/>
+              <w:rPr>
+                <w:bCs/>
+              </w:rPr>
+            </w:pPr>
+            <w:r>
+              <w:rPr>
+                <w:bCs/>
+              </w:rPr>
+              <w:t>452.59</w:t>
+            </w:r>
+          </w:p>
+        </w:tc>
+        <w:tc>
+          <w:tcPr>
+            <w:tcW w:w="887" w:type="dxa"/>
+            <w:vAlign w:val="center"/>
+          </w:tcPr>
+          <w:p>
+            <w:pPr>
+              <w:jc w:val="center"/>
+              <w:rPr>
+                <w:bCs/>
+              </w:rPr>
+            </w:pPr>
+            <w:r>
+              <w:rPr>
+                <w:bCs/>
+              </w:rPr>
+              <w:t>11</w:t>
+            </w:r>
+          </w:p>
+        </w:tc>
+        <w:tc>
+          <w:tcPr>
+            <w:tcW w:w="923" w:type="dxa"/>
+            <w:vAlign w:val="center"/>
+          </w:tcPr>
+          <w:p>
+            <w:pPr>
+              <w:jc w:val="center"/>
+              <w:rPr>
+                <w:bCs/>
+              </w:rPr>
+            </w:pPr>
+            <w:r>
+              <w:rPr>
+                <w:bCs/>
+              </w:rPr>
+              <w:t>&lt; .001</w:t>
+            </w:r>
+          </w:p>
+        </w:tc>
+        <w:tc>
+          <w:tcPr>
+            <w:tcW w:w="1108" w:type="dxa"/>
+            <w:vAlign w:val="center"/>
+          </w:tcPr>
+          <w:p>
+            <w:pPr>
+              <w:jc w:val="center"/>
+              <w:rPr>
+                <w:bCs/>
+              </w:rPr>
+            </w:pPr>
+            <w:r>
+              <w:rPr>
+                <w:bCs/>
+              </w:rPr>
+              <w:t>2.</w:t>
+            </w:r>
+            <w:r>
+              <w:rPr>
+                <w:bCs/>
+              </w:rPr>
+              <w:t>6</w:t>
+            </w:r>
+            <w:r>
+              <w:rPr>
+                <w:bCs/>
+              </w:rPr>
+              <w:t>7</w:t>
+            </w:r>
+          </w:p>
+        </w:tc>
+        <w:tc>
+          <w:tcPr>
+            <w:tcW w:w="982" w:type="dxa"/>
+            <w:vAlign w:val="center"/>
+          </w:tcPr>
+          <w:p>
+            <w:pPr>
+              <w:jc w:val="center"/>
+              <w:rPr>
+                <w:bCs/>
+              </w:rPr>
+            </w:pPr>
+            <w:r>
+              <w:rPr>
+                <w:bCs/>
+              </w:rPr>
+              <w:t>0.</w:t>
+            </w:r>
+            <w:r>
+              <w:rPr>
+                <w:bCs/>
+              </w:rPr>
+              <w:t>13</w:t>
+            </w:r>
+          </w:p>
+        </w:tc>
+        <w:tc>
+          <w:tcPr>
+            <w:tcW w:w="915" w:type="dxa"/>
+            <w:vAlign w:val="center"/>
+          </w:tcPr>
+          <w:p>
+            <w:pPr>
+              <w:jc w:val="center"/>
+              <w:rPr>
+                <w:bCs/>
+              </w:rPr>
+            </w:pPr>
+            <w:r>
+              <w:rPr>
+                <w:bCs/>
+              </w:rPr>
+              <w:t>.</w:t>
+            </w:r>
+            <w:r>
+              <w:rPr>
+                <w:bCs/>
+              </w:rPr>
+              <w:t>87</w:t>
+            </w:r>
+          </w:p>
+        </w:tc>
+        <w:tc>
+          <w:tcPr>
+            <w:tcW w:w="1041" w:type="dxa"/>
+            <w:vAlign w:val="center"/>
+          </w:tcPr>
+          <w:p>
+            <w:pPr>
+              <w:jc w:val="center"/>
+              <w:rPr>
+                <w:bCs/>
+              </w:rPr>
+            </w:pPr>
+            <w:r>
+              <w:rPr>
+                <w:bCs/>
+              </w:rPr>
+              <w:t>31166.26</w:t>
+            </w:r>
+          </w:p>
+        </w:tc>
+        <w:tc>
+          <w:tcPr>
+            <w:tcW w:w="1041" w:type="dxa"/>
+            <w:vAlign w:val="center"/>
+          </w:tcPr>
+          <w:p>
+            <w:pPr>
+              <w:jc w:val="center"/>
+              <w:rPr>
+                <w:bCs/>
+              </w:rPr>
+            </w:pPr>
+            <w:r>
+              <w:rPr>
+                <w:bCs/>
+              </w:rPr>
+              <w:t>31183.6</w:t>
+            </w:r>
+            <w:r>
+              <w:rPr>
+                <w:bCs/>
+              </w:rPr>
+              <w:t>1</w:t>
+            </w:r>
+          </w:p>
+        </w:tc>
+        <w:tc>
+          <w:tcPr>
+            <w:tcW w:w="1041" w:type="dxa"/>
+            <w:vAlign w:val="center"/>
+          </w:tcPr>
+          <w:p>
+            <w:pPr>
+              <w:jc w:val="center"/>
+              <w:rPr>
+                <w:bCs/>
+              </w:rPr>
+            </w:pPr>
+            <w:r>
+              <w:rPr>
+                <w:bCs/>
+              </w:rPr>
+              <w:t>31174.0</w:t>
+            </w:r>
+            <w:r>
+              <w:rPr>
+                <w:bCs/>
+              </w:rPr>
+              <w:t>8</w:t>
+            </w:r>
+          </w:p>
+        </w:tc>
+        <w:tc>
+          <w:tcPr>
+            <w:tcW w:w="1091" w:type="dxa"/>
+            <w:vAlign w:val="center"/>
+          </w:tcPr>
+          <w:p>
+            <w:pPr>
+              <w:jc w:val="center"/>
+              <w:rPr>
+                <w:bCs/>
+              </w:rPr>
+            </w:pPr>
+          </w:p>
+        </w:tc>
+        <w:tc>
+          <w:tcPr>
+            <w:tcW w:w="904" w:type="dxa"/>
+            <w:vAlign w:val="center"/>
+          </w:tcPr>
+          <w:p>
+            <w:pPr>
+              <w:jc w:val="center"/>
+              <w:rPr>
+                <w:bCs/>
+              </w:rPr>
+            </w:pPr>
+          </w:p>
+        </w:tc>
+        <w:tc>
+          <w:tcPr>
+            <w:tcW w:w="913" w:type="dxa"/>
+            <w:vAlign w:val="center"/>
+          </w:tcPr>
+          <w:p>
+            <w:pPr>
+              <w:jc w:val="center"/>
+              <w:rPr>
+                <w:bCs/>
+              </w:rPr>
+            </w:pPr>
+          </w:p>
+        </w:tc>
+      </w:tr>
+      <w:tr>
+        <w:trPr>
+          <w:trHeight w:val="411"/>
+        </w:trPr>
+        <w:tc>
+          <w:tcPr>
+            <w:tcW w:w="2549" w:type="dxa"/>
+            <w:vAlign w:val="center"/>
+          </w:tcPr>
+          <w:p>
+            <w:pPr>
+              <w:numPr>
+                <w:ilvl w:val="0"/>
+                <w:numId w:val="2"/>
+              </w:numPr>
+            </w:pPr>
+            <w:r>
+              <w:t>Linear growth model</w:t>
+            </w:r>
+          </w:p>
+        </w:tc>
+        <w:tc>
+          <w:tcPr>
+            <w:tcW w:w="1109" w:type="dxa"/>
+            <w:vAlign w:val="center"/>
+          </w:tcPr>
+          <w:p>
+            <w:pPr>
+              <w:jc w:val="center"/>
+              <w:rPr>
+                <w:bCs/>
+              </w:rPr>
+            </w:pPr>
+            <w:r>
+              <w:rPr>
+                <w:bCs/>
+              </w:rPr>
+              <w:t>346.93</w:t>
+            </w:r>
+          </w:p>
+        </w:tc>
+        <w:tc>
+          <w:tcPr>
+            <w:tcW w:w="887" w:type="dxa"/>
+            <w:vAlign w:val="center"/>
+          </w:tcPr>
+          <w:p>
+            <w:pPr>
+              <w:jc w:val="center"/>
+              <w:rPr>
+                <w:bCs/>
+              </w:rPr>
+            </w:pPr>
+            <w:r>
+              <w:rPr>
+                <w:bCs/>
+              </w:rPr>
+              <w:t>8</w:t>
+            </w:r>
+          </w:p>
+        </w:tc>
+        <w:tc>
+          <w:tcPr>
+            <w:tcW w:w="923" w:type="dxa"/>
+            <w:vAlign w:val="center"/>
+          </w:tcPr>
+          <w:p>
+            <w:pPr>
+              <w:jc w:val="center"/>
+              <w:rPr>
+                <w:bCs/>
+              </w:rPr>
+            </w:pPr>
+            <w:r>
+              <w:rPr>
+                <w:bCs/>
+              </w:rPr>
+              <w:t>&lt; .001</w:t>
+            </w:r>
+          </w:p>
+        </w:tc>
+        <w:tc>
+          <w:tcPr>
+            <w:tcW w:w="1108" w:type="dxa"/>
+            <w:vAlign w:val="center"/>
+          </w:tcPr>
+          <w:p>
+            <w:pPr>
+              <w:jc w:val="center"/>
+              <w:rPr>
+                <w:bCs/>
+              </w:rPr>
+            </w:pPr>
+            <w:r>
+              <w:rPr>
+                <w:bCs/>
+              </w:rPr>
+              <w:t>3.06</w:t>
+            </w:r>
+          </w:p>
+        </w:tc>
+        <w:tc>
+          <w:tcPr>
+            <w:tcW w:w="982" w:type="dxa"/>
+            <w:vAlign w:val="center"/>
+          </w:tcPr>
+          <w:p>
+            <w:pPr>
+              <w:jc w:val="center"/>
+              <w:rPr>
+                <w:bCs/>
+              </w:rPr>
+            </w:pPr>
+            <w:r>
+              <w:rPr>
+                <w:bCs/>
+              </w:rPr>
+              <w:t>0.13</w:t>
+            </w:r>
+          </w:p>
+        </w:tc>
+        <w:tc>
+          <w:tcPr>
+            <w:tcW w:w="915" w:type="dxa"/>
+            <w:vAlign w:val="center"/>
+          </w:tcPr>
+          <w:p>
+            <w:pPr>
+              <w:jc w:val="center"/>
+              <w:rPr>
+                <w:bCs/>
+              </w:rPr>
+            </w:pPr>
+            <w:r>
+              <w:rPr>
+                <w:bCs/>
+              </w:rPr>
+              <w:t>.9</w:t>
+            </w:r>
+            <w:r>
+              <w:rPr>
+                <w:bCs/>
+              </w:rPr>
+              <w:t>0</w:t>
+            </w:r>
+          </w:p>
+        </w:tc>
+        <w:tc>
+          <w:tcPr>
+            <w:tcW w:w="1041" w:type="dxa"/>
+            <w:vAlign w:val="center"/>
+          </w:tcPr>
+          <w:p>
+            <w:pPr>
+              <w:jc w:val="center"/>
+              <w:rPr>
+                <w:bCs/>
+              </w:rPr>
+            </w:pPr>
+            <w:r>
+              <w:rPr>
+                <w:bCs/>
+              </w:rPr>
+              <w:t>31022.70</w:t>
+            </w:r>
+          </w:p>
+        </w:tc>
+        <w:tc>
+          <w:tcPr>
+            <w:tcW w:w="1041" w:type="dxa"/>
+            <w:vAlign w:val="center"/>
+          </w:tcPr>
+          <w:p>
+            <w:pPr>
+              <w:jc w:val="center"/>
+              <w:rPr>
+                <w:bCs/>
+              </w:rPr>
+            </w:pPr>
+            <w:r>
+              <w:rPr>
+                <w:bCs/>
+              </w:rPr>
+              <w:t>31057.</w:t>
+            </w:r>
+            <w:r>
+              <w:rPr>
+                <w:bCs/>
+              </w:rPr>
+              <w:t>40</w:t>
+            </w:r>
+          </w:p>
+        </w:tc>
+        <w:tc>
+          <w:tcPr>
+            <w:tcW w:w="1041" w:type="dxa"/>
+            <w:vAlign w:val="center"/>
+          </w:tcPr>
+          <w:p>
+            <w:pPr>
+              <w:jc w:val="center"/>
+              <w:rPr>
+                <w:bCs/>
+              </w:rPr>
+            </w:pPr>
+            <w:r>
+              <w:rPr>
+                <w:bCs/>
+              </w:rPr>
+              <w:t>31038.33</w:t>
+            </w:r>
+          </w:p>
+        </w:tc>
+        <w:tc>
+          <w:tcPr>
+            <w:tcW w:w="1091" w:type="dxa"/>
+            <w:vAlign w:val="center"/>
+          </w:tcPr>
+          <w:p>
+            <w:pPr>
+              <w:jc w:val="center"/>
+              <w:rPr>
+                <w:bCs/>
+              </w:rPr>
+            </w:pPr>
+          </w:p>
+        </w:tc>
+        <w:tc>
+          <w:tcPr>
+            <w:tcW w:w="904" w:type="dxa"/>
+            <w:vAlign w:val="center"/>
+          </w:tcPr>
+          <w:p>
+            <w:pPr>
+              <w:jc w:val="center"/>
+              <w:rPr>
+                <w:bCs/>
+              </w:rPr>
+            </w:pPr>
+          </w:p>
+        </w:tc>
+        <w:tc>
+          <w:tcPr>
+            <w:tcW w:w="913" w:type="dxa"/>
+            <w:vAlign w:val="center"/>
+          </w:tcPr>
+          <w:p>
+            <w:pPr>
+              <w:jc w:val="center"/>
+              <w:rPr>
+                <w:bCs/>
+              </w:rPr>
+            </w:pPr>
+          </w:p>
+        </w:tc>
+      </w:tr>
+      <w:tr>
+        <w:trPr>
+          <w:trHeight w:val="427"/>
+        </w:trPr>
+        <w:tc>
+          <w:tcPr>
+            <w:tcW w:w="2549" w:type="dxa"/>
+            <w:vAlign w:val="center"/>
+          </w:tcPr>
+          <w:p>
+            <w:pPr>
+              <w:numPr>
+                <w:ilvl w:val="0"/>
+                <w:numId w:val="2"/>
+              </w:numPr>
+              <w:rPr>
+                <w:b/>
+                <w:bCs/>
+              </w:rPr>
+            </w:pPr>
+            <w:r>
+              <w:rPr>
+                <w:b/>
+                <w:bCs/>
+              </w:rPr>
+              <w:t>Quadratic growth model*</w:t>
+            </w:r>
+          </w:p>
+        </w:tc>
+        <w:tc>
+          <w:tcPr>
+            <w:tcW w:w="1109" w:type="dxa"/>
+            <w:vAlign w:val="center"/>
+          </w:tcPr>
+          <w:p>
+            <w:pPr>
+              <w:jc w:val="center"/>
+              <w:rPr>
+                <w:b/>
+                <w:bCs/>
+              </w:rPr>
+            </w:pPr>
+            <w:r>
+              <w:rPr>
+                <w:b/>
+                <w:bCs/>
+              </w:rPr>
+              <w:t>75.47</w:t>
+            </w:r>
+          </w:p>
+        </w:tc>
+        <w:tc>
+          <w:tcPr>
+            <w:tcW w:w="887" w:type="dxa"/>
+            <w:vAlign w:val="center"/>
+          </w:tcPr>
+          <w:p>
+            <w:pPr>
+              <w:jc w:val="center"/>
+              <w:rPr>
+                <w:b/>
+                <w:bCs/>
+              </w:rPr>
+            </w:pPr>
+            <w:r>
+              <w:rPr>
+                <w:b/>
+                <w:bCs/>
+              </w:rPr>
+              <w:t>7</w:t>
+            </w:r>
+          </w:p>
+        </w:tc>
+        <w:tc>
+          <w:tcPr>
+            <w:tcW w:w="923" w:type="dxa"/>
+            <w:vAlign w:val="center"/>
+          </w:tcPr>
+          <w:p>
+            <w:pPr>
+              <w:jc w:val="center"/>
+              <w:rPr>
+                <w:b/>
+                <w:bCs/>
+              </w:rPr>
+            </w:pPr>
+            <w:r>
+              <w:rPr>
+                <w:b/>
+                <w:bCs/>
+              </w:rPr>
+              <w:t>&lt; .001</w:t>
+            </w:r>
+          </w:p>
+        </w:tc>
+        <w:tc>
+          <w:tcPr>
+            <w:tcW w:w="1108" w:type="dxa"/>
+            <w:vAlign w:val="center"/>
+          </w:tcPr>
+          <w:p>
+            <w:pPr>
+              <w:jc w:val="center"/>
+              <w:rPr>
+                <w:b/>
+                <w:bCs/>
+              </w:rPr>
+            </w:pPr>
+            <w:r>
+              <w:rPr>
+                <w:b/>
+                <w:bCs/>
+              </w:rPr>
+              <w:t>2.89</w:t>
+            </w:r>
+          </w:p>
+        </w:tc>
+        <w:tc>
+          <w:tcPr>
+            <w:tcW w:w="982" w:type="dxa"/>
+            <w:vAlign w:val="center"/>
+          </w:tcPr>
+          <w:p>
+            <w:pPr>
+              <w:jc w:val="center"/>
+              <w:rPr>
+                <w:b/>
+                <w:bCs/>
+              </w:rPr>
+            </w:pPr>
+            <w:r>
+              <w:rPr>
+                <w:b/>
+                <w:bCs/>
+              </w:rPr>
+              <w:t>0.</w:t>
+            </w:r>
+            <w:r>
+              <w:rPr>
+                <w:b/>
+                <w:bCs/>
+              </w:rPr>
+              <w:t>06</w:t>
+            </w:r>
+          </w:p>
+        </w:tc>
+        <w:tc>
+          <w:tcPr>
+            <w:tcW w:w="915" w:type="dxa"/>
+            <w:vAlign w:val="center"/>
+          </w:tcPr>
+          <w:p>
+            <w:pPr>
+              <w:jc w:val="center"/>
+              <w:rPr>
+                <w:b/>
+                <w:bCs/>
+              </w:rPr>
+            </w:pPr>
+            <w:r>
+              <w:rPr>
+                <w:b/>
+                <w:bCs/>
+              </w:rPr>
+              <w:t>.9</w:t>
+            </w:r>
+            <w:r>
+              <w:rPr>
+                <w:b/>
+                <w:bCs/>
+              </w:rPr>
+              <w:t>8</w:t>
+            </w:r>
+          </w:p>
+        </w:tc>
+        <w:tc>
+          <w:tcPr>
+            <w:tcW w:w="1041" w:type="dxa"/>
+            <w:vAlign w:val="center"/>
+          </w:tcPr>
+          <w:p>
+            <w:pPr>
+              <w:jc w:val="center"/>
+              <w:rPr>
+                <w:b/>
+                <w:bCs/>
+              </w:rPr>
+            </w:pPr>
+            <w:r>
+              <w:rPr>
+                <w:b/>
+                <w:bCs/>
+              </w:rPr>
+              <w:t>30181.05</w:t>
+            </w:r>
+          </w:p>
+        </w:tc>
+        <w:tc>
+          <w:tcPr>
+            <w:tcW w:w="1041" w:type="dxa"/>
+            <w:vAlign w:val="center"/>
+          </w:tcPr>
+          <w:p>
+            <w:pPr>
+              <w:jc w:val="center"/>
+              <w:rPr>
+                <w:b/>
+                <w:bCs/>
+              </w:rPr>
+            </w:pPr>
+            <w:r>
+              <w:rPr>
+                <w:b/>
+                <w:bCs/>
+              </w:rPr>
+              <w:t>30181.0</w:t>
+            </w:r>
+            <w:r>
+              <w:rPr>
+                <w:b/>
+                <w:bCs/>
+              </w:rPr>
+              <w:t>6</w:t>
+            </w:r>
+          </w:p>
+        </w:tc>
+        <w:tc>
+          <w:tcPr>
+            <w:tcW w:w="1041" w:type="dxa"/>
+            <w:vAlign w:val="center"/>
+          </w:tcPr>
+          <w:p>
+            <w:pPr>
+              <w:jc w:val="center"/>
+              <w:rPr>
+                <w:b/>
+                <w:bCs/>
+              </w:rPr>
+            </w:pPr>
+            <w:r>
+              <w:rPr>
+                <w:b/>
+                <w:bCs/>
+              </w:rPr>
+              <w:t>30199.2</w:t>
+            </w:r>
+            <w:r>
+              <w:rPr>
+                <w:b/>
+                <w:bCs/>
+              </w:rPr>
+              <w:t>9</w:t>
+            </w:r>
+          </w:p>
+        </w:tc>
+        <w:tc>
+          <w:tcPr>
+            <w:tcW w:w="1091" w:type="dxa"/>
+            <w:vAlign w:val="center"/>
+          </w:tcPr>
+          <w:p>
+            <w:pPr>
+              <w:jc w:val="center"/>
+              <w:rPr>
+                <w:bCs/>
+              </w:rPr>
+            </w:pPr>
+          </w:p>
+        </w:tc>
+        <w:tc>
+          <w:tcPr>
+            <w:tcW w:w="904" w:type="dxa"/>
+            <w:vAlign w:val="center"/>
+          </w:tcPr>
+          <w:p>
+            <w:pPr>
+              <w:jc w:val="center"/>
+              <w:rPr>
+                <w:bCs/>
+              </w:rPr>
+            </w:pPr>
+          </w:p>
+        </w:tc>
+        <w:tc>
+          <w:tcPr>
+            <w:tcW w:w="913" w:type="dxa"/>
+            <w:vAlign w:val="center"/>
+          </w:tcPr>
+          <w:p>
+            <w:pPr>
+              <w:jc w:val="center"/>
+              <w:rPr>
+                <w:bCs/>
+              </w:rPr>
+            </w:pPr>
+          </w:p>
+        </w:tc>
+      </w:tr>
+      <w:tr>
+        <w:trPr>
+          <w:trHeight w:val="427"/>
+        </w:trPr>
+        <w:tc>
+          <w:tcPr>
+            <w:tcW w:w="2549" w:type="dxa"/>
+            <w:vAlign w:val="center"/>
+          </w:tcPr>
+          <w:p>
+            <w:pPr>
+              <w:numPr>
+                <w:ilvl w:val="0"/>
+                <w:numId w:val="2"/>
+              </w:numPr>
+            </w:pPr>
+            <w:r>
+              <w:t>Latent basis growth model</w:t>
+            </w:r>
+          </w:p>
+        </w:tc>
+        <w:tc>
+          <w:tcPr>
+            <w:tcW w:w="11955" w:type="dxa"/>
+            <w:gridSpan w:val="12"/>
+            <w:vAlign w:val="center"/>
+          </w:tcPr>
+          <w:p>
+            <w:pPr>
+              <w:rPr>
+                <w:bCs/>
+              </w:rPr>
+            </w:pPr>
+            <w:r>
+              <w:rPr>
+                <w:bCs/>
+              </w:rPr>
+              <w:t>Slope variance = 0, model not identified</w:t>
+            </w:r>
+          </w:p>
+        </w:tc>
+      </w:tr>
+      <w:tr>
+        <w:trPr>
+          <w:trHeight w:val="297"/>
+        </w:trPr>
+        <w:tc>
+          <w:tcPr>
+            <w:tcW w:w="2549" w:type="dxa"/>
+            <w:vAlign w:val="center"/>
+          </w:tcPr>
+          <w:p>
+            <w:r>
+              <w:t>Male</w:t>
+            </w:r>
+            <w:r>
+              <w:t xml:space="preserve"> (n = 2644)</w:t>
+            </w:r>
+          </w:p>
+        </w:tc>
+        <w:tc>
+          <w:tcPr>
+            <w:tcW w:w="1109" w:type="dxa"/>
+            <w:vAlign w:val="center"/>
+          </w:tcPr>
+          <w:p>
+            <w:pPr>
+              <w:jc w:val="center"/>
+              <w:rPr>
+                <w:bCs/>
+              </w:rPr>
+            </w:pPr>
+          </w:p>
+        </w:tc>
+        <w:tc>
+          <w:tcPr>
+            <w:tcW w:w="887" w:type="dxa"/>
+            <w:vAlign w:val="center"/>
+          </w:tcPr>
+          <w:p>
+            <w:pPr>
+              <w:jc w:val="center"/>
+              <w:rPr>
+                <w:bCs/>
+              </w:rPr>
+            </w:pPr>
+          </w:p>
+        </w:tc>
+        <w:tc>
+          <w:tcPr>
+            <w:tcW w:w="923" w:type="dxa"/>
+            <w:vAlign w:val="center"/>
+          </w:tcPr>
+          <w:p>
+            <w:pPr>
+              <w:jc w:val="center"/>
+              <w:rPr>
+                <w:bCs/>
+              </w:rPr>
+            </w:pPr>
+          </w:p>
+        </w:tc>
+        <w:tc>
+          <w:tcPr>
+            <w:tcW w:w="1108" w:type="dxa"/>
+            <w:vAlign w:val="center"/>
+          </w:tcPr>
+          <w:p>
+            <w:pPr>
+              <w:jc w:val="center"/>
+              <w:rPr>
+                <w:bCs/>
+              </w:rPr>
+            </w:pPr>
+          </w:p>
+        </w:tc>
+        <w:tc>
+          <w:tcPr>
+            <w:tcW w:w="982" w:type="dxa"/>
+            <w:vAlign w:val="center"/>
+          </w:tcPr>
+          <w:p>
+            <w:pPr>
+              <w:jc w:val="center"/>
+              <w:rPr>
+                <w:bCs/>
+              </w:rPr>
+            </w:pPr>
+          </w:p>
+        </w:tc>
+        <w:tc>
+          <w:tcPr>
+            <w:tcW w:w="915" w:type="dxa"/>
+            <w:vAlign w:val="center"/>
+          </w:tcPr>
+          <w:p>
+            <w:pPr>
+              <w:jc w:val="center"/>
+              <w:rPr>
+                <w:bCs/>
+              </w:rPr>
+            </w:pPr>
+          </w:p>
+        </w:tc>
+        <w:tc>
+          <w:tcPr>
+            <w:tcW w:w="1041" w:type="dxa"/>
+            <w:vAlign w:val="center"/>
+          </w:tcPr>
+          <w:p>
+            <w:pPr>
+              <w:jc w:val="center"/>
+              <w:rPr>
+                <w:bCs/>
+              </w:rPr>
+            </w:pPr>
+          </w:p>
+        </w:tc>
+        <w:tc>
+          <w:tcPr>
+            <w:tcW w:w="1041" w:type="dxa"/>
+            <w:vAlign w:val="center"/>
+          </w:tcPr>
+          <w:p>
+            <w:pPr>
+              <w:jc w:val="center"/>
+              <w:rPr>
+                <w:bCs/>
+              </w:rPr>
+            </w:pPr>
+          </w:p>
+        </w:tc>
+        <w:tc>
+          <w:tcPr>
+            <w:tcW w:w="1041" w:type="dxa"/>
+            <w:vAlign w:val="center"/>
+          </w:tcPr>
+          <w:p>
+            <w:pPr>
+              <w:jc w:val="center"/>
+              <w:rPr>
+                <w:bCs/>
+              </w:rPr>
+            </w:pPr>
+          </w:p>
+        </w:tc>
+        <w:tc>
+          <w:tcPr>
+            <w:tcW w:w="1091" w:type="dxa"/>
+            <w:vAlign w:val="center"/>
+          </w:tcPr>
+          <w:p>
+            <w:pPr>
+              <w:jc w:val="center"/>
+              <w:rPr>
+                <w:bCs/>
+              </w:rPr>
+            </w:pPr>
+          </w:p>
+        </w:tc>
+        <w:tc>
+          <w:tcPr>
+            <w:tcW w:w="904" w:type="dxa"/>
+            <w:vAlign w:val="center"/>
+          </w:tcPr>
+          <w:p>
+            <w:pPr>
+              <w:jc w:val="center"/>
+              <w:rPr>
+                <w:bCs/>
+              </w:rPr>
+            </w:pPr>
+          </w:p>
+        </w:tc>
+        <w:tc>
+          <w:tcPr>
+            <w:tcW w:w="913" w:type="dxa"/>
+            <w:vAlign w:val="center"/>
+          </w:tcPr>
+          <w:p>
+            <w:pPr>
+              <w:jc w:val="center"/>
+              <w:rPr>
+                <w:bCs/>
+              </w:rPr>
+            </w:pPr>
+          </w:p>
+        </w:tc>
+      </w:tr>
+      <w:tr>
+        <w:trPr>
+          <w:trHeight w:val="427"/>
+        </w:trPr>
+        <w:tc>
+          <w:tcPr>
+            <w:tcW w:w="2549" w:type="dxa"/>
+            <w:vAlign w:val="center"/>
+          </w:tcPr>
+          <w:p>
+            <w:pPr>
+              <w:numPr>
+                <w:ilvl w:val="0"/>
+                <w:numId w:val="2"/>
+              </w:numPr>
+            </w:pPr>
+            <w:r>
+              <w:t>No growth</w:t>
+            </w:r>
+          </w:p>
+        </w:tc>
+        <w:tc>
+          <w:tcPr>
+            <w:tcW w:w="1109" w:type="dxa"/>
+            <w:vAlign w:val="center"/>
+          </w:tcPr>
+          <w:p>
+            <w:pPr>
+              <w:jc w:val="center"/>
+              <w:rPr>
+                <w:bCs/>
+              </w:rPr>
+            </w:pPr>
+            <w:r>
+              <w:rPr>
+                <w:bCs/>
+              </w:rPr>
+              <w:t>1283.3</w:t>
+            </w:r>
+            <w:r>
+              <w:rPr>
+                <w:bCs/>
+              </w:rPr>
+              <w:t>9</w:t>
+            </w:r>
+          </w:p>
+        </w:tc>
+        <w:tc>
+          <w:tcPr>
+            <w:tcW w:w="887" w:type="dxa"/>
+            <w:vAlign w:val="center"/>
+          </w:tcPr>
+          <w:p>
+            <w:pPr>
+              <w:jc w:val="center"/>
+              <w:rPr>
+                <w:bCs/>
+              </w:rPr>
+            </w:pPr>
+            <w:r>
+              <w:rPr>
+                <w:bCs/>
+              </w:rPr>
+              <w:t>11</w:t>
+            </w:r>
+          </w:p>
+        </w:tc>
+        <w:tc>
+          <w:tcPr>
+            <w:tcW w:w="923" w:type="dxa"/>
+            <w:vAlign w:val="center"/>
+          </w:tcPr>
+          <w:p>
+            <w:pPr>
+              <w:jc w:val="center"/>
+              <w:rPr>
+                <w:bCs/>
+              </w:rPr>
+            </w:pPr>
+            <w:r>
+              <w:rPr>
+                <w:bCs/>
+              </w:rPr>
+              <w:t>&lt; .001</w:t>
+            </w:r>
+          </w:p>
+        </w:tc>
+        <w:tc>
+          <w:tcPr>
+            <w:tcW w:w="1108" w:type="dxa"/>
+            <w:vAlign w:val="center"/>
+          </w:tcPr>
+          <w:p>
+            <w:pPr>
+              <w:jc w:val="center"/>
+              <w:rPr>
+                <w:bCs/>
+              </w:rPr>
+            </w:pPr>
+            <w:r>
+              <w:rPr>
+                <w:bCs/>
+              </w:rPr>
+              <w:t>3.42</w:t>
+            </w:r>
+          </w:p>
+        </w:tc>
+        <w:tc>
+          <w:tcPr>
+            <w:tcW w:w="982" w:type="dxa"/>
+            <w:vAlign w:val="center"/>
+          </w:tcPr>
+          <w:p>
+            <w:pPr>
+              <w:jc w:val="center"/>
+              <w:rPr>
+                <w:bCs/>
+              </w:rPr>
+            </w:pPr>
+            <w:r>
+              <w:rPr>
+                <w:bCs/>
+              </w:rPr>
+              <w:t>0.</w:t>
+            </w:r>
+            <w:r>
+              <w:rPr>
+                <w:bCs/>
+              </w:rPr>
+              <w:t>21</w:t>
+            </w:r>
+          </w:p>
+        </w:tc>
+        <w:tc>
+          <w:tcPr>
+            <w:tcW w:w="915" w:type="dxa"/>
+            <w:vAlign w:val="center"/>
+          </w:tcPr>
+          <w:p>
+            <w:pPr>
+              <w:jc w:val="center"/>
+              <w:rPr>
+                <w:bCs/>
+              </w:rPr>
+            </w:pPr>
+            <w:r>
+              <w:rPr>
+                <w:bCs/>
+              </w:rPr>
+              <w:t>.</w:t>
+            </w:r>
+            <w:r>
+              <w:rPr>
+                <w:bCs/>
+              </w:rPr>
+              <w:t>62</w:t>
+            </w:r>
+          </w:p>
+        </w:tc>
+        <w:tc>
+          <w:tcPr>
+            <w:tcW w:w="1041" w:type="dxa"/>
+            <w:vAlign w:val="center"/>
+          </w:tcPr>
+          <w:p>
+            <w:pPr>
+              <w:jc w:val="center"/>
+              <w:rPr>
+                <w:bCs/>
+              </w:rPr>
+            </w:pPr>
+            <w:r>
+              <w:rPr>
+                <w:bCs/>
+              </w:rPr>
+              <w:t>38237.1</w:t>
+            </w:r>
+            <w:r>
+              <w:rPr>
+                <w:bCs/>
+              </w:rPr>
+              <w:t>6</w:t>
+            </w:r>
+          </w:p>
+        </w:tc>
+        <w:tc>
+          <w:tcPr>
+            <w:tcW w:w="1041" w:type="dxa"/>
+            <w:vAlign w:val="center"/>
+          </w:tcPr>
+          <w:p>
+            <w:pPr>
+              <w:jc w:val="center"/>
+              <w:rPr>
+                <w:bCs/>
+              </w:rPr>
+            </w:pPr>
+            <w:r>
+              <w:rPr>
+                <w:bCs/>
+              </w:rPr>
+              <w:t>38254.80</w:t>
+            </w:r>
+          </w:p>
+        </w:tc>
+        <w:tc>
+          <w:tcPr>
+            <w:tcW w:w="1041" w:type="dxa"/>
+            <w:vAlign w:val="center"/>
+          </w:tcPr>
+          <w:p>
+            <w:pPr>
+              <w:jc w:val="center"/>
+              <w:rPr>
+                <w:bCs/>
+              </w:rPr>
+            </w:pPr>
+            <w:r>
+              <w:rPr>
+                <w:bCs/>
+              </w:rPr>
+              <w:t>38245.2</w:t>
+            </w:r>
+            <w:r>
+              <w:rPr>
+                <w:bCs/>
+              </w:rPr>
+              <w:t>7</w:t>
+            </w:r>
+          </w:p>
+        </w:tc>
+        <w:tc>
+          <w:tcPr>
+            <w:tcW w:w="1091" w:type="dxa"/>
+            <w:vAlign w:val="center"/>
+          </w:tcPr>
+          <w:p>
+            <w:pPr>
+              <w:jc w:val="center"/>
+              <w:rPr>
+                <w:bCs/>
+              </w:rPr>
+            </w:pPr>
+          </w:p>
+        </w:tc>
+        <w:tc>
+          <w:tcPr>
+            <w:tcW w:w="904" w:type="dxa"/>
+            <w:vAlign w:val="center"/>
+          </w:tcPr>
+          <w:p>
+            <w:pPr>
+              <w:jc w:val="center"/>
+              <w:rPr>
+                <w:bCs/>
+              </w:rPr>
+            </w:pPr>
+          </w:p>
+        </w:tc>
+        <w:tc>
+          <w:tcPr>
+            <w:tcW w:w="913" w:type="dxa"/>
+            <w:vAlign w:val="center"/>
+          </w:tcPr>
+          <w:p>
+            <w:pPr>
+              <w:jc w:val="center"/>
+              <w:rPr>
+                <w:bCs/>
+              </w:rPr>
+            </w:pPr>
+          </w:p>
+        </w:tc>
+      </w:tr>
+      <w:tr>
+        <w:trPr>
+          <w:trHeight w:val="427"/>
+        </w:trPr>
+        <w:tc>
+          <w:tcPr>
+            <w:tcW w:w="2549" w:type="dxa"/>
+            <w:vAlign w:val="center"/>
+          </w:tcPr>
+          <w:p>
+            <w:pPr>
+              <w:numPr>
+                <w:ilvl w:val="0"/>
+                <w:numId w:val="2"/>
+              </w:numPr>
+            </w:pPr>
+            <w:r>
+              <w:t>Linear growth model</w:t>
+            </w:r>
+          </w:p>
+        </w:tc>
+        <w:tc>
+          <w:tcPr>
+            <w:tcW w:w="1109" w:type="dxa"/>
+            <w:vAlign w:val="center"/>
+          </w:tcPr>
+          <w:p>
+            <w:pPr>
+              <w:jc w:val="center"/>
+              <w:rPr>
+                <w:bCs/>
+              </w:rPr>
+            </w:pPr>
+            <w:r>
+              <w:rPr>
+                <w:bCs/>
+              </w:rPr>
+              <w:t>171.8</w:t>
+            </w:r>
+            <w:r>
+              <w:rPr>
+                <w:bCs/>
+              </w:rPr>
+              <w:t>9</w:t>
+            </w:r>
+          </w:p>
+        </w:tc>
+        <w:tc>
+          <w:tcPr>
+            <w:tcW w:w="887" w:type="dxa"/>
+            <w:vAlign w:val="center"/>
+          </w:tcPr>
+          <w:p>
+            <w:pPr>
+              <w:jc w:val="center"/>
+              <w:rPr>
+                <w:bCs/>
+              </w:rPr>
+            </w:pPr>
+            <w:r>
+              <w:rPr>
+                <w:bCs/>
+              </w:rPr>
+              <w:t>8</w:t>
+            </w:r>
+          </w:p>
+        </w:tc>
+        <w:tc>
+          <w:tcPr>
+            <w:tcW w:w="923" w:type="dxa"/>
+            <w:vAlign w:val="center"/>
+          </w:tcPr>
+          <w:p>
+            <w:pPr>
+              <w:jc w:val="center"/>
+              <w:rPr>
+                <w:bCs/>
+              </w:rPr>
+            </w:pPr>
+            <w:r>
+              <w:rPr>
+                <w:bCs/>
+              </w:rPr>
+              <w:t>&lt; .001</w:t>
+            </w:r>
+          </w:p>
+        </w:tc>
+        <w:tc>
+          <w:tcPr>
+            <w:tcW w:w="1108" w:type="dxa"/>
+            <w:vAlign w:val="center"/>
+          </w:tcPr>
+          <w:p>
+            <w:pPr>
+              <w:jc w:val="center"/>
+              <w:rPr>
+                <w:bCs/>
+              </w:rPr>
+            </w:pPr>
+            <w:r>
+              <w:rPr>
+                <w:bCs/>
+              </w:rPr>
+              <w:t>3.32</w:t>
+            </w:r>
+          </w:p>
+        </w:tc>
+        <w:tc>
+          <w:tcPr>
+            <w:tcW w:w="982" w:type="dxa"/>
+            <w:vAlign w:val="center"/>
+          </w:tcPr>
+          <w:p>
+            <w:pPr>
+              <w:jc w:val="center"/>
+              <w:rPr>
+                <w:bCs/>
+              </w:rPr>
+            </w:pPr>
+            <w:r>
+              <w:rPr>
+                <w:bCs/>
+              </w:rPr>
+              <w:t>0.0</w:t>
+            </w:r>
+            <w:r>
+              <w:rPr>
+                <w:bCs/>
+              </w:rPr>
+              <w:t>9</w:t>
+            </w:r>
+          </w:p>
+        </w:tc>
+        <w:tc>
+          <w:tcPr>
+            <w:tcW w:w="915" w:type="dxa"/>
+            <w:vAlign w:val="center"/>
+          </w:tcPr>
+          <w:p>
+            <w:pPr>
+              <w:jc w:val="center"/>
+              <w:rPr>
+                <w:bCs/>
+              </w:rPr>
+            </w:pPr>
+            <w:r>
+              <w:rPr>
+                <w:bCs/>
+              </w:rPr>
+              <w:t>.9</w:t>
+            </w:r>
+            <w:r>
+              <w:rPr>
+                <w:bCs/>
+              </w:rPr>
+              <w:t>5</w:t>
+            </w:r>
+          </w:p>
+        </w:tc>
+        <w:tc>
+          <w:tcPr>
+            <w:tcW w:w="1041" w:type="dxa"/>
+            <w:vAlign w:val="center"/>
+          </w:tcPr>
+          <w:p>
+            <w:pPr>
+              <w:jc w:val="center"/>
+              <w:rPr>
+                <w:bCs/>
+              </w:rPr>
+            </w:pPr>
+            <w:r>
+              <w:rPr>
+                <w:bCs/>
+              </w:rPr>
+              <w:t>34425.2</w:t>
+            </w:r>
+            <w:r>
+              <w:rPr>
+                <w:bCs/>
+              </w:rPr>
+              <w:t>5</w:t>
+            </w:r>
+          </w:p>
+        </w:tc>
+        <w:tc>
+          <w:tcPr>
+            <w:tcW w:w="1041" w:type="dxa"/>
+            <w:vAlign w:val="center"/>
+          </w:tcPr>
+          <w:p>
+            <w:pPr>
+              <w:jc w:val="center"/>
+              <w:rPr>
+                <w:bCs/>
+              </w:rPr>
+            </w:pPr>
+            <w:r>
+              <w:rPr>
+                <w:bCs/>
+              </w:rPr>
+              <w:t>34460.5</w:t>
+            </w:r>
+            <w:r>
+              <w:rPr>
+                <w:bCs/>
+              </w:rPr>
+              <w:t>3</w:t>
+            </w:r>
+          </w:p>
+        </w:tc>
+        <w:tc>
+          <w:tcPr>
+            <w:tcW w:w="1041" w:type="dxa"/>
+            <w:vAlign w:val="center"/>
+          </w:tcPr>
+          <w:p>
+            <w:pPr>
+              <w:jc w:val="center"/>
+              <w:rPr>
+                <w:bCs/>
+              </w:rPr>
+            </w:pPr>
+            <w:r>
+              <w:rPr>
+                <w:bCs/>
+              </w:rPr>
+              <w:t>34441.4</w:t>
+            </w:r>
+            <w:r>
+              <w:rPr>
+                <w:bCs/>
+              </w:rPr>
+              <w:t>7</w:t>
+            </w:r>
+          </w:p>
+        </w:tc>
+        <w:tc>
+          <w:tcPr>
+            <w:tcW w:w="1091" w:type="dxa"/>
+            <w:vAlign w:val="center"/>
+          </w:tcPr>
+          <w:p>
+            <w:pPr>
+              <w:jc w:val="center"/>
+              <w:rPr>
+                <w:bCs/>
+              </w:rPr>
+            </w:pPr>
+          </w:p>
+        </w:tc>
+        <w:tc>
+          <w:tcPr>
+            <w:tcW w:w="904" w:type="dxa"/>
+            <w:vAlign w:val="center"/>
+          </w:tcPr>
+          <w:p>
+            <w:pPr>
+              <w:jc w:val="center"/>
+              <w:rPr>
+                <w:bCs/>
+              </w:rPr>
+            </w:pPr>
+          </w:p>
+        </w:tc>
+        <w:tc>
+          <w:tcPr>
+            <w:tcW w:w="913" w:type="dxa"/>
+            <w:vAlign w:val="center"/>
+          </w:tcPr>
+          <w:p>
+            <w:pPr>
+              <w:jc w:val="center"/>
+              <w:rPr>
+                <w:bCs/>
+              </w:rPr>
+            </w:pPr>
+          </w:p>
+        </w:tc>
+      </w:tr>
+      <w:tr>
+        <w:trPr>
+          <w:trHeight w:val="427"/>
+        </w:trPr>
+        <w:tc>
+          <w:tcPr>
+            <w:tcW w:w="2549" w:type="dxa"/>
+            <w:vAlign w:val="center"/>
+          </w:tcPr>
+          <w:p>
+            <w:pPr>
+              <w:numPr>
+                <w:ilvl w:val="0"/>
+                <w:numId w:val="2"/>
+              </w:numPr>
+            </w:pPr>
+            <w:r>
+              <w:t>Quadratic growth model</w:t>
+            </w:r>
+            <w:r>
+              <w:t>*</w:t>
+            </w:r>
+          </w:p>
+        </w:tc>
+        <w:tc>
+          <w:tcPr>
+            <w:tcW w:w="1109" w:type="dxa"/>
+            <w:vAlign w:val="center"/>
+          </w:tcPr>
+          <w:p>
+            <w:pPr>
+              <w:jc w:val="center"/>
+              <w:rPr>
+                <w:bCs/>
+              </w:rPr>
+            </w:pPr>
+            <w:r>
+              <w:rPr>
+                <w:bCs/>
+              </w:rPr>
+              <w:t>72.82</w:t>
+            </w:r>
+          </w:p>
+        </w:tc>
+        <w:tc>
+          <w:tcPr>
+            <w:tcW w:w="887" w:type="dxa"/>
+            <w:vAlign w:val="center"/>
+          </w:tcPr>
+          <w:p>
+            <w:pPr>
+              <w:jc w:val="center"/>
+              <w:rPr>
+                <w:bCs/>
+              </w:rPr>
+            </w:pPr>
+            <w:r>
+              <w:rPr>
+                <w:bCs/>
+              </w:rPr>
+              <w:t>7</w:t>
+            </w:r>
+          </w:p>
+        </w:tc>
+        <w:tc>
+          <w:tcPr>
+            <w:tcW w:w="923" w:type="dxa"/>
+            <w:vAlign w:val="center"/>
+          </w:tcPr>
+          <w:p>
+            <w:pPr>
+              <w:jc w:val="center"/>
+              <w:rPr>
+                <w:bCs/>
+              </w:rPr>
+            </w:pPr>
+            <w:r>
+              <w:rPr>
+                <w:bCs/>
+              </w:rPr>
+              <w:t>&lt; .001</w:t>
+            </w:r>
+          </w:p>
+        </w:tc>
+        <w:tc>
+          <w:tcPr>
+            <w:tcW w:w="1108" w:type="dxa"/>
+            <w:vAlign w:val="center"/>
+          </w:tcPr>
+          <w:p>
+            <w:pPr>
+              <w:jc w:val="center"/>
+              <w:rPr>
+                <w:bCs/>
+              </w:rPr>
+            </w:pPr>
+            <w:r>
+              <w:rPr>
+                <w:bCs/>
+              </w:rPr>
+              <w:t>3.60</w:t>
+            </w:r>
+          </w:p>
+        </w:tc>
+        <w:tc>
+          <w:tcPr>
+            <w:tcW w:w="982" w:type="dxa"/>
+            <w:vAlign w:val="center"/>
+          </w:tcPr>
+          <w:p>
+            <w:pPr>
+              <w:jc w:val="center"/>
+              <w:rPr>
+                <w:bCs/>
+              </w:rPr>
+            </w:pPr>
+            <w:r>
+              <w:rPr>
+                <w:bCs/>
+              </w:rPr>
+              <w:t>0.0</w:t>
+            </w:r>
+            <w:r>
+              <w:rPr>
+                <w:bCs/>
+              </w:rPr>
+              <w:t>6</w:t>
+            </w:r>
+          </w:p>
+        </w:tc>
+        <w:tc>
+          <w:tcPr>
+            <w:tcW w:w="915" w:type="dxa"/>
+            <w:vAlign w:val="center"/>
+          </w:tcPr>
+          <w:p>
+            <w:pPr>
+              <w:jc w:val="center"/>
+              <w:rPr>
+                <w:bCs/>
+              </w:rPr>
+            </w:pPr>
+            <w:r>
+              <w:rPr>
+                <w:bCs/>
+              </w:rPr>
+              <w:t>.9</w:t>
+            </w:r>
+            <w:r>
+              <w:rPr>
+                <w:bCs/>
+              </w:rPr>
+              <w:t>8</w:t>
+            </w:r>
+          </w:p>
+        </w:tc>
+        <w:tc>
+          <w:tcPr>
+            <w:tcW w:w="1041" w:type="dxa"/>
+            <w:vAlign w:val="center"/>
+          </w:tcPr>
+          <w:p>
+            <w:pPr>
+              <w:jc w:val="center"/>
+              <w:rPr>
+                <w:bCs/>
+              </w:rPr>
+            </w:pPr>
+            <w:r>
+              <w:rPr>
+                <w:bCs/>
+              </w:rPr>
+              <w:t>34117.9</w:t>
+            </w:r>
+            <w:r>
+              <w:rPr>
+                <w:bCs/>
+              </w:rPr>
+              <w:t>7</w:t>
+            </w:r>
+          </w:p>
+        </w:tc>
+        <w:tc>
+          <w:tcPr>
+            <w:tcW w:w="1041" w:type="dxa"/>
+            <w:vAlign w:val="center"/>
+          </w:tcPr>
+          <w:p>
+            <w:pPr>
+              <w:jc w:val="center"/>
+              <w:rPr>
+                <w:bCs/>
+              </w:rPr>
+            </w:pPr>
+            <w:r>
+              <w:rPr>
+                <w:bCs/>
+              </w:rPr>
+              <w:t>34159.1</w:t>
+            </w:r>
+            <w:r>
+              <w:rPr>
+                <w:bCs/>
+              </w:rPr>
+              <w:t>3</w:t>
+            </w:r>
+          </w:p>
+        </w:tc>
+        <w:tc>
+          <w:tcPr>
+            <w:tcW w:w="1041" w:type="dxa"/>
+            <w:vAlign w:val="center"/>
+          </w:tcPr>
+          <w:p>
+            <w:pPr>
+              <w:jc w:val="center"/>
+              <w:rPr>
+                <w:bCs/>
+              </w:rPr>
+            </w:pPr>
+            <w:r>
+              <w:rPr>
+                <w:bCs/>
+              </w:rPr>
+              <w:t>34136.8</w:t>
+            </w:r>
+            <w:r>
+              <w:rPr>
+                <w:bCs/>
+              </w:rPr>
+              <w:t>9</w:t>
+            </w:r>
+          </w:p>
+        </w:tc>
+        <w:tc>
+          <w:tcPr>
+            <w:tcW w:w="1091" w:type="dxa"/>
+            <w:vAlign w:val="center"/>
+          </w:tcPr>
+          <w:p>
+            <w:pPr>
+              <w:jc w:val="center"/>
+              <w:rPr>
+                <w:bCs/>
+              </w:rPr>
+            </w:pPr>
+          </w:p>
+        </w:tc>
+        <w:tc>
+          <w:tcPr>
+            <w:tcW w:w="904" w:type="dxa"/>
+            <w:vAlign w:val="center"/>
+          </w:tcPr>
+          <w:p>
+            <w:pPr>
+              <w:jc w:val="center"/>
+              <w:rPr>
+                <w:bCs/>
+              </w:rPr>
+            </w:pPr>
+          </w:p>
+        </w:tc>
+        <w:tc>
+          <w:tcPr>
+            <w:tcW w:w="913" w:type="dxa"/>
+            <w:vAlign w:val="center"/>
+          </w:tcPr>
+          <w:p>
+            <w:pPr>
+              <w:jc w:val="center"/>
+              <w:rPr>
+                <w:bCs/>
+              </w:rPr>
+            </w:pPr>
+          </w:p>
+        </w:tc>
+      </w:tr>
+      <w:tr>
+        <w:trPr>
+          <w:trHeight w:val="427"/>
+        </w:trPr>
+        <w:tc>
+          <w:tcPr>
+            <w:tcW w:w="2549" w:type="dxa"/>
+            <w:tcBorders>
+              <w:bottom w:val="single" w:sz="4" w:space="0" w:color="auto"/>
+            </w:tcBorders>
+            <w:vAlign w:val="center"/>
+          </w:tcPr>
+          <w:p>
+            <w:pPr>
+              <w:numPr>
+                <w:ilvl w:val="0"/>
+                <w:numId w:val="2"/>
+              </w:numPr>
+              <w:rPr>
+                <w:b/>
+                <w:bCs/>
+              </w:rPr>
+            </w:pPr>
+            <w:r>
+              <w:rPr>
+                <w:b/>
+                <w:bCs/>
+              </w:rPr>
+              <w:t>Latent basis growth model</w:t>
+            </w:r>
+          </w:p>
+        </w:tc>
+        <w:tc>
+          <w:tcPr>
+            <w:tcW w:w="1109" w:type="dxa"/>
+            <w:tcBorders>
+              <w:bottom w:val="single" w:sz="4" w:space="0" w:color="auto"/>
+            </w:tcBorders>
+            <w:vAlign w:val="center"/>
+          </w:tcPr>
+          <w:p>
+            <w:pPr>
+              <w:jc w:val="center"/>
+              <w:rPr>
+                <w:b/>
+                <w:bCs/>
+              </w:rPr>
+            </w:pPr>
+            <w:r>
+              <w:rPr>
+                <w:b/>
+                <w:bCs/>
+              </w:rPr>
+              <w:t>37.50</w:t>
+            </w:r>
+          </w:p>
+        </w:tc>
+        <w:tc>
+          <w:tcPr>
+            <w:tcW w:w="887" w:type="dxa"/>
+            <w:tcBorders>
+              <w:bottom w:val="single" w:sz="4" w:space="0" w:color="auto"/>
+            </w:tcBorders>
+            <w:vAlign w:val="center"/>
+          </w:tcPr>
+          <w:p>
+            <w:pPr>
+              <w:jc w:val="center"/>
+              <w:rPr>
+                <w:b/>
+                <w:bCs/>
+              </w:rPr>
+            </w:pPr>
+            <w:r>
+              <w:rPr>
+                <w:b/>
+                <w:bCs/>
+              </w:rPr>
+              <w:t>6</w:t>
+            </w:r>
+          </w:p>
+        </w:tc>
+        <w:tc>
+          <w:tcPr>
+            <w:tcW w:w="923" w:type="dxa"/>
+            <w:tcBorders>
+              <w:bottom w:val="single" w:sz="4" w:space="0" w:color="auto"/>
+            </w:tcBorders>
+            <w:vAlign w:val="center"/>
+          </w:tcPr>
+          <w:p>
+            <w:pPr>
+              <w:jc w:val="center"/>
+              <w:rPr>
+                <w:b/>
+                <w:bCs/>
+              </w:rPr>
+            </w:pPr>
+            <w:r>
+              <w:rPr>
+                <w:b/>
+                <w:bCs/>
+              </w:rPr>
+              <w:t>&lt;.001</w:t>
+            </w:r>
+          </w:p>
+        </w:tc>
+        <w:tc>
+          <w:tcPr>
+            <w:tcW w:w="1108" w:type="dxa"/>
+            <w:tcBorders>
+              <w:bottom w:val="single" w:sz="4" w:space="0" w:color="auto"/>
+            </w:tcBorders>
+            <w:vAlign w:val="center"/>
+          </w:tcPr>
+          <w:p>
+            <w:pPr>
+              <w:jc w:val="center"/>
+              <w:rPr>
+                <w:b/>
+                <w:bCs/>
+              </w:rPr>
+            </w:pPr>
+            <w:r>
+              <w:rPr>
+                <w:b/>
+                <w:bCs/>
+              </w:rPr>
+              <w:t>3.59</w:t>
+            </w:r>
+          </w:p>
+        </w:tc>
+        <w:tc>
+          <w:tcPr>
+            <w:tcW w:w="982" w:type="dxa"/>
+            <w:tcBorders>
+              <w:bottom w:val="single" w:sz="4" w:space="0" w:color="auto"/>
+            </w:tcBorders>
+            <w:vAlign w:val="center"/>
+          </w:tcPr>
+          <w:p>
+            <w:pPr>
+              <w:jc w:val="center"/>
+              <w:rPr>
+                <w:b/>
+                <w:bCs/>
+              </w:rPr>
+            </w:pPr>
+            <w:r>
+              <w:rPr>
+                <w:b/>
+                <w:bCs/>
+              </w:rPr>
+              <w:t>0.05</w:t>
+            </w:r>
+          </w:p>
+        </w:tc>
+        <w:tc>
+          <w:tcPr>
+            <w:tcW w:w="915" w:type="dxa"/>
+            <w:tcBorders>
+              <w:bottom w:val="single" w:sz="4" w:space="0" w:color="auto"/>
+            </w:tcBorders>
+            <w:vAlign w:val="center"/>
+          </w:tcPr>
+          <w:p>
+            <w:pPr>
+              <w:jc w:val="center"/>
+              <w:rPr>
+                <w:b/>
+                <w:bCs/>
+              </w:rPr>
+            </w:pPr>
+            <w:r>
+              <w:rPr>
+                <w:b/>
+                <w:bCs/>
+              </w:rPr>
+              <w:t>.99</w:t>
+            </w:r>
+          </w:p>
+        </w:tc>
+        <w:tc>
+          <w:tcPr>
+            <w:tcW w:w="1041" w:type="dxa"/>
+            <w:tcBorders>
+              <w:bottom w:val="single" w:sz="4" w:space="0" w:color="auto"/>
+            </w:tcBorders>
+            <w:vAlign w:val="center"/>
+          </w:tcPr>
+          <w:p>
+            <w:pPr>
+              <w:jc w:val="center"/>
+              <w:rPr>
+                <w:b/>
+                <w:bCs/>
+              </w:rPr>
+            </w:pPr>
+            <w:r>
+              <w:rPr>
+                <w:b/>
+                <w:bCs/>
+              </w:rPr>
+              <w:t>33992.25</w:t>
+            </w:r>
+          </w:p>
+        </w:tc>
+        <w:tc>
+          <w:tcPr>
+            <w:tcW w:w="1041" w:type="dxa"/>
+            <w:tcBorders>
+              <w:bottom w:val="single" w:sz="4" w:space="0" w:color="auto"/>
+            </w:tcBorders>
+            <w:vAlign w:val="center"/>
+          </w:tcPr>
+          <w:p>
+            <w:pPr>
+              <w:jc w:val="center"/>
+              <w:rPr>
+                <w:b/>
+                <w:bCs/>
+              </w:rPr>
+            </w:pPr>
+            <w:r>
+              <w:rPr>
+                <w:b/>
+                <w:bCs/>
+              </w:rPr>
+              <w:t>34039.29</w:t>
+            </w:r>
+          </w:p>
+        </w:tc>
+        <w:tc>
+          <w:tcPr>
+            <w:tcW w:w="1041" w:type="dxa"/>
+            <w:tcBorders>
+              <w:bottom w:val="single" w:sz="4" w:space="0" w:color="auto"/>
+            </w:tcBorders>
+            <w:vAlign w:val="center"/>
+          </w:tcPr>
+          <w:p>
+            <w:pPr>
+              <w:jc w:val="center"/>
+              <w:rPr>
+                <w:b/>
+                <w:bCs/>
+              </w:rPr>
+            </w:pPr>
+            <w:r>
+              <w:rPr>
+                <w:b/>
+                <w:bCs/>
+              </w:rPr>
+              <w:t>34013.87</w:t>
+            </w:r>
+          </w:p>
+        </w:tc>
+        <w:tc>
+          <w:tcPr>
+            <w:tcW w:w="1091" w:type="dxa"/>
+            <w:tcBorders>
+              <w:bottom w:val="single" w:sz="4" w:space="0" w:color="auto"/>
+            </w:tcBorders>
+            <w:vAlign w:val="center"/>
+          </w:tcPr>
+          <w:p>
+            <w:pPr>
+              <w:jc w:val="center"/>
+              <w:rPr>
+                <w:b/>
+                <w:bCs/>
+              </w:rPr>
+            </w:pPr>
+          </w:p>
+        </w:tc>
+        <w:tc>
+          <w:tcPr>
+            <w:tcW w:w="904" w:type="dxa"/>
+            <w:tcBorders>
+              <w:bottom w:val="single" w:sz="4" w:space="0" w:color="auto"/>
+            </w:tcBorders>
+            <w:vAlign w:val="center"/>
+          </w:tcPr>
+          <w:p>
+            <w:pPr>
+              <w:jc w:val="center"/>
+              <w:rPr>
+                <w:bCs/>
+              </w:rPr>
+            </w:pPr>
+          </w:p>
+        </w:tc>
+        <w:tc>
+          <w:tcPr>
+            <w:tcW w:w="913" w:type="dxa"/>
+            <w:tcBorders>
+              <w:bottom w:val="single" w:sz="4" w:space="0" w:color="auto"/>
+            </w:tcBorders>
+            <w:vAlign w:val="center"/>
+          </w:tcPr>
+          <w:p>
+            <w:pPr>
+              <w:jc w:val="center"/>
+              <w:rPr>
+                <w:bCs/>
+              </w:rPr>
+            </w:pPr>
+          </w:p>
+        </w:tc>
+      </w:tr>
+    </w:tbl>
+    <w:p>
+      <w:pPr>
+        <w:spacing w:after="160" w:line="259" w:lineRule="auto"/>
+        <w:rPr>
+          <w:rFonts w:eastAsia="Calibri"/>
+        </w:rPr>
+      </w:pPr>
+      <w:r>
+        <w:rPr>
+          <w:rFonts w:eastAsia="Calibri"/>
+          <w:i/>
+        </w:rPr>
+        <w:t xml:space="preserve">Note. </w:t>
+      </w:r>
+      <w:r>
+        <w:rPr>
+          <w:rFonts w:eastAsia="Calibri"/>
+        </w:rPr>
+        <w:t xml:space="preserve">Best-fitting </w:t>
+      </w:r>
+      <w:r>
+        <w:rPr>
+          <w:rFonts w:eastAsia="Calibri"/>
+        </w:rPr>
+        <w:t>univariate</w:t>
+      </w:r>
+      <w:r>
+        <w:rPr>
+          <w:rFonts w:eastAsia="Calibri"/>
+        </w:rPr>
+        <w:t xml:space="preserve"> model in boldface. CFI = comparative fit index; RMSEA = root mean square error of approximation; Δχ</w:t>
+      </w:r>
+      <w:r>
+        <w:rPr>
+          <w:rFonts w:eastAsia="Calibri"/>
+          <w:vertAlign w:val="superscript"/>
+        </w:rPr>
+        <w:t xml:space="preserve">2 </w:t>
+      </w:r>
+      <w:r>
+        <w:rPr>
+          <w:rFonts w:eastAsia="Calibri"/>
+        </w:rPr>
+        <w:t xml:space="preserve">= difference in likelihood ratio tests; </w:t>
+      </w:r>
+      <w:proofErr w:type="spellStart"/>
+      <w:r>
+        <w:rPr>
+          <w:rFonts w:eastAsia="Calibri"/>
+        </w:rPr>
+        <w:t>Δ</w:t>
+      </w:r>
+      <w:r>
+        <w:rPr>
+          <w:rFonts w:eastAsia="Calibri"/>
+          <w:i/>
+        </w:rPr>
+        <w:t>df</w:t>
+      </w:r>
+      <w:proofErr w:type="spellEnd"/>
+      <w:r>
+        <w:rPr>
+          <w:rFonts w:eastAsia="Calibri"/>
+        </w:rPr>
+        <w:t xml:space="preserve"> = difference in </w:t>
+      </w:r>
+      <w:proofErr w:type="spellStart"/>
+      <w:r>
+        <w:rPr>
+          <w:rFonts w:eastAsia="Calibri"/>
+          <w:i/>
+        </w:rPr>
+        <w:t>df</w:t>
+      </w:r>
+      <w:proofErr w:type="spellEnd"/>
+      <w:r>
+        <w:rPr>
+          <w:rFonts w:eastAsia="Calibri"/>
+        </w:rPr>
+        <w:t xml:space="preserve">; </w:t>
+      </w:r>
+      <w:r>
+        <w:rPr>
+          <w:rFonts w:eastAsia="Calibri"/>
+          <w:i/>
+        </w:rPr>
+        <w:t>p</w:t>
+      </w:r>
+      <w:r>
+        <w:rPr>
+          <w:rFonts w:eastAsia="Calibri"/>
+        </w:rPr>
+        <w:t>(d) = proba</w:t>
+      </w:r>
+      <w:r>
+        <w:rPr>
+          <w:rFonts w:eastAsia="Calibri"/>
+        </w:rPr>
+        <w:t xml:space="preserve">bility of the difference tests. </w:t>
+      </w:r>
+      <w:r>
+        <w:t>Lower values of Akaike Information Criteria (AIC), Bayesian Information Criteria (BIC), and sample size-adjusted Bayesian Information Criteria (SABIC) indicate better fit.</w:t>
+      </w:r>
+    </w:p>
+    <w:p>
+      <w:pPr>
+        <w:spacing w:after="160" w:line="259" w:lineRule="auto"/>
+      </w:pPr>
+      <w:r>
+        <w:rPr>
+          <w:rFonts w:eastAsia="Calibri"/>
+        </w:rPr>
+        <w:t>*</w:t>
+      </w:r>
+      <w:r>
+        <w:t xml:space="preserve"> </w:t>
+      </w:r>
+      <w:r>
+        <w:t>The quadratic variance and covariances were fixed to zero because they were not identified; the quadratic factor was therefore interpreted as a fixed effect (population-level curvature).</w:t>
+      </w:r>
+    </w:p>
     <w:sectPr>
       <w:pgSz w:w="15840" w:h="12240" w:orient="landscape"/>
       <w:pgMar w:top="1440" w:right="1440" w:bottom="1440" w:left="1440" w:header="720" w:footer="720" w:gutter="0"/>
@@ -3121,6 +6136,40 @@
       </w:r>
     </w:p>
   </w:comment>
+  <w:comment w:id="2" w:author="Alexis Brieant" w:date="2025-08-22T12:28:00Z" w:initials="AB">
+    <w:p>
+      <w:r>
+        <w:rPr>
+          <w:rStyle w:val="CommentReference"/>
+        </w:rPr>
+        <w:annotationRef/>
+      </w:r>
+      <w:r>
+        <w:rPr>
+          <w:sz w:val="20"/>
+          <w:szCs w:val="20"/>
+        </w:rPr>
+        <w:t>For nested models only</w:t>
+      </w:r>
+    </w:p>
+  </w:comment>
+  <w:comment w:id="3" w:author="Alexis Brieant" w:date="2026-01-07T10:37:00Z" w:initials="AB">
+    <w:p>
+      <w:r>
+        <w:rPr>
+          <w:rStyle w:val="CommentReference"/>
+        </w:rPr>
+        <w:annotationRef/>
+      </w:r>
+      <w:r>
+        <w:rPr>
+          <w:sz w:val="20"/>
+          <w:szCs w:val="20"/>
+        </w:rPr>
+        <w:t>what to do here</w:t>
+      </w:r>
+    </w:p>
+  </w:comment>
 </w:comments>
 </file>
 
@@ -3128,6 +6177,8 @@
 <w15:commentsEx xmlns:wpc="http://schemas.microsoft.com/office/word/2010/wordprocessingCanvas" xmlns:cx="http://schemas.microsoft.com/office/drawing/2014/chartex" xmlns:cx1="http://schemas.microsoft.com/office/drawing/2015/9/8/chartex" xmlns:cx2="http://schemas.microsoft.com/office/drawing/2015/10/21/chartex" xmlns:cx3="http://schemas.microsoft.com/office/drawing/2016/5/9/chartex" xmlns:cx4="http://schemas.microsoft.com/office/drawing/2016/5/10/chartex" xmlns:cx5="http://schemas.microsoft.com/office/drawing/2016/5/11/chartex" xmlns:cx6="http://schemas.microsoft.com/office/drawing/2016/5/12/chartex" xmlns:cx7="http://schemas.microsoft.com/office/drawing/2016/5/13/chartex" xmlns:cx8="http://schemas.microsoft.com/office/drawing/2016/5/14/chartex" xmlns:mc="http://schemas.openxmlformats.org/markup-compatibility/2006" xmlns:aink="http://schemas.microsoft.com/office/drawing/2016/ink" xmlns:am3d="http://schemas.microsoft.com/office/drawing/2017/model3d" xmlns:o="urn:schemas-microsoft-com:office:office" xmlns:oel="http://schemas.microsoft.com/office/2019/extlst" xmlns:r="http://schemas.openxmlformats.org/officeDocument/2006/relationships" xmlns:m="http://schemas.openxmlformats.org/officeDocument/2006/math" xmlns:v="urn:schemas-microsoft-com:vml" xmlns:wp14="http://schemas.microsoft.com/office/word/2010/wordprocessingDrawing" xmlns:wp="http://schemas.openxmlformats.org/drawingml/2006/wordprocessingDrawing" xmlns:w10="urn:schemas-microsoft-com:office:word" xmlns:w="http://schemas.openxmlformats.org/wordprocessingml/2006/main" xmlns:w14="http://schemas.microsoft.com/office/word/2010/wordml" xmlns:w15="http://schemas.microsoft.com/office/word/2012/wordml" xmlns:w16cex="http://schemas.microsoft.com/office/word/2018/wordml/cex" xmlns:w16cid="http://schemas.microsoft.com/office/word/2016/wordml/cid" xmlns:w16="http://schemas.microsoft.com/office/word/2018/wordml" xmlns:w16du="http://schemas.microsoft.com/office/word/2023/wordml/word16du" xmlns:w16sdtdh="http://schemas.microsoft.com/office/word/2020/wordml/sdtdatahash" xmlns:w16sdtfl="http://schemas.microsoft.com/office/word/2024/wordml/sdtformatlock" xmlns:w16se="http://schemas.microsoft.com/office/word/2015/wordml/symex" xmlns:wpg="http://schemas.microsoft.com/office/word/2010/wordprocessingGroup" xmlns:wpi="http://schemas.microsoft.com/office/word/2010/wordprocessingInk" xmlns:wne="http://schemas.microsoft.com/office/word/2006/wordml" xmlns:wps="http://schemas.microsoft.com/office/word/2010/wordprocessingShape" mc:Ignorable="w14 w15 w16se w16cid w16 w16cex w16sdtdh w16sdtfl w16du wp14">
   <w15:commentEx w15:paraId="7F9B9F7B" w15:done="0"/>
   <w15:commentEx w15:paraId="65AB0B9C" w15:done="0"/>
+  <w15:commentEx w15:paraId="4F6B486A" w15:done="0"/>
+  <w15:commentEx w15:paraId="746B9259" w15:done="0"/>
 </w15:commentsEx>
 </file>
 
@@ -3135,6 +6186,8 @@
 <w16cex:commentsExtensible xmlns:wpc="http://schemas.microsoft.com/office/word/2010/wordprocessingCanvas" xmlns:cx="http://schemas.microsoft.com/office/drawing/2014/chartex" xmlns:cx1="http://schemas.microsoft.com/office/drawing/2015/9/8/chartex" xmlns:cx2="http://schemas.microsoft.com/office/drawing/2015/10/21/chartex" xmlns:cx3="http://schemas.microsoft.com/office/drawing/2016/5/9/chartex" xmlns:cx4="http://schemas.microsoft.com/office/drawing/2016/5/10/chartex" xmlns:cx5="http://schemas.microsoft.com/office/drawing/2016/5/11/chartex" xmlns:cx6="http://schemas.microsoft.com/office/drawing/2016/5/12/chartex" xmlns:cx7="http://schemas.microsoft.com/office/drawing/2016/5/13/chartex" xmlns:cx8="http://schemas.microsoft.com/office/drawing/2016/5/14/chartex" xmlns:cr="http://schemas.microsoft.com/office/comments/2020/reactions" xmlns:mc="http://schemas.openxmlformats.org/markup-compatibility/2006" xmlns:aink="http://schemas.microsoft.com/office/drawing/2016/ink" xmlns:am3d="http://schemas.microsoft.com/office/drawing/2017/model3d" xmlns:o="urn:schemas-microsoft-com:office:office" xmlns:oel="http://schemas.microsoft.com/office/2019/extlst" xmlns:r="http://schemas.openxmlformats.org/officeDocument/2006/relationships" xmlns:m="http://schemas.openxmlformats.org/officeDocument/2006/math" xmlns:v="urn:schemas-microsoft-com:vml" xmlns:wp14="http://schemas.microsoft.com/office/word/2010/wordprocessingDrawing" xmlns:wp="http://schemas.openxmlformats.org/drawingml/2006/wordprocessingDrawing" xmlns:w10="urn:schemas-microsoft-com:office:word" xmlns:w="http://schemas.openxmlformats.org/wordprocessingml/2006/main" xmlns:w14="http://schemas.microsoft.com/office/word/2010/wordml" xmlns:w15="http://schemas.microsoft.com/office/word/2012/wordml" xmlns:w16cex="http://schemas.microsoft.com/office/word/2018/wordml/cex" xmlns:w16cid="http://schemas.microsoft.com/office/word/2016/wordml/cid" xmlns:w16="http://schemas.microsoft.com/office/word/2018/wordml" xmlns:w16du="http://schemas.microsoft.com/office/word/2023/wordml/word16du" xmlns:w16sdtdh="http://schemas.microsoft.com/office/word/2020/wordml/sdtdatahash" xmlns:w16sdtfl="http://schemas.microsoft.com/office/word/2024/wordml/sdtformatlock" xmlns:w16se="http://schemas.microsoft.com/office/word/2015/wordml/symex" xmlns:wpg="http://schemas.microsoft.com/office/word/2010/wordprocessingGroup" xmlns:wpi="http://schemas.microsoft.com/office/word/2010/wordprocessingInk" xmlns:wne="http://schemas.microsoft.com/office/word/2006/wordml" xmlns:wps="http://schemas.microsoft.com/office/word/2010/wordprocessingShape" mc:Ignorable="w14 w15 w16se w16cid w16 w16cex w16sdtdh w16sdtfl cr w16du wp14">
   <w16cex:commentExtensible w16cex:durableId="42F86D46" w16cex:dateUtc="2025-08-22T16:28:00Z"/>
   <w16cex:commentExtensible w16cex:durableId="4308D0C8" w16cex:dateUtc="2026-01-07T14:21:00Z"/>
+  <w16cex:commentExtensible w16cex:durableId="3AB03CC9" w16cex:dateUtc="2025-08-22T16:28:00Z"/>
+  <w16cex:commentExtensible w16cex:durableId="4C8CDFD5" w16cex:dateUtc="2026-01-07T15:37:00Z"/>
 </w16cex:commentsExtensible>
 </file>
 
@@ -3142,12 +6195,100 @@
 <w16cid:commentsIds xmlns:wpc="http://schemas.microsoft.com/office/word/2010/wordprocessingCanvas" xmlns:cx="http://schemas.microsoft.com/office/drawing/2014/chartex" xmlns:cx1="http://schemas.microsoft.com/office/drawing/2015/9/8/chartex" xmlns:cx2="http://schemas.microsoft.com/office/drawing/2015/10/21/chartex" xmlns:cx3="http://schemas.microsoft.com/office/drawing/2016/5/9/chartex" xmlns:cx4="http://schemas.microsoft.com/office/drawing/2016/5/10/chartex" xmlns:cx5="http://schemas.microsoft.com/office/drawing/2016/5/11/chartex" xmlns:cx6="http://schemas.microsoft.com/office/drawing/2016/5/12/chartex" xmlns:cx7="http://schemas.microsoft.com/office/drawing/2016/5/13/chartex" xmlns:cx8="http://schemas.microsoft.com/office/drawing/2016/5/14/chartex" xmlns:mc="http://schemas.openxmlformats.org/markup-compatibility/2006" xmlns:aink="http://schemas.microsoft.com/office/drawing/2016/ink" xmlns:am3d="http://schemas.microsoft.com/office/drawing/2017/model3d" xmlns:o="urn:schemas-microsoft-com:office:office" xmlns:oel="http://schemas.microsoft.com/office/2019/extlst" xmlns:r="http://schemas.openxmlformats.org/officeDocument/2006/relationships" xmlns:m="http://schemas.openxmlformats.org/officeDocument/2006/math" xmlns:v="urn:schemas-microsoft-com:vml" xmlns:wp14="http://schemas.microsoft.com/office/word/2010/wordprocessingDrawing" xmlns:wp="http://schemas.openxmlformats.org/drawingml/2006/wordprocessingDrawing" xmlns:w10="urn:schemas-microsoft-com:office:word" xmlns:w="http://schemas.openxmlformats.org/wordprocessingml/2006/main" xmlns:w14="http://schemas.microsoft.com/office/word/2010/wordml" xmlns:w15="http://schemas.microsoft.com/office/word/2012/wordml" xmlns:w16cex="http://schemas.microsoft.com/office/word/2018/wordml/cex" xmlns:w16cid="http://schemas.microsoft.com/office/word/2016/wordml/cid" xmlns:w16="http://schemas.microsoft.com/office/word/2018/wordml" xmlns:w16du="http://schemas.microsoft.com/office/word/2023/wordml/word16du" xmlns:w16sdtdh="http://schemas.microsoft.com/office/word/2020/wordml/sdtdatahash" xmlns:w16sdtfl="http://schemas.microsoft.com/office/word/2024/wordml/sdtformatlock" xmlns:w16se="http://schemas.microsoft.com/office/word/2015/wordml/symex" xmlns:wpg="http://schemas.microsoft.com/office/word/2010/wordprocessingGroup" xmlns:wpi="http://schemas.microsoft.com/office/word/2010/wordprocessingInk" xmlns:wne="http://schemas.microsoft.com/office/word/2006/wordml" xmlns:wps="http://schemas.microsoft.com/office/word/2010/wordprocessingShape" mc:Ignorable="w14 w15 w16se w16cid w16 w16cex w16sdtdh w16sdtfl w16du wp14">
   <w16cid:commentId w16cid:paraId="7F9B9F7B" w16cid:durableId="42F86D46"/>
   <w16cid:commentId w16cid:paraId="65AB0B9C" w16cid:durableId="4308D0C8"/>
+  <w16cid:commentId w16cid:paraId="4F6B486A" w16cid:durableId="3AB03CC9"/>
+  <w16cid:commentId w16cid:paraId="746B9259" w16cid:durableId="4C8CDFD5"/>
 </w16cid:commentsIds>
 </file>
 
 <file path=word/numbering.xml><?xml version="1.0" encoding="utf-8"?>
 <w:numbering xmlns:wpc="http://schemas.microsoft.com/office/word/2010/wordprocessingCanvas" xmlns:cx="http://schemas.microsoft.com/office/drawing/2014/chartex" xmlns:cx1="http://schemas.microsoft.com/office/drawing/2015/9/8/chartex" xmlns:cx2="http://schemas.microsoft.com/office/drawing/2015/10/21/chartex" xmlns:cx3="http://schemas.microsoft.com/office/drawing/2016/5/9/chartex" xmlns:cx4="http://schemas.microsoft.com/office/drawing/2016/5/10/chartex" xmlns:cx5="http://schemas.microsoft.com/office/drawing/2016/5/11/chartex" xmlns:cx6="http://schemas.microsoft.com/office/drawing/2016/5/12/chartex" xmlns:cx7="http://schemas.microsoft.com/office/drawing/2016/5/13/chartex" xmlns:cx8="http://schemas.microsoft.com/office/drawing/2016/5/14/chartex" xmlns:mc="http://schemas.openxmlformats.org/markup-compatibility/2006" xmlns:aink="http://schemas.microsoft.com/office/drawing/2016/ink" xmlns:am3d="http://schemas.microsoft.com/office/drawing/2017/model3d" xmlns:o="urn:schemas-microsoft-com:office:office" xmlns:oel="http://schemas.microsoft.com/office/2019/extlst" xmlns:r="http://schemas.openxmlformats.org/officeDocument/2006/relationships" xmlns:m="http://schemas.openxmlformats.org/officeDocument/2006/math" xmlns:v="urn:schemas-microsoft-com:vml" xmlns:wp14="http://schemas.microsoft.com/office/word/2010/wordprocessingDrawing" xmlns:wp="http://schemas.openxmlformats.org/drawingml/2006/wordprocessingDrawing" xmlns:w10="urn:schemas-microsoft-com:office:word" xmlns:w="http://schemas.openxmlformats.org/wordprocessingml/2006/main" xmlns:w14="http://schemas.microsoft.com/office/word/2010/wordml" xmlns:w15="http://schemas.microsoft.com/office/word/2012/wordml" xmlns:w16cex="http://schemas.microsoft.com/office/word/2018/wordml/cex" xmlns:w16cid="http://schemas.microsoft.com/office/word/2016/wordml/cid" xmlns:w16="http://schemas.microsoft.com/office/word/2018/wordml" xmlns:w16du="http://schemas.microsoft.com/office/word/2023/wordml/word16du" xmlns:w16sdtdh="http://schemas.microsoft.com/office/word/2020/wordml/sdtdatahash" xmlns:w16sdtfl="http://schemas.microsoft.com/office/word/2024/wordml/sdtformatlock" xmlns:w16se="http://schemas.microsoft.com/office/word/2015/wordml/symex" xmlns:wpg="http://schemas.microsoft.com/office/word/2010/wordprocessingGroup" xmlns:wpi="http://schemas.microsoft.com/office/word/2010/wordprocessingInk" xmlns:wne="http://schemas.microsoft.com/office/word/2006/wordml" xmlns:wps="http://schemas.microsoft.com/office/word/2010/wordprocessingShape" mc:Ignorable="w14 w15 w16se w16cid w16 w16cex w16sdtdh w16sdtfl w16du wp14">
   <w:abstractNum w:abstractNumId="0" w15:restartNumberingAfterBreak="0">
+    <w:nsid w:val="355F3084"/>
+    <w:multiLevelType w:val="hybridMultilevel"/>
+    <w:tmpl w:val="20D288E2"/>
+    <w:lvl w:ilvl="0" w:tplc="FFFFFFFF">
+      <w:start w:val="1"/>
+      <w:numFmt w:val="decimal"/>
+      <w:lvlText w:val="%1."/>
+      <w:lvlJc w:val="left"/>
+      <w:pPr>
+        <w:ind w:left="720" w:hanging="360"/>
+      </w:pPr>
+    </w:lvl>
+    <w:lvl w:ilvl="1" w:tplc="FFFFFFFF" w:tentative="1">
+      <w:start w:val="1"/>
+      <w:numFmt w:val="lowerLetter"/>
+      <w:lvlText w:val="%2."/>
+      <w:lvlJc w:val="left"/>
+      <w:pPr>
+        <w:ind w:left="1440" w:hanging="360"/>
+      </w:pPr>
+    </w:lvl>
+    <w:lvl w:ilvl="2" w:tplc="FFFFFFFF" w:tentative="1">
+      <w:start w:val="1"/>
+      <w:numFmt w:val="lowerRoman"/>
+      <w:lvlText w:val="%3."/>
+      <w:lvlJc w:val="right"/>
+      <w:pPr>
+        <w:ind w:left="2160" w:hanging="180"/>
+      </w:pPr>
+    </w:lvl>
+    <w:lvl w:ilvl="3" w:tplc="FFFFFFFF" w:tentative="1">
+      <w:start w:val="1"/>
+      <w:numFmt w:val="decimal"/>
+      <w:lvlText w:val="%4."/>
+      <w:lvlJc w:val="left"/>
+      <w:pPr>
+        <w:ind w:left="2880" w:hanging="360"/>
+      </w:pPr>
+    </w:lvl>
+    <w:lvl w:ilvl="4" w:tplc="FFFFFFFF" w:tentative="1">
+      <w:start w:val="1"/>
+      <w:numFmt w:val="lowerLetter"/>
+      <w:lvlText w:val="%5."/>
+      <w:lvlJc w:val="left"/>
+      <w:pPr>
+        <w:ind w:left="3600" w:hanging="360"/>
+      </w:pPr>
+    </w:lvl>
+    <w:lvl w:ilvl="5" w:tplc="FFFFFFFF" w:tentative="1">
+      <w:start w:val="1"/>
+      <w:numFmt w:val="lowerRoman"/>
+      <w:lvlText w:val="%6."/>
+      <w:lvlJc w:val="right"/>
+      <w:pPr>
+        <w:ind w:left="4320" w:hanging="180"/>
+      </w:pPr>
+    </w:lvl>
+    <w:lvl w:ilvl="6" w:tplc="FFFFFFFF" w:tentative="1">
+      <w:start w:val="1"/>
+      <w:numFmt w:val="decimal"/>
+      <w:lvlText w:val="%7."/>
+      <w:lvlJc w:val="left"/>
+      <w:pPr>
+        <w:ind w:left="5040" w:hanging="360"/>
+      </w:pPr>
+    </w:lvl>
+    <w:lvl w:ilvl="7" w:tplc="FFFFFFFF" w:tentative="1">
+      <w:start w:val="1"/>
+      <w:numFmt w:val="lowerLetter"/>
+      <w:lvlText w:val="%8."/>
+      <w:lvlJc w:val="left"/>
+      <w:pPr>
+        <w:ind w:left="5760" w:hanging="360"/>
+      </w:pPr>
+    </w:lvl>
+    <w:lvl w:ilvl="8" w:tplc="FFFFFFFF" w:tentative="1">
+      <w:start w:val="1"/>
+      <w:numFmt w:val="lowerRoman"/>
+      <w:lvlText w:val="%9."/>
+      <w:lvlJc w:val="right"/>
+      <w:pPr>
+        <w:ind w:left="6480" w:hanging="180"/>
+      </w:pPr>
+    </w:lvl>
+  </w:abstractNum>
+  <w:abstractNum w:abstractNumId="1" w15:restartNumberingAfterBreak="0">
     <w:nsid w:val="7ACA5FD6"/>
     <w:multiLevelType w:val="hybridMultilevel"/>
     <w:tmpl w:val="20D288E2"/>
@@ -3234,6 +6375,9 @@
     </w:lvl>
   </w:abstractNum>
   <w:num w:numId="1" w16cid:durableId="163013946">
+    <w:abstractNumId w:val="1"/>
+  </w:num>
+  <w:num w:numId="2" w16cid:durableId="2024428233">
     <w:abstractNumId w:val="0"/>
   </w:num>
 </w:numbering>

</xml_diff>

<commit_message>
ppt and table update
</commit_message>
<xml_diff>
--- a/GMV_timing_tempo_models/DCN analyses/GMV_fit_indices.docx
+++ b/GMV_timing_tempo_models/DCN analyses/GMV_fit_indices.docx
@@ -1678,6 +1678,7 @@
           </w:tcPr>
           <w:p>
             <w:commentRangeStart w:id="1"/>
+            <w:commentRangeStart w:id="2"/>
             <w:r>
               <w:t>Male</w:t>
             </w:r>
@@ -1690,6 +1691,13 @@
                 <w:rStyle w:val="CommentReference"/>
               </w:rPr>
               <w:commentReference w:id="1"/>
+            </w:r>
+            <w:commentRangeEnd w:id="2"/>
+            <w:r>
+              <w:rPr>
+                <w:rStyle w:val="CommentReference"/>
+              </w:rPr>
+              <w:commentReference w:id="2"/>
             </w:r>
           </w:p>
         </w:tc>
@@ -3459,7 +3467,7 @@
                 <w:color w:val="000000"/>
               </w:rPr>
             </w:pPr>
-            <w:commentRangeStart w:id="2"/>
+            <w:commentRangeStart w:id="3"/>
             <w:proofErr w:type="spellStart"/>
             <w:r>
               <w:rPr>
@@ -3503,12 +3511,12 @@
               </w:rPr>
               <w:t>)</w:t>
             </w:r>
-            <w:commentRangeEnd w:id="2"/>
+            <w:commentRangeEnd w:id="3"/>
             <w:r>
               <w:rPr>
                 <w:rStyle w:val="CommentReference"/>
               </w:rPr>
-              <w:commentReference w:id="2"/>
+              <w:commentReference w:id="3"/>
             </w:r>
           </w:p>
         </w:tc>
@@ -3579,19 +3587,19 @@
             <w:vAlign w:val="center"/>
           </w:tcPr>
           <w:p>
-            <w:commentRangeStart w:id="3"/>
+            <w:commentRangeStart w:id="4"/>
             <w:r>
               <w:t>Female</w:t>
             </w:r>
             <w:r>
               <w:t xml:space="preserve"> (n = 2397)</w:t>
             </w:r>
-            <w:commentRangeEnd w:id="3"/>
+            <w:commentRangeEnd w:id="4"/>
             <w:r>
               <w:rPr>
                 <w:rStyle w:val="CommentReference"/>
               </w:rPr>
-              <w:commentReference w:id="3"/>
+              <w:commentReference w:id="4"/>
             </w:r>
           </w:p>
         </w:tc>
@@ -4614,6 +4622,7 @@
                 <w:numId w:val="2"/>
               </w:numPr>
             </w:pPr>
+            <w:commentRangeStart w:id="5"/>
             <w:r>
               <w:t>Latent basis growth model</w:t>
             </w:r>
@@ -4636,6 +4645,13 @@
                 <w:bCs/>
               </w:rPr>
               <w:t>Slope variance = 0, model not identified</w:t>
+            </w:r>
+            <w:commentRangeEnd w:id="5"/>
+            <w:r>
+              <w:rPr>
+                <w:rStyle w:val="CommentReference"/>
+              </w:rPr>
+              <w:commentReference w:id="5"/>
             </w:r>
           </w:p>
         </w:tc>
@@ -6136,7 +6152,24 @@
       </w:r>
     </w:p>
   </w:comment>
-  <w:comment w:id="2" w:author="Alexis Brieant" w:date="2025-08-22T12:28:00Z" w:initials="AB">
+  <w:comment w:id="2" w:author="Alexis Brieant" w:date="2026-01-07T12:36:00Z" w:initials="AB">
+    <w:p>
+      <w:r>
+        <w:rPr>
+          <w:rStyle w:val="CommentReference"/>
+        </w:rPr>
+        <w:annotationRef/>
+      </w:r>
+      <w:r>
+        <w:rPr>
+          <w:sz w:val="20"/>
+          <w:szCs w:val="20"/>
+        </w:rPr>
+        <w:t>check with group</w:t>
+      </w:r>
+    </w:p>
+  </w:comment>
+  <w:comment w:id="3" w:author="Alexis Brieant" w:date="2025-08-22T12:28:00Z" w:initials="AB">
     <w:p>
       <w:r>
         <w:rPr>
@@ -6153,7 +6186,7 @@
       </w:r>
     </w:p>
   </w:comment>
-  <w:comment w:id="3" w:author="Alexis Brieant" w:date="2026-01-07T10:37:00Z" w:initials="AB">
+  <w:comment w:id="4" w:author="Alexis Brieant" w:date="2026-01-07T10:37:00Z" w:initials="AB">
     <w:p>
       <w:r>
         <w:rPr>
@@ -6170,6 +6203,23 @@
       </w:r>
     </w:p>
   </w:comment>
+  <w:comment w:id="5" w:author="Alexis Brieant" w:date="2026-01-07T12:41:00Z" w:initials="AB">
+    <w:p>
+      <w:r>
+        <w:rPr>
+          <w:rStyle w:val="CommentReference"/>
+        </w:rPr>
+        <w:annotationRef/>
+      </w:r>
+      <w:r>
+        <w:rPr>
+          <w:sz w:val="20"/>
+          <w:szCs w:val="20"/>
+        </w:rPr>
+        <w:t>look into this further</w:t>
+      </w:r>
+    </w:p>
+  </w:comment>
 </w:comments>
 </file>
 
@@ -6177,8 +6227,10 @@
 <w15:commentsEx xmlns:wpc="http://schemas.microsoft.com/office/word/2010/wordprocessingCanvas" xmlns:cx="http://schemas.microsoft.com/office/drawing/2014/chartex" xmlns:cx1="http://schemas.microsoft.com/office/drawing/2015/9/8/chartex" xmlns:cx2="http://schemas.microsoft.com/office/drawing/2015/10/21/chartex" xmlns:cx3="http://schemas.microsoft.com/office/drawing/2016/5/9/chartex" xmlns:cx4="http://schemas.microsoft.com/office/drawing/2016/5/10/chartex" xmlns:cx5="http://schemas.microsoft.com/office/drawing/2016/5/11/chartex" xmlns:cx6="http://schemas.microsoft.com/office/drawing/2016/5/12/chartex" xmlns:cx7="http://schemas.microsoft.com/office/drawing/2016/5/13/chartex" xmlns:cx8="http://schemas.microsoft.com/office/drawing/2016/5/14/chartex" xmlns:mc="http://schemas.openxmlformats.org/markup-compatibility/2006" xmlns:aink="http://schemas.microsoft.com/office/drawing/2016/ink" xmlns:am3d="http://schemas.microsoft.com/office/drawing/2017/model3d" xmlns:o="urn:schemas-microsoft-com:office:office" xmlns:oel="http://schemas.microsoft.com/office/2019/extlst" xmlns:r="http://schemas.openxmlformats.org/officeDocument/2006/relationships" xmlns:m="http://schemas.openxmlformats.org/officeDocument/2006/math" xmlns:v="urn:schemas-microsoft-com:vml" xmlns:wp14="http://schemas.microsoft.com/office/word/2010/wordprocessingDrawing" xmlns:wp="http://schemas.openxmlformats.org/drawingml/2006/wordprocessingDrawing" xmlns:w10="urn:schemas-microsoft-com:office:word" xmlns:w="http://schemas.openxmlformats.org/wordprocessingml/2006/main" xmlns:w14="http://schemas.microsoft.com/office/word/2010/wordml" xmlns:w15="http://schemas.microsoft.com/office/word/2012/wordml" xmlns:w16cex="http://schemas.microsoft.com/office/word/2018/wordml/cex" xmlns:w16cid="http://schemas.microsoft.com/office/word/2016/wordml/cid" xmlns:w16="http://schemas.microsoft.com/office/word/2018/wordml" xmlns:w16du="http://schemas.microsoft.com/office/word/2023/wordml/word16du" xmlns:w16sdtdh="http://schemas.microsoft.com/office/word/2020/wordml/sdtdatahash" xmlns:w16sdtfl="http://schemas.microsoft.com/office/word/2024/wordml/sdtformatlock" xmlns:w16se="http://schemas.microsoft.com/office/word/2015/wordml/symex" xmlns:wpg="http://schemas.microsoft.com/office/word/2010/wordprocessingGroup" xmlns:wpi="http://schemas.microsoft.com/office/word/2010/wordprocessingInk" xmlns:wne="http://schemas.microsoft.com/office/word/2006/wordml" xmlns:wps="http://schemas.microsoft.com/office/word/2010/wordprocessingShape" mc:Ignorable="w14 w15 w16se w16cid w16 w16cex w16sdtdh w16sdtfl w16du wp14">
   <w15:commentEx w15:paraId="7F9B9F7B" w15:done="0"/>
   <w15:commentEx w15:paraId="65AB0B9C" w15:done="0"/>
+  <w15:commentEx w15:paraId="58404C2D" w15:paraIdParent="65AB0B9C" w15:done="0"/>
   <w15:commentEx w15:paraId="4F6B486A" w15:done="0"/>
   <w15:commentEx w15:paraId="746B9259" w15:done="0"/>
+  <w15:commentEx w15:paraId="583A3763" w15:done="0"/>
 </w15:commentsEx>
 </file>
 
@@ -6186,8 +6238,10 @@
 <w16cex:commentsExtensible xmlns:wpc="http://schemas.microsoft.com/office/word/2010/wordprocessingCanvas" xmlns:cx="http://schemas.microsoft.com/office/drawing/2014/chartex" xmlns:cx1="http://schemas.microsoft.com/office/drawing/2015/9/8/chartex" xmlns:cx2="http://schemas.microsoft.com/office/drawing/2015/10/21/chartex" xmlns:cx3="http://schemas.microsoft.com/office/drawing/2016/5/9/chartex" xmlns:cx4="http://schemas.microsoft.com/office/drawing/2016/5/10/chartex" xmlns:cx5="http://schemas.microsoft.com/office/drawing/2016/5/11/chartex" xmlns:cx6="http://schemas.microsoft.com/office/drawing/2016/5/12/chartex" xmlns:cx7="http://schemas.microsoft.com/office/drawing/2016/5/13/chartex" xmlns:cx8="http://schemas.microsoft.com/office/drawing/2016/5/14/chartex" xmlns:cr="http://schemas.microsoft.com/office/comments/2020/reactions" xmlns:mc="http://schemas.openxmlformats.org/markup-compatibility/2006" xmlns:aink="http://schemas.microsoft.com/office/drawing/2016/ink" xmlns:am3d="http://schemas.microsoft.com/office/drawing/2017/model3d" xmlns:o="urn:schemas-microsoft-com:office:office" xmlns:oel="http://schemas.microsoft.com/office/2019/extlst" xmlns:r="http://schemas.openxmlformats.org/officeDocument/2006/relationships" xmlns:m="http://schemas.openxmlformats.org/officeDocument/2006/math" xmlns:v="urn:schemas-microsoft-com:vml" xmlns:wp14="http://schemas.microsoft.com/office/word/2010/wordprocessingDrawing" xmlns:wp="http://schemas.openxmlformats.org/drawingml/2006/wordprocessingDrawing" xmlns:w10="urn:schemas-microsoft-com:office:word" xmlns:w="http://schemas.openxmlformats.org/wordprocessingml/2006/main" xmlns:w14="http://schemas.microsoft.com/office/word/2010/wordml" xmlns:w15="http://schemas.microsoft.com/office/word/2012/wordml" xmlns:w16cex="http://schemas.microsoft.com/office/word/2018/wordml/cex" xmlns:w16cid="http://schemas.microsoft.com/office/word/2016/wordml/cid" xmlns:w16="http://schemas.microsoft.com/office/word/2018/wordml" xmlns:w16du="http://schemas.microsoft.com/office/word/2023/wordml/word16du" xmlns:w16sdtdh="http://schemas.microsoft.com/office/word/2020/wordml/sdtdatahash" xmlns:w16sdtfl="http://schemas.microsoft.com/office/word/2024/wordml/sdtformatlock" xmlns:w16se="http://schemas.microsoft.com/office/word/2015/wordml/symex" xmlns:wpg="http://schemas.microsoft.com/office/word/2010/wordprocessingGroup" xmlns:wpi="http://schemas.microsoft.com/office/word/2010/wordprocessingInk" xmlns:wne="http://schemas.microsoft.com/office/word/2006/wordml" xmlns:wps="http://schemas.microsoft.com/office/word/2010/wordprocessingShape" mc:Ignorable="w14 w15 w16se w16cid w16 w16cex w16sdtdh w16sdtfl cr w16du wp14">
   <w16cex:commentExtensible w16cex:durableId="42F86D46" w16cex:dateUtc="2025-08-22T16:28:00Z"/>
   <w16cex:commentExtensible w16cex:durableId="4308D0C8" w16cex:dateUtc="2026-01-07T14:21:00Z"/>
+  <w16cex:commentExtensible w16cex:durableId="61C5F773" w16cex:dateUtc="2026-01-07T17:36:00Z"/>
   <w16cex:commentExtensible w16cex:durableId="3AB03CC9" w16cex:dateUtc="2025-08-22T16:28:00Z"/>
   <w16cex:commentExtensible w16cex:durableId="4C8CDFD5" w16cex:dateUtc="2026-01-07T15:37:00Z"/>
+  <w16cex:commentExtensible w16cex:durableId="53EFA8A6" w16cex:dateUtc="2026-01-07T17:41:00Z"/>
 </w16cex:commentsExtensible>
 </file>
 
@@ -6195,8 +6249,10 @@
 <w16cid:commentsIds xmlns:wpc="http://schemas.microsoft.com/office/word/2010/wordprocessingCanvas" xmlns:cx="http://schemas.microsoft.com/office/drawing/2014/chartex" xmlns:cx1="http://schemas.microsoft.com/office/drawing/2015/9/8/chartex" xmlns:cx2="http://schemas.microsoft.com/office/drawing/2015/10/21/chartex" xmlns:cx3="http://schemas.microsoft.com/office/drawing/2016/5/9/chartex" xmlns:cx4="http://schemas.microsoft.com/office/drawing/2016/5/10/chartex" xmlns:cx5="http://schemas.microsoft.com/office/drawing/2016/5/11/chartex" xmlns:cx6="http://schemas.microsoft.com/office/drawing/2016/5/12/chartex" xmlns:cx7="http://schemas.microsoft.com/office/drawing/2016/5/13/chartex" xmlns:cx8="http://schemas.microsoft.com/office/drawing/2016/5/14/chartex" xmlns:mc="http://schemas.openxmlformats.org/markup-compatibility/2006" xmlns:aink="http://schemas.microsoft.com/office/drawing/2016/ink" xmlns:am3d="http://schemas.microsoft.com/office/drawing/2017/model3d" xmlns:o="urn:schemas-microsoft-com:office:office" xmlns:oel="http://schemas.microsoft.com/office/2019/extlst" xmlns:r="http://schemas.openxmlformats.org/officeDocument/2006/relationships" xmlns:m="http://schemas.openxmlformats.org/officeDocument/2006/math" xmlns:v="urn:schemas-microsoft-com:vml" xmlns:wp14="http://schemas.microsoft.com/office/word/2010/wordprocessingDrawing" xmlns:wp="http://schemas.openxmlformats.org/drawingml/2006/wordprocessingDrawing" xmlns:w10="urn:schemas-microsoft-com:office:word" xmlns:w="http://schemas.openxmlformats.org/wordprocessingml/2006/main" xmlns:w14="http://schemas.microsoft.com/office/word/2010/wordml" xmlns:w15="http://schemas.microsoft.com/office/word/2012/wordml" xmlns:w16cex="http://schemas.microsoft.com/office/word/2018/wordml/cex" xmlns:w16cid="http://schemas.microsoft.com/office/word/2016/wordml/cid" xmlns:w16="http://schemas.microsoft.com/office/word/2018/wordml" xmlns:w16du="http://schemas.microsoft.com/office/word/2023/wordml/word16du" xmlns:w16sdtdh="http://schemas.microsoft.com/office/word/2020/wordml/sdtdatahash" xmlns:w16sdtfl="http://schemas.microsoft.com/office/word/2024/wordml/sdtformatlock" xmlns:w16se="http://schemas.microsoft.com/office/word/2015/wordml/symex" xmlns:wpg="http://schemas.microsoft.com/office/word/2010/wordprocessingGroup" xmlns:wpi="http://schemas.microsoft.com/office/word/2010/wordprocessingInk" xmlns:wne="http://schemas.microsoft.com/office/word/2006/wordml" xmlns:wps="http://schemas.microsoft.com/office/word/2010/wordprocessingShape" mc:Ignorable="w14 w15 w16se w16cid w16 w16cex w16sdtdh w16sdtfl w16du wp14">
   <w16cid:commentId w16cid:paraId="7F9B9F7B" w16cid:durableId="42F86D46"/>
   <w16cid:commentId w16cid:paraId="65AB0B9C" w16cid:durableId="4308D0C8"/>
+  <w16cid:commentId w16cid:paraId="58404C2D" w16cid:durableId="61C5F773"/>
   <w16cid:commentId w16cid:paraId="4F6B486A" w16cid:durableId="3AB03CC9"/>
   <w16cid:commentId w16cid:paraId="746B9259" w16cid:durableId="4C8CDFD5"/>
+  <w16cid:commentId w16cid:paraId="583A3763" w16cid:durableId="53EFA8A6"/>
 </w16cid:commentsIds>
 </file>
 

</xml_diff>

<commit_message>
added model estimates to ppt
</commit_message>
<xml_diff>
--- a/GMV_timing_tempo_models/DCN analyses/GMV_fit_indices.docx
+++ b/GMV_timing_tempo_models/DCN analyses/GMV_fit_indices.docx
@@ -2605,14 +2605,7 @@
                 <w:b/>
                 <w:bCs/>
               </w:rPr>
-              <w:t>79543.</w:t>
-            </w:r>
-            <w:r>
-              <w:rPr>
-                <w:b/>
-                <w:bCs/>
-              </w:rPr>
-              <w:t>70</w:t>
+              <w:t>79543.70</w:t>
             </w:r>
           </w:p>
         </w:tc>
@@ -4523,14 +4516,7 @@
                 <w:b/>
                 <w:bCs/>
               </w:rPr>
-              <w:t>30181.0</w:t>
-            </w:r>
-            <w:r>
-              <w:rPr>
-                <w:b/>
-                <w:bCs/>
-              </w:rPr>
-              <w:t>6</w:t>
+              <w:t>30181.06</w:t>
             </w:r>
           </w:p>
         </w:tc>
@@ -4552,14 +4538,7 @@
                 <w:b/>
                 <w:bCs/>
               </w:rPr>
-              <w:t>30199.2</w:t>
-            </w:r>
-            <w:r>
-              <w:rPr>
-                <w:b/>
-                <w:bCs/>
-              </w:rPr>
-              <w:t>9</w:t>
+              <w:t>30199.29</w:t>
             </w:r>
           </w:p>
         </w:tc>

</xml_diff>

<commit_message>
adjusted all quadratic models
</commit_message>
<xml_diff>
--- a/GMV_timing_tempo_models/DCN analyses/GMV_fit_indices.docx
+++ b/GMV_timing_tempo_models/DCN analyses/GMV_fit_indices.docx
@@ -1184,7 +1184,25 @@
               <w:rPr>
                 <w:bCs/>
               </w:rPr>
-              <w:t>235.98</w:t>
+              <w:t>23</w:t>
+            </w:r>
+            <w:r>
+              <w:rPr>
+                <w:bCs/>
+              </w:rPr>
+              <w:t>6</w:t>
+            </w:r>
+            <w:r>
+              <w:rPr>
+                <w:bCs/>
+              </w:rPr>
+              <w:t>.</w:t>
+            </w:r>
+            <w:r>
+              <w:rPr>
+                <w:bCs/>
+              </w:rPr>
+              <w:t>11</w:t>
             </w:r>
           </w:p>
         </w:tc>
@@ -1244,7 +1262,7 @@
               <w:rPr>
                 <w:bCs/>
               </w:rPr>
-              <w:t>1.84</w:t>
+              <w:t>2.09</w:t>
             </w:r>
           </w:p>
         </w:tc>
@@ -1310,13 +1328,7 @@
               <w:rPr>
                 <w:bCs/>
               </w:rPr>
-              <w:t>69863.4</w:t>
-            </w:r>
-            <w:r>
-              <w:rPr>
-                <w:bCs/>
-              </w:rPr>
-              <w:t>2</w:t>
+              <w:t>69874.91</w:t>
             </w:r>
           </w:p>
         </w:tc>
@@ -1336,7 +1348,7 @@
               <w:rPr>
                 <w:bCs/>
               </w:rPr>
-              <w:t>69903.89</w:t>
+              <w:t>69915.38</w:t>
             </w:r>
           </w:p>
         </w:tc>
@@ -1356,7 +1368,7 @@
               <w:rPr>
                 <w:bCs/>
               </w:rPr>
-              <w:t>69881.65</w:t>
+              <w:t>69893.14</w:t>
             </w:r>
           </w:p>
         </w:tc>
@@ -1677,27 +1689,11 @@
             <w:vAlign w:val="center"/>
           </w:tcPr>
           <w:p>
-            <w:commentRangeStart w:id="1"/>
-            <w:commentRangeStart w:id="2"/>
             <w:r>
               <w:t>Male</w:t>
             </w:r>
             <w:r>
               <w:t xml:space="preserve"> (n = 2644)</w:t>
-            </w:r>
-            <w:commentRangeEnd w:id="1"/>
-            <w:r>
-              <w:rPr>
-                <w:rStyle w:val="CommentReference"/>
-              </w:rPr>
-              <w:commentReference w:id="1"/>
-            </w:r>
-            <w:commentRangeEnd w:id="2"/>
-            <w:r>
-              <w:rPr>
-                <w:rStyle w:val="CommentReference"/>
-              </w:rPr>
-              <w:commentReference w:id="2"/>
             </w:r>
           </w:p>
         </w:tc>
@@ -2397,16 +2393,8 @@
                 <w:ilvl w:val="0"/>
                 <w:numId w:val="1"/>
               </w:numPr>
-              <w:rPr>
-                <w:b/>
-                <w:bCs/>
-              </w:rPr>
-            </w:pPr>
-            <w:r>
-              <w:rPr>
-                <w:b/>
-                <w:bCs/>
-              </w:rPr>
+            </w:pPr>
+            <w:r>
               <w:t>Quadratic growth model</w:t>
             </w:r>
           </w:p>
@@ -2419,16 +2407,8 @@
           <w:p>
             <w:pPr>
               <w:jc w:val="center"/>
-              <w:rPr>
-                <w:b/>
-                <w:bCs/>
-              </w:rPr>
-            </w:pPr>
-            <w:r>
-              <w:rPr>
-                <w:b/>
-                <w:bCs/>
-              </w:rPr>
+            </w:pPr>
+            <w:r>
               <w:t>31.62</w:t>
             </w:r>
           </w:p>
@@ -2441,16 +2421,8 @@
           <w:p>
             <w:pPr>
               <w:jc w:val="center"/>
-              <w:rPr>
-                <w:b/>
-                <w:bCs/>
-              </w:rPr>
-            </w:pPr>
-            <w:r>
-              <w:rPr>
-                <w:b/>
-                <w:bCs/>
-              </w:rPr>
+            </w:pPr>
+            <w:r>
               <w:t>4</w:t>
             </w:r>
           </w:p>
@@ -2463,16 +2435,8 @@
           <w:p>
             <w:pPr>
               <w:jc w:val="center"/>
-              <w:rPr>
-                <w:b/>
-                <w:bCs/>
-              </w:rPr>
-            </w:pPr>
-            <w:r>
-              <w:rPr>
-                <w:b/>
-                <w:bCs/>
-              </w:rPr>
+            </w:pPr>
+            <w:r>
               <w:t>&lt; .001</w:t>
             </w:r>
           </w:p>
@@ -2485,16 +2449,8 @@
           <w:p>
             <w:pPr>
               <w:jc w:val="center"/>
-              <w:rPr>
-                <w:b/>
-                <w:bCs/>
-              </w:rPr>
-            </w:pPr>
-            <w:r>
-              <w:rPr>
-                <w:b/>
-                <w:bCs/>
-              </w:rPr>
+            </w:pPr>
+            <w:r>
               <w:t>2.49</w:t>
             </w:r>
           </w:p>
@@ -2507,16 +2463,8 @@
           <w:p>
             <w:pPr>
               <w:jc w:val="center"/>
-              <w:rPr>
-                <w:b/>
-                <w:bCs/>
-              </w:rPr>
-            </w:pPr>
-            <w:r>
-              <w:rPr>
-                <w:b/>
-                <w:bCs/>
-              </w:rPr>
+            </w:pPr>
+            <w:r>
               <w:t>0.05</w:t>
             </w:r>
           </w:p>
@@ -2529,16 +2477,8 @@
           <w:p>
             <w:pPr>
               <w:jc w:val="center"/>
-              <w:rPr>
-                <w:b/>
-                <w:bCs/>
-              </w:rPr>
-            </w:pPr>
-            <w:r>
-              <w:rPr>
-                <w:b/>
-                <w:bCs/>
-              </w:rPr>
+            </w:pPr>
+            <w:r>
               <w:t>.99</w:t>
             </w:r>
           </w:p>
@@ -2551,16 +2491,8 @@
           <w:p>
             <w:pPr>
               <w:jc w:val="center"/>
-              <w:rPr>
-                <w:b/>
-                <w:bCs/>
-              </w:rPr>
-            </w:pPr>
-            <w:r>
-              <w:rPr>
-                <w:b/>
-                <w:bCs/>
-              </w:rPr>
+            </w:pPr>
+            <w:r>
               <w:t>79516.67</w:t>
             </w:r>
           </w:p>
@@ -2573,16 +2505,8 @@
           <w:p>
             <w:pPr>
               <w:jc w:val="center"/>
-              <w:rPr>
-                <w:b/>
-                <w:bCs/>
-              </w:rPr>
-            </w:pPr>
-            <w:r>
-              <w:rPr>
-                <w:b/>
-                <w:bCs/>
-              </w:rPr>
+            </w:pPr>
+            <w:r>
               <w:t>79575.47</w:t>
             </w:r>
           </w:p>
@@ -2595,16 +2519,8 @@
           <w:p>
             <w:pPr>
               <w:jc w:val="center"/>
-              <w:rPr>
-                <w:b/>
-                <w:bCs/>
-              </w:rPr>
-            </w:pPr>
-            <w:r>
-              <w:rPr>
-                <w:b/>
-                <w:bCs/>
-              </w:rPr>
+            </w:pPr>
+            <w:r>
               <w:t>79543.70</w:t>
             </w:r>
           </w:p>
@@ -2617,9 +2533,6 @@
           <w:p>
             <w:pPr>
               <w:jc w:val="center"/>
-              <w:rPr>
-                <w:bCs/>
-              </w:rPr>
             </w:pPr>
           </w:p>
         </w:tc>
@@ -3095,14 +3008,18 @@
       <w:r>
         <w:rPr>
           <w:rFonts w:eastAsia="Calibri"/>
+          <w:highlight w:val="yellow"/>
         </w:rPr>
         <w:t>*</w:t>
       </w:r>
       <w:r>
-        <w:t xml:space="preserve"> </w:t>
+        <w:rPr>
+          <w:highlight w:val="yellow"/>
+        </w:rPr>
+        <w:t xml:space="preserve"> The variance and covariances of the linear slope factor were fixed to zero because they were not identified</w:t>
       </w:r>
       <w:r>
-        <w:t>The quadratic variance and covariances were fixed to zero because they were not identified; the quadratic factor was therefore interpreted as a fixed effect (population-level curvature).</w:t>
+        <w:t>.</w:t>
       </w:r>
     </w:p>
     <w:p>
@@ -3460,7 +3377,7 @@
                 <w:color w:val="000000"/>
               </w:rPr>
             </w:pPr>
-            <w:commentRangeStart w:id="3"/>
+            <w:commentRangeStart w:id="1"/>
             <w:proofErr w:type="spellStart"/>
             <w:r>
               <w:rPr>
@@ -3504,12 +3421,12 @@
               </w:rPr>
               <w:t>)</w:t>
             </w:r>
-            <w:commentRangeEnd w:id="3"/>
+            <w:commentRangeEnd w:id="1"/>
             <w:r>
               <w:rPr>
                 <w:rStyle w:val="CommentReference"/>
               </w:rPr>
-              <w:commentReference w:id="3"/>
+              <w:commentReference w:id="1"/>
             </w:r>
           </w:p>
         </w:tc>
@@ -3580,19 +3497,11 @@
             <w:vAlign w:val="center"/>
           </w:tcPr>
           <w:p>
-            <w:commentRangeStart w:id="4"/>
             <w:r>
               <w:t>Female</w:t>
             </w:r>
             <w:r>
               <w:t xml:space="preserve"> (n = 2397)</w:t>
-            </w:r>
-            <w:commentRangeEnd w:id="4"/>
-            <w:r>
-              <w:rPr>
-                <w:rStyle w:val="CommentReference"/>
-              </w:rPr>
-              <w:commentReference w:id="4"/>
             </w:r>
           </w:p>
         </w:tc>
@@ -4348,7 +4257,7 @@
                 <w:b/>
                 <w:bCs/>
               </w:rPr>
-              <w:t>75.47</w:t>
+              <w:t>117.59</w:t>
             </w:r>
           </w:p>
         </w:tc>
@@ -4414,7 +4323,14 @@
                 <w:b/>
                 <w:bCs/>
               </w:rPr>
-              <w:t>2.89</w:t>
+              <w:t>2.8</w:t>
+            </w:r>
+            <w:r>
+              <w:rPr>
+                <w:b/>
+                <w:bCs/>
+              </w:rPr>
+              <w:t>3</w:t>
             </w:r>
           </w:p>
         </w:tc>
@@ -4443,7 +4359,14 @@
                 <w:b/>
                 <w:bCs/>
               </w:rPr>
-              <w:t>06</w:t>
+              <w:t>0</w:t>
+            </w:r>
+            <w:r>
+              <w:rPr>
+                <w:b/>
+                <w:bCs/>
+              </w:rPr>
+              <w:t>8</w:t>
             </w:r>
           </w:p>
         </w:tc>
@@ -4472,7 +4395,7 @@
                 <w:b/>
                 <w:bCs/>
               </w:rPr>
-              <w:t>8</w:t>
+              <w:t>7</w:t>
             </w:r>
           </w:p>
         </w:tc>
@@ -4494,7 +4417,7 @@
                 <w:b/>
                 <w:bCs/>
               </w:rPr>
-              <w:t>30181.05</w:t>
+              <w:t>30297.32</w:t>
             </w:r>
           </w:p>
         </w:tc>
@@ -4516,7 +4439,14 @@
                 <w:b/>
                 <w:bCs/>
               </w:rPr>
-              <w:t>30181.06</w:t>
+              <w:t>30337.</w:t>
+            </w:r>
+            <w:r>
+              <w:rPr>
+                <w:b/>
+                <w:bCs/>
+              </w:rPr>
+              <w:t>80</w:t>
             </w:r>
           </w:p>
         </w:tc>
@@ -4538,7 +4468,14 @@
                 <w:b/>
                 <w:bCs/>
               </w:rPr>
-              <w:t>30199.29</w:t>
+              <w:t>30315.5</w:t>
+            </w:r>
+            <w:r>
+              <w:rPr>
+                <w:b/>
+                <w:bCs/>
+              </w:rPr>
+              <w:t>6</w:t>
             </w:r>
           </w:p>
         </w:tc>
@@ -4601,7 +4538,6 @@
                 <w:numId w:val="2"/>
               </w:numPr>
             </w:pPr>
-            <w:commentRangeStart w:id="5"/>
             <w:r>
               <w:t>Latent basis growth model</w:t>
             </w:r>
@@ -4617,20 +4553,24 @@
             <w:pPr>
               <w:rPr>
                 <w:bCs/>
-              </w:rPr>
-            </w:pPr>
-            <w:r>
-              <w:rPr>
-                <w:bCs/>
-              </w:rPr>
-              <w:t>Slope variance = 0, model not identified</w:t>
-            </w:r>
-            <w:commentRangeEnd w:id="5"/>
+                <w:i/>
+                <w:iCs/>
+              </w:rPr>
+            </w:pPr>
+            <w:commentRangeStart w:id="2"/>
+            <w:r>
+              <w:rPr>
+                <w:i/>
+                <w:iCs/>
+              </w:rPr>
+              <w:t>Slope variance not supported; model not identified</w:t>
+            </w:r>
+            <w:commentRangeEnd w:id="2"/>
             <w:r>
               <w:rPr>
                 <w:rStyle w:val="CommentReference"/>
               </w:rPr>
-              <w:commentReference w:id="5"/>
+              <w:commentReference w:id="2"/>
             </w:r>
           </w:p>
         </w:tc>
@@ -5416,7 +5356,13 @@
               <w:rPr>
                 <w:bCs/>
               </w:rPr>
-              <w:t>72.82</w:t>
+              <w:t>7</w:t>
+            </w:r>
+            <w:r>
+              <w:rPr>
+                <w:bCs/>
+              </w:rPr>
+              <w:t>3.98</w:t>
             </w:r>
           </w:p>
         </w:tc>
@@ -5476,7 +5422,13 @@
               <w:rPr>
                 <w:bCs/>
               </w:rPr>
-              <w:t>3.60</w:t>
+              <w:t>3.</w:t>
+            </w:r>
+            <w:r>
+              <w:rPr>
+                <w:bCs/>
+              </w:rPr>
+              <w:t>40</w:t>
             </w:r>
           </w:p>
         </w:tc>
@@ -5548,13 +5500,7 @@
               <w:rPr>
                 <w:bCs/>
               </w:rPr>
-              <w:t>34117.9</w:t>
-            </w:r>
-            <w:r>
-              <w:rPr>
-                <w:bCs/>
-              </w:rPr>
-              <w:t>7</w:t>
+              <w:t>34107.46</w:t>
             </w:r>
           </w:p>
         </w:tc>
@@ -5574,13 +5520,7 @@
               <w:rPr>
                 <w:bCs/>
               </w:rPr>
-              <w:t>34159.1</w:t>
-            </w:r>
-            <w:r>
-              <w:rPr>
-                <w:bCs/>
-              </w:rPr>
-              <w:t>3</w:t>
+              <w:t>34148.62</w:t>
             </w:r>
           </w:p>
         </w:tc>
@@ -5600,13 +5540,7 @@
               <w:rPr>
                 <w:bCs/>
               </w:rPr>
-              <w:t>34136.8</w:t>
-            </w:r>
-            <w:r>
-              <w:rPr>
-                <w:bCs/>
-              </w:rPr>
-              <w:t>9</w:t>
+              <w:t>34126.38</w:t>
             </w:r>
           </w:p>
         </w:tc>
@@ -6075,14 +6009,42 @@
       <w:r>
         <w:rPr>
           <w:rFonts w:eastAsia="Calibri"/>
+          <w:highlight w:val="yellow"/>
         </w:rPr>
         <w:t>*</w:t>
       </w:r>
       <w:r>
-        <w:t xml:space="preserve"> </w:t>
+        <w:rPr>
+          <w:highlight w:val="yellow"/>
+        </w:rPr>
+        <w:t xml:space="preserve"> The variance and covariances </w:t>
       </w:r>
       <w:r>
-        <w:t>The quadratic variance and covariances were fixed to zero because they were not identified; the quadratic factor was therefore interpreted as a fixed effect (population-level curvature).</w:t>
+        <w:rPr>
+          <w:highlight w:val="yellow"/>
+        </w:rPr>
+        <w:t xml:space="preserve">of the </w:t>
+      </w:r>
+      <w:r>
+        <w:rPr>
+          <w:highlight w:val="yellow"/>
+        </w:rPr>
+        <w:t xml:space="preserve">linear slope </w:t>
+      </w:r>
+      <w:r>
+        <w:rPr>
+          <w:highlight w:val="yellow"/>
+        </w:rPr>
+        <w:t xml:space="preserve">factor </w:t>
+      </w:r>
+      <w:r>
+        <w:rPr>
+          <w:highlight w:val="yellow"/>
+        </w:rPr>
+        <w:t>were fixed to zero because they were not identified</w:t>
+      </w:r>
+      <w:r>
+        <w:t>.</w:t>
       </w:r>
     </w:p>
     <w:sectPr>
@@ -6114,41 +6076,7 @@
       </w:r>
     </w:p>
   </w:comment>
-  <w:comment w:id="1" w:author="Alexis Brieant" w:date="2026-01-07T09:21:00Z" w:initials="AB">
-    <w:p>
-      <w:r>
-        <w:rPr>
-          <w:rStyle w:val="CommentReference"/>
-        </w:rPr>
-        <w:annotationRef/>
-      </w:r>
-      <w:r>
-        <w:rPr>
-          <w:sz w:val="20"/>
-          <w:szCs w:val="20"/>
-        </w:rPr>
-        <w:t>which model?</w:t>
-      </w:r>
-    </w:p>
-  </w:comment>
-  <w:comment w:id="2" w:author="Alexis Brieant" w:date="2026-01-07T12:36:00Z" w:initials="AB">
-    <w:p>
-      <w:r>
-        <w:rPr>
-          <w:rStyle w:val="CommentReference"/>
-        </w:rPr>
-        <w:annotationRef/>
-      </w:r>
-      <w:r>
-        <w:rPr>
-          <w:sz w:val="20"/>
-          <w:szCs w:val="20"/>
-        </w:rPr>
-        <w:t>check with group</w:t>
-      </w:r>
-    </w:p>
-  </w:comment>
-  <w:comment w:id="3" w:author="Alexis Brieant" w:date="2025-08-22T12:28:00Z" w:initials="AB">
+  <w:comment w:id="1" w:author="Alexis Brieant" w:date="2025-08-22T12:28:00Z" w:initials="AB">
     <w:p>
       <w:r>
         <w:rPr>
@@ -6165,7 +6093,7 @@
       </w:r>
     </w:p>
   </w:comment>
-  <w:comment w:id="4" w:author="Alexis Brieant" w:date="2026-01-07T10:37:00Z" w:initials="AB">
+  <w:comment w:id="2" w:author="Alexis Brieant" w:date="2026-01-26T14:39:00Z" w:initials="AB">
     <w:p>
       <w:r>
         <w:rPr>
@@ -6178,24 +6106,7 @@
           <w:sz w:val="20"/>
           <w:szCs w:val="20"/>
         </w:rPr>
-        <w:t>what to do here</w:t>
-      </w:r>
-    </w:p>
-  </w:comment>
-  <w:comment w:id="5" w:author="Alexis Brieant" w:date="2026-01-07T12:41:00Z" w:initials="AB">
-    <w:p>
-      <w:r>
-        <w:rPr>
-          <w:rStyle w:val="CommentReference"/>
-        </w:rPr>
-        <w:annotationRef/>
-      </w:r>
-      <w:r>
-        <w:rPr>
-          <w:sz w:val="20"/>
-          <w:szCs w:val="20"/>
-        </w:rPr>
-        <w:t>look into this further</w:t>
+        <w:t>does this seem appropriate?</w:t>
       </w:r>
     </w:p>
   </w:comment>
@@ -6205,33 +6116,24 @@
 <file path=word/commentsExtended.xml><?xml version="1.0" encoding="utf-8"?>
 <w15:commentsEx xmlns:wpc="http://schemas.microsoft.com/office/word/2010/wordprocessingCanvas" xmlns:cx="http://schemas.microsoft.com/office/drawing/2014/chartex" xmlns:cx1="http://schemas.microsoft.com/office/drawing/2015/9/8/chartex" xmlns:cx2="http://schemas.microsoft.com/office/drawing/2015/10/21/chartex" xmlns:cx3="http://schemas.microsoft.com/office/drawing/2016/5/9/chartex" xmlns:cx4="http://schemas.microsoft.com/office/drawing/2016/5/10/chartex" xmlns:cx5="http://schemas.microsoft.com/office/drawing/2016/5/11/chartex" xmlns:cx6="http://schemas.microsoft.com/office/drawing/2016/5/12/chartex" xmlns:cx7="http://schemas.microsoft.com/office/drawing/2016/5/13/chartex" xmlns:cx8="http://schemas.microsoft.com/office/drawing/2016/5/14/chartex" xmlns:mc="http://schemas.openxmlformats.org/markup-compatibility/2006" xmlns:aink="http://schemas.microsoft.com/office/drawing/2016/ink" xmlns:am3d="http://schemas.microsoft.com/office/drawing/2017/model3d" xmlns:o="urn:schemas-microsoft-com:office:office" xmlns:oel="http://schemas.microsoft.com/office/2019/extlst" xmlns:r="http://schemas.openxmlformats.org/officeDocument/2006/relationships" xmlns:m="http://schemas.openxmlformats.org/officeDocument/2006/math" xmlns:v="urn:schemas-microsoft-com:vml" xmlns:wp14="http://schemas.microsoft.com/office/word/2010/wordprocessingDrawing" xmlns:wp="http://schemas.openxmlformats.org/drawingml/2006/wordprocessingDrawing" xmlns:w10="urn:schemas-microsoft-com:office:word" xmlns:w="http://schemas.openxmlformats.org/wordprocessingml/2006/main" xmlns:w14="http://schemas.microsoft.com/office/word/2010/wordml" xmlns:w15="http://schemas.microsoft.com/office/word/2012/wordml" xmlns:w16cex="http://schemas.microsoft.com/office/word/2018/wordml/cex" xmlns:w16cid="http://schemas.microsoft.com/office/word/2016/wordml/cid" xmlns:w16="http://schemas.microsoft.com/office/word/2018/wordml" xmlns:w16du="http://schemas.microsoft.com/office/word/2023/wordml/word16du" xmlns:w16sdtdh="http://schemas.microsoft.com/office/word/2020/wordml/sdtdatahash" xmlns:w16sdtfl="http://schemas.microsoft.com/office/word/2024/wordml/sdtformatlock" xmlns:w16se="http://schemas.microsoft.com/office/word/2015/wordml/symex" xmlns:wpg="http://schemas.microsoft.com/office/word/2010/wordprocessingGroup" xmlns:wpi="http://schemas.microsoft.com/office/word/2010/wordprocessingInk" xmlns:wne="http://schemas.microsoft.com/office/word/2006/wordml" xmlns:wps="http://schemas.microsoft.com/office/word/2010/wordprocessingShape" mc:Ignorable="w14 w15 w16se w16cid w16 w16cex w16sdtdh w16sdtfl w16du wp14">
   <w15:commentEx w15:paraId="7F9B9F7B" w15:done="0"/>
-  <w15:commentEx w15:paraId="65AB0B9C" w15:done="0"/>
-  <w15:commentEx w15:paraId="58404C2D" w15:paraIdParent="65AB0B9C" w15:done="0"/>
   <w15:commentEx w15:paraId="4F6B486A" w15:done="0"/>
-  <w15:commentEx w15:paraId="746B9259" w15:done="0"/>
-  <w15:commentEx w15:paraId="583A3763" w15:done="0"/>
+  <w15:commentEx w15:paraId="59404078" w15:done="0"/>
 </w15:commentsEx>
 </file>
 
 <file path=word/commentsExtensible.xml><?xml version="1.0" encoding="utf-8"?>
 <w16cex:commentsExtensible xmlns:wpc="http://schemas.microsoft.com/office/word/2010/wordprocessingCanvas" xmlns:cx="http://schemas.microsoft.com/office/drawing/2014/chartex" xmlns:cx1="http://schemas.microsoft.com/office/drawing/2015/9/8/chartex" xmlns:cx2="http://schemas.microsoft.com/office/drawing/2015/10/21/chartex" xmlns:cx3="http://schemas.microsoft.com/office/drawing/2016/5/9/chartex" xmlns:cx4="http://schemas.microsoft.com/office/drawing/2016/5/10/chartex" xmlns:cx5="http://schemas.microsoft.com/office/drawing/2016/5/11/chartex" xmlns:cx6="http://schemas.microsoft.com/office/drawing/2016/5/12/chartex" xmlns:cx7="http://schemas.microsoft.com/office/drawing/2016/5/13/chartex" xmlns:cx8="http://schemas.microsoft.com/office/drawing/2016/5/14/chartex" xmlns:cr="http://schemas.microsoft.com/office/comments/2020/reactions" xmlns:mc="http://schemas.openxmlformats.org/markup-compatibility/2006" xmlns:aink="http://schemas.microsoft.com/office/drawing/2016/ink" xmlns:am3d="http://schemas.microsoft.com/office/drawing/2017/model3d" xmlns:o="urn:schemas-microsoft-com:office:office" xmlns:oel="http://schemas.microsoft.com/office/2019/extlst" xmlns:r="http://schemas.openxmlformats.org/officeDocument/2006/relationships" xmlns:m="http://schemas.openxmlformats.org/officeDocument/2006/math" xmlns:v="urn:schemas-microsoft-com:vml" xmlns:wp14="http://schemas.microsoft.com/office/word/2010/wordprocessingDrawing" xmlns:wp="http://schemas.openxmlformats.org/drawingml/2006/wordprocessingDrawing" xmlns:w10="urn:schemas-microsoft-com:office:word" xmlns:w="http://schemas.openxmlformats.org/wordprocessingml/2006/main" xmlns:w14="http://schemas.microsoft.com/office/word/2010/wordml" xmlns:w15="http://schemas.microsoft.com/office/word/2012/wordml" xmlns:w16cex="http://schemas.microsoft.com/office/word/2018/wordml/cex" xmlns:w16cid="http://schemas.microsoft.com/office/word/2016/wordml/cid" xmlns:w16="http://schemas.microsoft.com/office/word/2018/wordml" xmlns:w16du="http://schemas.microsoft.com/office/word/2023/wordml/word16du" xmlns:w16sdtdh="http://schemas.microsoft.com/office/word/2020/wordml/sdtdatahash" xmlns:w16sdtfl="http://schemas.microsoft.com/office/word/2024/wordml/sdtformatlock" xmlns:w16se="http://schemas.microsoft.com/office/word/2015/wordml/symex" xmlns:wpg="http://schemas.microsoft.com/office/word/2010/wordprocessingGroup" xmlns:wpi="http://schemas.microsoft.com/office/word/2010/wordprocessingInk" xmlns:wne="http://schemas.microsoft.com/office/word/2006/wordml" xmlns:wps="http://schemas.microsoft.com/office/word/2010/wordprocessingShape" mc:Ignorable="w14 w15 w16se w16cid w16 w16cex w16sdtdh w16sdtfl cr w16du wp14">
   <w16cex:commentExtensible w16cex:durableId="42F86D46" w16cex:dateUtc="2025-08-22T16:28:00Z"/>
-  <w16cex:commentExtensible w16cex:durableId="4308D0C8" w16cex:dateUtc="2026-01-07T14:21:00Z"/>
-  <w16cex:commentExtensible w16cex:durableId="61C5F773" w16cex:dateUtc="2026-01-07T17:36:00Z"/>
   <w16cex:commentExtensible w16cex:durableId="3AB03CC9" w16cex:dateUtc="2025-08-22T16:28:00Z"/>
-  <w16cex:commentExtensible w16cex:durableId="4C8CDFD5" w16cex:dateUtc="2026-01-07T15:37:00Z"/>
-  <w16cex:commentExtensible w16cex:durableId="53EFA8A6" w16cex:dateUtc="2026-01-07T17:41:00Z"/>
+  <w16cex:commentExtensible w16cex:durableId="5BCAEF10" w16cex:dateUtc="2026-01-26T19:39:00Z"/>
 </w16cex:commentsExtensible>
 </file>
 
 <file path=word/commentsIds.xml><?xml version="1.0" encoding="utf-8"?>
 <w16cid:commentsIds xmlns:wpc="http://schemas.microsoft.com/office/word/2010/wordprocessingCanvas" xmlns:cx="http://schemas.microsoft.com/office/drawing/2014/chartex" xmlns:cx1="http://schemas.microsoft.com/office/drawing/2015/9/8/chartex" xmlns:cx2="http://schemas.microsoft.com/office/drawing/2015/10/21/chartex" xmlns:cx3="http://schemas.microsoft.com/office/drawing/2016/5/9/chartex" xmlns:cx4="http://schemas.microsoft.com/office/drawing/2016/5/10/chartex" xmlns:cx5="http://schemas.microsoft.com/office/drawing/2016/5/11/chartex" xmlns:cx6="http://schemas.microsoft.com/office/drawing/2016/5/12/chartex" xmlns:cx7="http://schemas.microsoft.com/office/drawing/2016/5/13/chartex" xmlns:cx8="http://schemas.microsoft.com/office/drawing/2016/5/14/chartex" xmlns:mc="http://schemas.openxmlformats.org/markup-compatibility/2006" xmlns:aink="http://schemas.microsoft.com/office/drawing/2016/ink" xmlns:am3d="http://schemas.microsoft.com/office/drawing/2017/model3d" xmlns:o="urn:schemas-microsoft-com:office:office" xmlns:oel="http://schemas.microsoft.com/office/2019/extlst" xmlns:r="http://schemas.openxmlformats.org/officeDocument/2006/relationships" xmlns:m="http://schemas.openxmlformats.org/officeDocument/2006/math" xmlns:v="urn:schemas-microsoft-com:vml" xmlns:wp14="http://schemas.microsoft.com/office/word/2010/wordprocessingDrawing" xmlns:wp="http://schemas.openxmlformats.org/drawingml/2006/wordprocessingDrawing" xmlns:w10="urn:schemas-microsoft-com:office:word" xmlns:w="http://schemas.openxmlformats.org/wordprocessingml/2006/main" xmlns:w14="http://schemas.microsoft.com/office/word/2010/wordml" xmlns:w15="http://schemas.microsoft.com/office/word/2012/wordml" xmlns:w16cex="http://schemas.microsoft.com/office/word/2018/wordml/cex" xmlns:w16cid="http://schemas.microsoft.com/office/word/2016/wordml/cid" xmlns:w16="http://schemas.microsoft.com/office/word/2018/wordml" xmlns:w16du="http://schemas.microsoft.com/office/word/2023/wordml/word16du" xmlns:w16sdtdh="http://schemas.microsoft.com/office/word/2020/wordml/sdtdatahash" xmlns:w16sdtfl="http://schemas.microsoft.com/office/word/2024/wordml/sdtformatlock" xmlns:w16se="http://schemas.microsoft.com/office/word/2015/wordml/symex" xmlns:wpg="http://schemas.microsoft.com/office/word/2010/wordprocessingGroup" xmlns:wpi="http://schemas.microsoft.com/office/word/2010/wordprocessingInk" xmlns:wne="http://schemas.microsoft.com/office/word/2006/wordml" xmlns:wps="http://schemas.microsoft.com/office/word/2010/wordprocessingShape" mc:Ignorable="w14 w15 w16se w16cid w16 w16cex w16sdtdh w16sdtfl w16du wp14">
   <w16cid:commentId w16cid:paraId="7F9B9F7B" w16cid:durableId="42F86D46"/>
-  <w16cid:commentId w16cid:paraId="65AB0B9C" w16cid:durableId="4308D0C8"/>
-  <w16cid:commentId w16cid:paraId="58404C2D" w16cid:durableId="61C5F773"/>
   <w16cid:commentId w16cid:paraId="4F6B486A" w16cid:durableId="3AB03CC9"/>
-  <w16cid:commentId w16cid:paraId="746B9259" w16cid:durableId="4C8CDFD5"/>
-  <w16cid:commentId w16cid:paraId="583A3763" w16cid:durableId="53EFA8A6"/>
+  <w16cid:commentId w16cid:paraId="59404078" w16cid:durableId="5BCAEF10"/>
 </w16cid:commentsIds>
 </file>
 

</xml_diff>

<commit_message>
chi square diff tests
</commit_message>
<xml_diff>
--- a/GMV_timing_tempo_models/DCN analyses/GMV_fit_indices.docx
+++ b/GMV_timing_tempo_models/DCN analyses/GMV_fit_indices.docx
@@ -72,7 +72,7 @@
     <w:tbl>
       <w:tblPr>
         <w:tblStyle w:val="TableGrid3"/>
-        <w:tblW w:w="14504" w:type="dxa"/>
+        <w:tblW w:w="14801" w:type="dxa"/>
         <w:tblInd w:w="-761" w:type="dxa"/>
         <w:tblBorders>
           <w:top w:val="none" w:sz="0" w:space="0" w:color="auto"/>
@@ -95,9 +95,9 @@
         <w:gridCol w:w="1041"/>
         <w:gridCol w:w="1041"/>
         <w:gridCol w:w="1041"/>
-        <w:gridCol w:w="1091"/>
-        <w:gridCol w:w="924"/>
-        <w:gridCol w:w="931"/>
+        <w:gridCol w:w="1623"/>
+        <w:gridCol w:w="810"/>
+        <w:gridCol w:w="810"/>
       </w:tblGrid>
       <w:tr>
         <w:trPr>
@@ -320,7 +320,7 @@
         </w:tc>
         <w:tc>
           <w:tcPr>
-            <w:tcW w:w="1091" w:type="dxa"/>
+            <w:tcW w:w="1623" w:type="dxa"/>
             <w:tcBorders>
               <w:top w:val="single" w:sz="4" w:space="0" w:color="auto"/>
               <w:bottom w:val="single" w:sz="4" w:space="0" w:color="auto"/>
@@ -335,7 +335,6 @@
                 <w:color w:val="000000"/>
               </w:rPr>
             </w:pPr>
-            <w:commentRangeStart w:id="0"/>
             <w:proofErr w:type="spellStart"/>
             <w:r>
               <w:rPr>
@@ -379,18 +378,11 @@
               </w:rPr>
               <w:t>)</w:t>
             </w:r>
-            <w:commentRangeEnd w:id="0"/>
-            <w:r>
-              <w:rPr>
-                <w:rStyle w:val="CommentReference"/>
-              </w:rPr>
-              <w:commentReference w:id="0"/>
-            </w:r>
-          </w:p>
-        </w:tc>
-        <w:tc>
-          <w:tcPr>
-            <w:tcW w:w="924" w:type="dxa"/>
+          </w:p>
+        </w:tc>
+        <w:tc>
+          <w:tcPr>
+            <w:tcW w:w="810" w:type="dxa"/>
             <w:tcBorders>
               <w:top w:val="single" w:sz="4" w:space="0" w:color="auto"/>
               <w:bottom w:val="single" w:sz="4" w:space="0" w:color="auto"/>
@@ -419,7 +411,7 @@
         </w:tc>
         <w:tc>
           <w:tcPr>
-            <w:tcW w:w="931" w:type="dxa"/>
+            <w:tcW w:w="810" w:type="dxa"/>
             <w:tcBorders>
               <w:top w:val="single" w:sz="4" w:space="0" w:color="auto"/>
               <w:bottom w:val="single" w:sz="4" w:space="0" w:color="auto"/>
@@ -591,7 +583,7 @@
         </w:tc>
         <w:tc>
           <w:tcPr>
-            <w:tcW w:w="1091" w:type="dxa"/>
+            <w:tcW w:w="1623" w:type="dxa"/>
             <w:tcBorders>
               <w:top w:val="single" w:sz="4" w:space="0" w:color="auto"/>
             </w:tcBorders>
@@ -605,7 +597,7 @@
         </w:tc>
         <w:tc>
           <w:tcPr>
-            <w:tcW w:w="924" w:type="dxa"/>
+            <w:tcW w:w="810" w:type="dxa"/>
             <w:tcBorders>
               <w:top w:val="single" w:sz="4" w:space="0" w:color="auto"/>
             </w:tcBorders>
@@ -619,7 +611,7 @@
         </w:tc>
         <w:tc>
           <w:tcPr>
-            <w:tcW w:w="931" w:type="dxa"/>
+            <w:tcW w:w="810" w:type="dxa"/>
             <w:tcBorders>
               <w:top w:val="single" w:sz="4" w:space="0" w:color="auto"/>
             </w:tcBorders>
@@ -847,35 +839,35 @@
         </w:tc>
         <w:tc>
           <w:tcPr>
-            <w:tcW w:w="1091" w:type="dxa"/>
-            <w:vAlign w:val="center"/>
-          </w:tcPr>
-          <w:p>
-            <w:pPr>
-              <w:jc w:val="center"/>
-              <w:rPr>
-                <w:bCs/>
-              </w:rPr>
-            </w:pPr>
-          </w:p>
-        </w:tc>
-        <w:tc>
-          <w:tcPr>
-            <w:tcW w:w="924" w:type="dxa"/>
-            <w:vAlign w:val="center"/>
-          </w:tcPr>
-          <w:p>
-            <w:pPr>
-              <w:jc w:val="center"/>
-              <w:rPr>
-                <w:bCs/>
-              </w:rPr>
-            </w:pPr>
-          </w:p>
-        </w:tc>
-        <w:tc>
-          <w:tcPr>
-            <w:tcW w:w="931" w:type="dxa"/>
+            <w:tcW w:w="1623" w:type="dxa"/>
+            <w:vAlign w:val="center"/>
+          </w:tcPr>
+          <w:p>
+            <w:pPr>
+              <w:jc w:val="center"/>
+              <w:rPr>
+                <w:bCs/>
+              </w:rPr>
+            </w:pPr>
+          </w:p>
+        </w:tc>
+        <w:tc>
+          <w:tcPr>
+            <w:tcW w:w="810" w:type="dxa"/>
+            <w:vAlign w:val="center"/>
+          </w:tcPr>
+          <w:p>
+            <w:pPr>
+              <w:jc w:val="center"/>
+              <w:rPr>
+                <w:bCs/>
+              </w:rPr>
+            </w:pPr>
+          </w:p>
+        </w:tc>
+        <w:tc>
+          <w:tcPr>
+            <w:tcW w:w="810" w:type="dxa"/>
             <w:vAlign w:val="center"/>
           </w:tcPr>
           <w:p>
@@ -1005,13 +997,7 @@
               <w:rPr>
                 <w:bCs/>
               </w:rPr>
-              <w:t>0</w:t>
-            </w:r>
-            <w:r>
-              <w:rPr>
-                <w:bCs/>
-              </w:rPr>
-              <w:t>.13</w:t>
+              <w:t>0.13</w:t>
             </w:r>
           </w:p>
         </w:tc>
@@ -1103,44 +1089,88 @@
         </w:tc>
         <w:tc>
           <w:tcPr>
-            <w:tcW w:w="1091" w:type="dxa"/>
-            <w:vAlign w:val="center"/>
-          </w:tcPr>
-          <w:p>
-            <w:pPr>
-              <w:jc w:val="center"/>
-              <w:rPr>
-                <w:bCs/>
-              </w:rPr>
-            </w:pPr>
-          </w:p>
-        </w:tc>
-        <w:tc>
-          <w:tcPr>
-            <w:tcW w:w="924" w:type="dxa"/>
-            <w:vAlign w:val="center"/>
-          </w:tcPr>
-          <w:p>
-            <w:pPr>
-              <w:jc w:val="center"/>
-              <w:rPr>
-                <w:bCs/>
-              </w:rPr>
-            </w:pPr>
-          </w:p>
-        </w:tc>
-        <w:tc>
-          <w:tcPr>
-            <w:tcW w:w="931" w:type="dxa"/>
-            <w:vAlign w:val="center"/>
-          </w:tcPr>
-          <w:p>
-            <w:pPr>
-              <w:jc w:val="center"/>
-              <w:rPr>
-                <w:bCs/>
-              </w:rPr>
-            </w:pPr>
+            <w:tcW w:w="1623" w:type="dxa"/>
+            <w:vAlign w:val="center"/>
+          </w:tcPr>
+          <w:p>
+            <w:pPr>
+              <w:jc w:val="center"/>
+              <w:rPr>
+                <w:bCs/>
+                <w:i/>
+                <w:iCs/>
+              </w:rPr>
+            </w:pPr>
+            <w:r>
+              <w:rPr>
+                <w:bCs/>
+                <w:i/>
+                <w:iCs/>
+              </w:rPr>
+              <w:t xml:space="preserve">Model </w:t>
+            </w:r>
+            <w:r>
+              <w:rPr>
+                <w:bCs/>
+                <w:i/>
+                <w:iCs/>
+              </w:rPr>
+              <w:t>2 vs 1</w:t>
+            </w:r>
+          </w:p>
+          <w:p>
+            <w:pPr>
+              <w:jc w:val="center"/>
+              <w:rPr>
+                <w:color w:val="000000"/>
+              </w:rPr>
+            </w:pPr>
+            <w:r>
+              <w:rPr>
+                <w:color w:val="000000"/>
+              </w:rPr>
+              <w:t>4090.87</w:t>
+            </w:r>
+          </w:p>
+        </w:tc>
+        <w:tc>
+          <w:tcPr>
+            <w:tcW w:w="810" w:type="dxa"/>
+            <w:vAlign w:val="center"/>
+          </w:tcPr>
+          <w:p>
+            <w:pPr>
+              <w:jc w:val="center"/>
+              <w:rPr>
+                <w:bCs/>
+              </w:rPr>
+            </w:pPr>
+            <w:r>
+              <w:rPr>
+                <w:bCs/>
+              </w:rPr>
+              <w:t>3</w:t>
+            </w:r>
+          </w:p>
+        </w:tc>
+        <w:tc>
+          <w:tcPr>
+            <w:tcW w:w="810" w:type="dxa"/>
+            <w:vAlign w:val="center"/>
+          </w:tcPr>
+          <w:p>
+            <w:pPr>
+              <w:jc w:val="center"/>
+              <w:rPr>
+                <w:bCs/>
+              </w:rPr>
+            </w:pPr>
+            <w:r>
+              <w:rPr>
+                <w:bCs/>
+              </w:rPr>
+              <w:t>&lt; .001</w:t>
+            </w:r>
           </w:p>
         </w:tc>
       </w:tr>
@@ -1184,25 +1214,7 @@
               <w:rPr>
                 <w:bCs/>
               </w:rPr>
-              <w:t>23</w:t>
-            </w:r>
-            <w:r>
-              <w:rPr>
-                <w:bCs/>
-              </w:rPr>
-              <w:t>6</w:t>
-            </w:r>
-            <w:r>
-              <w:rPr>
-                <w:bCs/>
-              </w:rPr>
-              <w:t>.</w:t>
-            </w:r>
-            <w:r>
-              <w:rPr>
-                <w:bCs/>
-              </w:rPr>
-              <w:t>11</w:t>
+              <w:t>236.11</w:t>
             </w:r>
           </w:p>
         </w:tc>
@@ -1282,13 +1294,7 @@
               <w:rPr>
                 <w:bCs/>
               </w:rPr>
-              <w:t>0</w:t>
-            </w:r>
-            <w:r>
-              <w:rPr>
-                <w:bCs/>
-              </w:rPr>
-              <w:t>.12</w:t>
+              <w:t>0.12</w:t>
             </w:r>
           </w:p>
         </w:tc>
@@ -1374,44 +1380,88 @@
         </w:tc>
         <w:tc>
           <w:tcPr>
-            <w:tcW w:w="1091" w:type="dxa"/>
-            <w:vAlign w:val="center"/>
-          </w:tcPr>
-          <w:p>
-            <w:pPr>
-              <w:jc w:val="center"/>
-              <w:rPr>
-                <w:bCs/>
-              </w:rPr>
-            </w:pPr>
-          </w:p>
-        </w:tc>
-        <w:tc>
-          <w:tcPr>
-            <w:tcW w:w="924" w:type="dxa"/>
-            <w:vAlign w:val="center"/>
-          </w:tcPr>
-          <w:p>
-            <w:pPr>
-              <w:jc w:val="center"/>
-              <w:rPr>
-                <w:bCs/>
-              </w:rPr>
-            </w:pPr>
-          </w:p>
-        </w:tc>
-        <w:tc>
-          <w:tcPr>
-            <w:tcW w:w="931" w:type="dxa"/>
-            <w:vAlign w:val="center"/>
-          </w:tcPr>
-          <w:p>
-            <w:pPr>
-              <w:jc w:val="center"/>
-              <w:rPr>
-                <w:bCs/>
-              </w:rPr>
-            </w:pPr>
+            <w:tcW w:w="1623" w:type="dxa"/>
+            <w:vAlign w:val="center"/>
+          </w:tcPr>
+          <w:p>
+            <w:pPr>
+              <w:jc w:val="center"/>
+              <w:rPr>
+                <w:bCs/>
+                <w:i/>
+                <w:iCs/>
+              </w:rPr>
+            </w:pPr>
+            <w:r>
+              <w:rPr>
+                <w:bCs/>
+                <w:i/>
+                <w:iCs/>
+              </w:rPr>
+              <w:t xml:space="preserve">Model </w:t>
+            </w:r>
+            <w:r>
+              <w:rPr>
+                <w:bCs/>
+                <w:i/>
+                <w:iCs/>
+              </w:rPr>
+              <w:t>3 vs 2</w:t>
+            </w:r>
+          </w:p>
+          <w:p>
+            <w:pPr>
+              <w:jc w:val="center"/>
+              <w:rPr>
+                <w:color w:val="000000"/>
+              </w:rPr>
+            </w:pPr>
+            <w:r>
+              <w:rPr>
+                <w:color w:val="000000"/>
+              </w:rPr>
+              <w:t>107.55</w:t>
+            </w:r>
+          </w:p>
+        </w:tc>
+        <w:tc>
+          <w:tcPr>
+            <w:tcW w:w="810" w:type="dxa"/>
+            <w:vAlign w:val="center"/>
+          </w:tcPr>
+          <w:p>
+            <w:pPr>
+              <w:jc w:val="center"/>
+              <w:rPr>
+                <w:bCs/>
+              </w:rPr>
+            </w:pPr>
+            <w:r>
+              <w:rPr>
+                <w:bCs/>
+              </w:rPr>
+              <w:t>1</w:t>
+            </w:r>
+          </w:p>
+        </w:tc>
+        <w:tc>
+          <w:tcPr>
+            <w:tcW w:w="810" w:type="dxa"/>
+            <w:vAlign w:val="center"/>
+          </w:tcPr>
+          <w:p>
+            <w:pPr>
+              <w:jc w:val="center"/>
+              <w:rPr>
+                <w:bCs/>
+              </w:rPr>
+            </w:pPr>
+            <w:r>
+              <w:rPr>
+                <w:bCs/>
+              </w:rPr>
+              <w:t>&lt; .001</w:t>
+            </w:r>
           </w:p>
         </w:tc>
       </w:tr>
@@ -1638,44 +1688,84 @@
         </w:tc>
         <w:tc>
           <w:tcPr>
-            <w:tcW w:w="1091" w:type="dxa"/>
-            <w:vAlign w:val="center"/>
-          </w:tcPr>
-          <w:p>
-            <w:pPr>
-              <w:jc w:val="center"/>
-              <w:rPr>
-                <w:bCs/>
-              </w:rPr>
-            </w:pPr>
-          </w:p>
-        </w:tc>
-        <w:tc>
-          <w:tcPr>
-            <w:tcW w:w="924" w:type="dxa"/>
-            <w:vAlign w:val="center"/>
-          </w:tcPr>
-          <w:p>
-            <w:pPr>
-              <w:jc w:val="center"/>
-              <w:rPr>
-                <w:bCs/>
-              </w:rPr>
-            </w:pPr>
-          </w:p>
-        </w:tc>
-        <w:tc>
-          <w:tcPr>
-            <w:tcW w:w="931" w:type="dxa"/>
-            <w:vAlign w:val="center"/>
-          </w:tcPr>
-          <w:p>
-            <w:pPr>
-              <w:jc w:val="center"/>
-              <w:rPr>
-                <w:bCs/>
-              </w:rPr>
-            </w:pPr>
+            <w:tcW w:w="1623" w:type="dxa"/>
+            <w:vAlign w:val="center"/>
+          </w:tcPr>
+          <w:p>
+            <w:pPr>
+              <w:jc w:val="center"/>
+              <w:rPr>
+                <w:i/>
+                <w:iCs/>
+              </w:rPr>
+            </w:pPr>
+            <w:r>
+              <w:rPr>
+                <w:i/>
+                <w:iCs/>
+              </w:rPr>
+              <w:t>Model 4 vs 2</w:t>
+            </w:r>
+          </w:p>
+          <w:p>
+            <w:pPr>
+              <w:jc w:val="center"/>
+              <w:rPr>
+                <w:bCs/>
+              </w:rPr>
+            </w:pPr>
+            <w:r>
+              <w:rPr>
+                <w:bCs/>
+              </w:rPr>
+              <w:t>1</w:t>
+            </w:r>
+            <w:r>
+              <w:rPr>
+                <w:bCs/>
+              </w:rPr>
+              <w:t>58.56</w:t>
+            </w:r>
+          </w:p>
+        </w:tc>
+        <w:tc>
+          <w:tcPr>
+            <w:tcW w:w="810" w:type="dxa"/>
+            <w:vAlign w:val="center"/>
+          </w:tcPr>
+          <w:p>
+            <w:pPr>
+              <w:jc w:val="center"/>
+              <w:rPr>
+                <w:bCs/>
+              </w:rPr>
+            </w:pPr>
+            <w:r>
+              <w:rPr>
+                <w:bCs/>
+              </w:rPr>
+              <w:t>2</w:t>
+            </w:r>
+          </w:p>
+        </w:tc>
+        <w:tc>
+          <w:tcPr>
+            <w:tcW w:w="810" w:type="dxa"/>
+            <w:vAlign w:val="center"/>
+          </w:tcPr>
+          <w:p>
+            <w:pPr>
+              <w:jc w:val="center"/>
+              <w:rPr>
+                <w:bCs/>
+              </w:rPr>
+            </w:pPr>
+            <w:r>
+              <w:rPr>
+                <w:bCs/>
+              </w:rPr>
+              <w:t>&lt; .001</w:t>
+            </w:r>
           </w:p>
         </w:tc>
       </w:tr>
@@ -1825,35 +1915,35 @@
         </w:tc>
         <w:tc>
           <w:tcPr>
-            <w:tcW w:w="1091" w:type="dxa"/>
-            <w:vAlign w:val="center"/>
-          </w:tcPr>
-          <w:p>
-            <w:pPr>
-              <w:jc w:val="center"/>
-              <w:rPr>
-                <w:bCs/>
-              </w:rPr>
-            </w:pPr>
-          </w:p>
-        </w:tc>
-        <w:tc>
-          <w:tcPr>
-            <w:tcW w:w="924" w:type="dxa"/>
-            <w:vAlign w:val="center"/>
-          </w:tcPr>
-          <w:p>
-            <w:pPr>
-              <w:jc w:val="center"/>
-              <w:rPr>
-                <w:bCs/>
-              </w:rPr>
-            </w:pPr>
-          </w:p>
-        </w:tc>
-        <w:tc>
-          <w:tcPr>
-            <w:tcW w:w="931" w:type="dxa"/>
+            <w:tcW w:w="1623" w:type="dxa"/>
+            <w:vAlign w:val="center"/>
+          </w:tcPr>
+          <w:p>
+            <w:pPr>
+              <w:jc w:val="center"/>
+              <w:rPr>
+                <w:bCs/>
+              </w:rPr>
+            </w:pPr>
+          </w:p>
+        </w:tc>
+        <w:tc>
+          <w:tcPr>
+            <w:tcW w:w="810" w:type="dxa"/>
+            <w:vAlign w:val="center"/>
+          </w:tcPr>
+          <w:p>
+            <w:pPr>
+              <w:jc w:val="center"/>
+              <w:rPr>
+                <w:bCs/>
+              </w:rPr>
+            </w:pPr>
+          </w:p>
+        </w:tc>
+        <w:tc>
+          <w:tcPr>
+            <w:tcW w:w="810" w:type="dxa"/>
             <w:vAlign w:val="center"/>
           </w:tcPr>
           <w:p>
@@ -2081,35 +2171,35 @@
         </w:tc>
         <w:tc>
           <w:tcPr>
-            <w:tcW w:w="1091" w:type="dxa"/>
-            <w:vAlign w:val="center"/>
-          </w:tcPr>
-          <w:p>
-            <w:pPr>
-              <w:jc w:val="center"/>
-              <w:rPr>
-                <w:bCs/>
-              </w:rPr>
-            </w:pPr>
-          </w:p>
-        </w:tc>
-        <w:tc>
-          <w:tcPr>
-            <w:tcW w:w="924" w:type="dxa"/>
-            <w:vAlign w:val="center"/>
-          </w:tcPr>
-          <w:p>
-            <w:pPr>
-              <w:jc w:val="center"/>
-              <w:rPr>
-                <w:bCs/>
-              </w:rPr>
-            </w:pPr>
-          </w:p>
-        </w:tc>
-        <w:tc>
-          <w:tcPr>
-            <w:tcW w:w="931" w:type="dxa"/>
+            <w:tcW w:w="1623" w:type="dxa"/>
+            <w:vAlign w:val="center"/>
+          </w:tcPr>
+          <w:p>
+            <w:pPr>
+              <w:jc w:val="center"/>
+              <w:rPr>
+                <w:bCs/>
+              </w:rPr>
+            </w:pPr>
+          </w:p>
+        </w:tc>
+        <w:tc>
+          <w:tcPr>
+            <w:tcW w:w="810" w:type="dxa"/>
+            <w:vAlign w:val="center"/>
+          </w:tcPr>
+          <w:p>
+            <w:pPr>
+              <w:jc w:val="center"/>
+              <w:rPr>
+                <w:bCs/>
+              </w:rPr>
+            </w:pPr>
+          </w:p>
+        </w:tc>
+        <w:tc>
+          <w:tcPr>
+            <w:tcW w:w="810" w:type="dxa"/>
             <w:vAlign w:val="center"/>
           </w:tcPr>
           <w:p>
@@ -2337,44 +2427,104 @@
         </w:tc>
         <w:tc>
           <w:tcPr>
-            <w:tcW w:w="1091" w:type="dxa"/>
-            <w:vAlign w:val="center"/>
-          </w:tcPr>
-          <w:p>
-            <w:pPr>
-              <w:jc w:val="center"/>
-              <w:rPr>
-                <w:bCs/>
-              </w:rPr>
-            </w:pPr>
-          </w:p>
-        </w:tc>
-        <w:tc>
-          <w:tcPr>
-            <w:tcW w:w="924" w:type="dxa"/>
-            <w:vAlign w:val="center"/>
-          </w:tcPr>
-          <w:p>
-            <w:pPr>
-              <w:jc w:val="center"/>
-              <w:rPr>
-                <w:bCs/>
-              </w:rPr>
-            </w:pPr>
-          </w:p>
-        </w:tc>
-        <w:tc>
-          <w:tcPr>
-            <w:tcW w:w="931" w:type="dxa"/>
-            <w:vAlign w:val="center"/>
-          </w:tcPr>
-          <w:p>
-            <w:pPr>
-              <w:jc w:val="center"/>
-              <w:rPr>
-                <w:bCs/>
-              </w:rPr>
-            </w:pPr>
+            <w:tcW w:w="1623" w:type="dxa"/>
+            <w:vAlign w:val="center"/>
+          </w:tcPr>
+          <w:p>
+            <w:pPr>
+              <w:jc w:val="center"/>
+              <w:rPr>
+                <w:bCs/>
+                <w:i/>
+                <w:iCs/>
+              </w:rPr>
+            </w:pPr>
+            <w:r>
+              <w:rPr>
+                <w:bCs/>
+                <w:i/>
+                <w:iCs/>
+              </w:rPr>
+              <w:t xml:space="preserve">Model </w:t>
+            </w:r>
+            <w:r>
+              <w:rPr>
+                <w:bCs/>
+                <w:i/>
+                <w:iCs/>
+              </w:rPr>
+              <w:t>6</w:t>
+            </w:r>
+            <w:r>
+              <w:rPr>
+                <w:bCs/>
+                <w:i/>
+                <w:iCs/>
+              </w:rPr>
+              <w:t xml:space="preserve"> vs </w:t>
+            </w:r>
+            <w:r>
+              <w:rPr>
+                <w:bCs/>
+                <w:i/>
+                <w:iCs/>
+              </w:rPr>
+              <w:t>5</w:t>
+            </w:r>
+          </w:p>
+          <w:p>
+            <w:pPr>
+              <w:jc w:val="center"/>
+              <w:rPr>
+                <w:color w:val="000000"/>
+              </w:rPr>
+            </w:pPr>
+            <w:r>
+              <w:rPr>
+                <w:color w:val="000000"/>
+              </w:rPr>
+              <w:t>2404.71</w:t>
+            </w:r>
+          </w:p>
+        </w:tc>
+        <w:tc>
+          <w:tcPr>
+            <w:tcW w:w="810" w:type="dxa"/>
+            <w:vAlign w:val="center"/>
+          </w:tcPr>
+          <w:p>
+            <w:pPr>
+              <w:jc w:val="center"/>
+              <w:rPr>
+                <w:bCs/>
+              </w:rPr>
+            </w:pPr>
+            <w:r>
+              <w:rPr>
+                <w:bCs/>
+              </w:rPr>
+              <w:t>3</w:t>
+            </w:r>
+          </w:p>
+        </w:tc>
+        <w:tc>
+          <w:tcPr>
+            <w:tcW w:w="810" w:type="dxa"/>
+            <w:vAlign w:val="center"/>
+          </w:tcPr>
+          <w:p>
+            <w:pPr>
+              <w:jc w:val="center"/>
+              <w:rPr>
+                <w:bCs/>
+              </w:rPr>
+            </w:pPr>
+            <w:r>
+              <w:rPr>
+                <w:bCs/>
+              </w:rPr>
+              <w:t>&lt; .001</w:t>
+            </w:r>
           </w:p>
         </w:tc>
       </w:tr>
@@ -2527,41 +2677,98 @@
         </w:tc>
         <w:tc>
           <w:tcPr>
-            <w:tcW w:w="1091" w:type="dxa"/>
-            <w:vAlign w:val="center"/>
-          </w:tcPr>
-          <w:p>
-            <w:pPr>
-              <w:jc w:val="center"/>
-            </w:pPr>
-          </w:p>
-        </w:tc>
-        <w:tc>
-          <w:tcPr>
-            <w:tcW w:w="924" w:type="dxa"/>
-            <w:vAlign w:val="center"/>
-          </w:tcPr>
-          <w:p>
-            <w:pPr>
-              <w:jc w:val="center"/>
-              <w:rPr>
-                <w:bCs/>
-              </w:rPr>
-            </w:pPr>
-          </w:p>
-        </w:tc>
-        <w:tc>
-          <w:tcPr>
-            <w:tcW w:w="931" w:type="dxa"/>
-            <w:vAlign w:val="center"/>
-          </w:tcPr>
-          <w:p>
-            <w:pPr>
-              <w:jc w:val="center"/>
-              <w:rPr>
-                <w:bCs/>
-              </w:rPr>
-            </w:pPr>
+            <w:tcW w:w="1623" w:type="dxa"/>
+            <w:vAlign w:val="center"/>
+          </w:tcPr>
+          <w:p>
+            <w:pPr>
+              <w:jc w:val="center"/>
+              <w:rPr>
+                <w:bCs/>
+                <w:i/>
+                <w:iCs/>
+              </w:rPr>
+            </w:pPr>
+            <w:r>
+              <w:rPr>
+                <w:bCs/>
+                <w:i/>
+                <w:iCs/>
+              </w:rPr>
+              <w:t xml:space="preserve">Model </w:t>
+            </w:r>
+            <w:r>
+              <w:rPr>
+                <w:bCs/>
+                <w:i/>
+                <w:iCs/>
+              </w:rPr>
+              <w:t>7</w:t>
+            </w:r>
+            <w:r>
+              <w:rPr>
+                <w:bCs/>
+                <w:i/>
+                <w:iCs/>
+              </w:rPr>
+              <w:t xml:space="preserve"> vs </w:t>
+            </w:r>
+            <w:r>
+              <w:rPr>
+                <w:bCs/>
+                <w:i/>
+                <w:iCs/>
+              </w:rPr>
+              <w:t>6</w:t>
+            </w:r>
+          </w:p>
+          <w:p>
+            <w:pPr>
+              <w:jc w:val="center"/>
+            </w:pPr>
+            <w:r>
+              <w:t>120.04</w:t>
+            </w:r>
+          </w:p>
+        </w:tc>
+        <w:tc>
+          <w:tcPr>
+            <w:tcW w:w="810" w:type="dxa"/>
+            <w:vAlign w:val="center"/>
+          </w:tcPr>
+          <w:p>
+            <w:pPr>
+              <w:jc w:val="center"/>
+              <w:rPr>
+                <w:bCs/>
+              </w:rPr>
+            </w:pPr>
+            <w:r>
+              <w:rPr>
+                <w:bCs/>
+              </w:rPr>
+              <w:t>4</w:t>
+            </w:r>
+          </w:p>
+        </w:tc>
+        <w:tc>
+          <w:tcPr>
+            <w:tcW w:w="810" w:type="dxa"/>
+            <w:vAlign w:val="center"/>
+          </w:tcPr>
+          <w:p>
+            <w:pPr>
+              <w:jc w:val="center"/>
+              <w:rPr>
+                <w:bCs/>
+              </w:rPr>
+            </w:pPr>
+            <w:r>
+              <w:rPr>
+                <w:bCs/>
+              </w:rPr>
+              <w:t>&lt; .001</w:t>
+            </w:r>
           </w:p>
         </w:tc>
       </w:tr>
@@ -2593,14 +2800,7 @@
                 <w:b/>
                 <w:bCs/>
               </w:rPr>
-              <w:t>Latent basis growth model</w:t>
-            </w:r>
-            <w:r>
-              <w:rPr>
-                <w:b/>
-                <w:bCs/>
-              </w:rPr>
-              <w:t>**</w:t>
+              <w:t>Latent basis growth model**</w:t>
             </w:r>
           </w:p>
         </w:tc>
@@ -2831,7 +3031,7 @@
         </w:tc>
         <w:tc>
           <w:tcPr>
-            <w:tcW w:w="1091" w:type="dxa"/>
+            <w:tcW w:w="1623" w:type="dxa"/>
             <w:tcBorders>
               <w:bottom w:val="single" w:sz="4" w:space="0" w:color="auto"/>
             </w:tcBorders>
@@ -2841,14 +3041,63 @@
             <w:pPr>
               <w:jc w:val="center"/>
               <w:rPr>
-                <w:bCs/>
-              </w:rPr>
-            </w:pPr>
-          </w:p>
-        </w:tc>
-        <w:tc>
-          <w:tcPr>
-            <w:tcW w:w="924" w:type="dxa"/>
+                <w:i/>
+                <w:iCs/>
+              </w:rPr>
+            </w:pPr>
+            <w:r>
+              <w:rPr>
+                <w:i/>
+                <w:iCs/>
+              </w:rPr>
+              <w:t xml:space="preserve">Model </w:t>
+            </w:r>
+            <w:r>
+              <w:rPr>
+                <w:i/>
+                <w:iCs/>
+              </w:rPr>
+              <w:t>8</w:t>
+            </w:r>
+            <w:r>
+              <w:rPr>
+                <w:i/>
+                <w:iCs/>
+              </w:rPr>
+              <w:t xml:space="preserve"> vs </w:t>
+            </w:r>
+            <w:r>
+              <w:rPr>
+                <w:i/>
+                <w:iCs/>
+              </w:rPr>
+              <w:t>6</w:t>
+            </w:r>
+          </w:p>
+          <w:p>
+            <w:pPr>
+              <w:jc w:val="center"/>
+              <w:rPr>
+                <w:bCs/>
+              </w:rPr>
+            </w:pPr>
+            <w:r>
+              <w:rPr>
+                <w:bCs/>
+              </w:rPr>
+              <w:t>15</w:t>
+            </w:r>
+            <w:r>
+              <w:rPr>
+                <w:bCs/>
+              </w:rPr>
+              <w:t>2.85</w:t>
+            </w:r>
+          </w:p>
+        </w:tc>
+        <w:tc>
+          <w:tcPr>
+            <w:tcW w:w="810" w:type="dxa"/>
             <w:tcBorders>
               <w:bottom w:val="single" w:sz="4" w:space="0" w:color="auto"/>
             </w:tcBorders>
@@ -2861,11 +3110,17 @@
                 <w:bCs/>
               </w:rPr>
             </w:pPr>
-          </w:p>
-        </w:tc>
-        <w:tc>
-          <w:tcPr>
-            <w:tcW w:w="931" w:type="dxa"/>
+            <w:r>
+              <w:rPr>
+                <w:bCs/>
+              </w:rPr>
+              <w:t>2</w:t>
+            </w:r>
+          </w:p>
+        </w:tc>
+        <w:tc>
+          <w:tcPr>
+            <w:tcW w:w="810" w:type="dxa"/>
             <w:tcBorders>
               <w:bottom w:val="single" w:sz="4" w:space="0" w:color="auto"/>
             </w:tcBorders>
@@ -2878,6 +3133,12 @@
                 <w:bCs/>
               </w:rPr>
             </w:pPr>
+            <w:r>
+              <w:rPr>
+                <w:bCs/>
+              </w:rPr>
+              <w:t>&lt; .001</w:t>
+            </w:r>
           </w:p>
         </w:tc>
       </w:tr>
@@ -3047,6 +3308,21 @@
     </w:p>
     <w:p>
       <w:pPr>
+        <w:rPr>
+          <w:rFonts w:eastAsia="Calibri"/>
+          <w:i/>
+        </w:rPr>
+      </w:pPr>
+      <w:r>
+        <w:rPr>
+          <w:rFonts w:eastAsia="Calibri"/>
+          <w:i/>
+        </w:rPr>
+        <w:br w:type="page"/>
+      </w:r>
+    </w:p>
+    <w:p>
+      <w:pPr>
         <w:spacing w:after="160" w:line="259" w:lineRule="auto"/>
         <w:rPr>
           <w:rFonts w:eastAsia="Calibri"/>
@@ -3377,7 +3653,7 @@
                 <w:color w:val="000000"/>
               </w:rPr>
             </w:pPr>
-            <w:commentRangeStart w:id="1"/>
+            <w:commentRangeStart w:id="0"/>
             <w:proofErr w:type="spellStart"/>
             <w:r>
               <w:rPr>
@@ -3421,12 +3697,12 @@
               </w:rPr>
               <w:t>)</w:t>
             </w:r>
-            <w:commentRangeEnd w:id="1"/>
+            <w:commentRangeEnd w:id="0"/>
             <w:r>
               <w:rPr>
                 <w:rStyle w:val="CommentReference"/>
               </w:rPr>
-              <w:commentReference w:id="1"/>
+              <w:commentReference w:id="0"/>
             </w:r>
           </w:p>
         </w:tc>
@@ -4179,6 +4455,12 @@
                 <w:bCs/>
               </w:rPr>
             </w:pPr>
+            <w:r>
+              <w:rPr>
+                <w:bCs/>
+              </w:rPr>
+              <w:t>Linear vs no growth</w:t>
+            </w:r>
           </w:p>
         </w:tc>
         <w:tc>
@@ -4193,6 +4475,12 @@
                 <w:bCs/>
               </w:rPr>
             </w:pPr>
+            <w:r>
+              <w:rPr>
+                <w:bCs/>
+              </w:rPr>
+              <w:t>3</w:t>
+            </w:r>
           </w:p>
         </w:tc>
         <w:tc>
@@ -4491,6 +4779,12 @@
                 <w:bCs/>
               </w:rPr>
             </w:pPr>
+            <w:r>
+              <w:rPr>
+                <w:bCs/>
+              </w:rPr>
+              <w:t>Quadratic vs linear</w:t>
+            </w:r>
           </w:p>
         </w:tc>
         <w:tc>
@@ -4505,6 +4799,12 @@
                 <w:bCs/>
               </w:rPr>
             </w:pPr>
+            <w:r>
+              <w:rPr>
+                <w:bCs/>
+              </w:rPr>
+              <w:t>1</w:t>
+            </w:r>
           </w:p>
         </w:tc>
         <w:tc>
@@ -4557,7 +4857,7 @@
                 <w:iCs/>
               </w:rPr>
             </w:pPr>
-            <w:commentRangeStart w:id="2"/>
+            <w:commentRangeStart w:id="1"/>
             <w:r>
               <w:rPr>
                 <w:i/>
@@ -4565,12 +4865,12 @@
               </w:rPr>
               <w:t>Slope variance not supported; model not identified</w:t>
             </w:r>
-            <w:commentRangeEnd w:id="2"/>
+            <w:commentRangeEnd w:id="1"/>
             <w:r>
               <w:rPr>
                 <w:rStyle w:val="CommentReference"/>
               </w:rPr>
-              <w:commentReference w:id="2"/>
+              <w:commentReference w:id="1"/>
             </w:r>
           </w:p>
         </w:tc>
@@ -5000,7 +5300,6 @@
           </w:tcPr>
           <w:p>
             <w:pPr>
-              <w:jc w:val="center"/>
               <w:rPr>
                 <w:bCs/>
               </w:rPr>
@@ -5159,13 +5458,7 @@
               <w:rPr>
                 <w:bCs/>
               </w:rPr>
-              <w:t>0.0</w:t>
-            </w:r>
-            <w:r>
-              <w:rPr>
-                <w:bCs/>
-              </w:rPr>
-              <w:t>9</w:t>
+              <w:t>0.09</w:t>
             </w:r>
           </w:p>
         </w:tc>
@@ -5185,7 +5478,27 @@
               <w:rPr>
                 <w:bCs/>
               </w:rPr>
-              <w:t>.9</w:t>
+              <w:t>.95</w:t>
+            </w:r>
+          </w:p>
+        </w:tc>
+        <w:tc>
+          <w:tcPr>
+            <w:tcW w:w="1041" w:type="dxa"/>
+            <w:vAlign w:val="center"/>
+          </w:tcPr>
+          <w:p>
+            <w:pPr>
+              <w:jc w:val="center"/>
+              <w:rPr>
+                <w:bCs/>
+              </w:rPr>
+            </w:pPr>
+            <w:r>
+              <w:rPr>
+                <w:bCs/>
+              </w:rPr>
+              <w:t>34425.2</w:t>
             </w:r>
             <w:r>
               <w:rPr>
@@ -5211,13 +5524,13 @@
               <w:rPr>
                 <w:bCs/>
               </w:rPr>
-              <w:t>34425.2</w:t>
-            </w:r>
-            <w:r>
-              <w:rPr>
-                <w:bCs/>
-              </w:rPr>
-              <w:t>5</w:t>
+              <w:t>34460.5</w:t>
+            </w:r>
+            <w:r>
+              <w:rPr>
+                <w:bCs/>
+              </w:rPr>
+              <w:t>3</w:t>
             </w:r>
           </w:p>
         </w:tc>
@@ -5237,68 +5550,54 @@
               <w:rPr>
                 <w:bCs/>
               </w:rPr>
-              <w:t>34460.5</w:t>
-            </w:r>
+              <w:t>34441.4</w:t>
+            </w:r>
+            <w:r>
+              <w:rPr>
+                <w:bCs/>
+              </w:rPr>
+              <w:t>7</w:t>
+            </w:r>
+          </w:p>
+        </w:tc>
+        <w:tc>
+          <w:tcPr>
+            <w:tcW w:w="1091" w:type="dxa"/>
+            <w:vAlign w:val="center"/>
+          </w:tcPr>
+          <w:p>
+            <w:pPr>
+              <w:jc w:val="center"/>
+              <w:rPr>
+                <w:bCs/>
+              </w:rPr>
+            </w:pPr>
+            <w:r>
+              <w:rPr>
+                <w:bCs/>
+              </w:rPr>
+              <w:t>Linear vs no growth</w:t>
+            </w:r>
+          </w:p>
+        </w:tc>
+        <w:tc>
+          <w:tcPr>
+            <w:tcW w:w="904" w:type="dxa"/>
+            <w:vAlign w:val="center"/>
+          </w:tcPr>
+          <w:p>
+            <w:pPr>
+              <w:jc w:val="center"/>
+              <w:rPr>
+                <w:bCs/>
+              </w:rPr>
+            </w:pPr>
             <w:r>
               <w:rPr>
                 <w:bCs/>
               </w:rPr>
               <w:t>3</w:t>
             </w:r>
-          </w:p>
-        </w:tc>
-        <w:tc>
-          <w:tcPr>
-            <w:tcW w:w="1041" w:type="dxa"/>
-            <w:vAlign w:val="center"/>
-          </w:tcPr>
-          <w:p>
-            <w:pPr>
-              <w:jc w:val="center"/>
-              <w:rPr>
-                <w:bCs/>
-              </w:rPr>
-            </w:pPr>
-            <w:r>
-              <w:rPr>
-                <w:bCs/>
-              </w:rPr>
-              <w:t>34441.4</w:t>
-            </w:r>
-            <w:r>
-              <w:rPr>
-                <w:bCs/>
-              </w:rPr>
-              <w:t>7</w:t>
-            </w:r>
-          </w:p>
-        </w:tc>
-        <w:tc>
-          <w:tcPr>
-            <w:tcW w:w="1091" w:type="dxa"/>
-            <w:vAlign w:val="center"/>
-          </w:tcPr>
-          <w:p>
-            <w:pPr>
-              <w:jc w:val="center"/>
-              <w:rPr>
-                <w:bCs/>
-              </w:rPr>
-            </w:pPr>
-          </w:p>
-        </w:tc>
-        <w:tc>
-          <w:tcPr>
-            <w:tcW w:w="904" w:type="dxa"/>
-            <w:vAlign w:val="center"/>
-          </w:tcPr>
-          <w:p>
-            <w:pPr>
-              <w:jc w:val="center"/>
-              <w:rPr>
-                <w:bCs/>
-              </w:rPr>
-            </w:pPr>
           </w:p>
         </w:tc>
         <w:tc>
@@ -5422,13 +5721,7 @@
               <w:rPr>
                 <w:bCs/>
               </w:rPr>
-              <w:t>3.</w:t>
-            </w:r>
-            <w:r>
-              <w:rPr>
-                <w:bCs/>
-              </w:rPr>
-              <w:t>40</w:t>
+              <w:t>3.40</w:t>
             </w:r>
           </w:p>
         </w:tc>
@@ -5448,13 +5741,7 @@
               <w:rPr>
                 <w:bCs/>
               </w:rPr>
-              <w:t>0.0</w:t>
-            </w:r>
-            <w:r>
-              <w:rPr>
-                <w:bCs/>
-              </w:rPr>
-              <w:t>6</w:t>
+              <w:t>0.06</w:t>
             </w:r>
           </w:p>
         </w:tc>
@@ -5474,13 +5761,7 @@
               <w:rPr>
                 <w:bCs/>
               </w:rPr>
-              <w:t>.9</w:t>
-            </w:r>
-            <w:r>
-              <w:rPr>
-                <w:bCs/>
-              </w:rPr>
-              <w:t>8</w:t>
+              <w:t>.98</w:t>
             </w:r>
           </w:p>
         </w:tc>
@@ -5556,6 +5837,12 @@
                 <w:bCs/>
               </w:rPr>
             </w:pPr>
+            <w:r>
+              <w:rPr>
+                <w:bCs/>
+              </w:rPr>
+              <w:t>Quadratic vs linear</w:t>
+            </w:r>
           </w:p>
         </w:tc>
         <w:tc>
@@ -5570,6 +5857,12 @@
                 <w:bCs/>
               </w:rPr>
             </w:pPr>
+            <w:r>
+              <w:rPr>
+                <w:bCs/>
+              </w:rPr>
+              <w:t>1</w:t>
+            </w:r>
           </w:p>
         </w:tc>
         <w:tc>
@@ -5855,11 +6148,10 @@
           <w:p>
             <w:pPr>
               <w:jc w:val="center"/>
-              <w:rPr>
-                <w:b/>
-                <w:bCs/>
-              </w:rPr>
-            </w:pPr>
+            </w:pPr>
+            <w:r>
+              <w:t>Latent basis vs linear</w:t>
+            </w:r>
           </w:p>
         </w:tc>
         <w:tc>
@@ -5873,10 +6165,10 @@
           <w:p>
             <w:pPr>
               <w:jc w:val="center"/>
-              <w:rPr>
-                <w:bCs/>
-              </w:rPr>
-            </w:pPr>
+            </w:pPr>
+            <w:r>
+              <w:t>2</w:t>
+            </w:r>
           </w:p>
         </w:tc>
         <w:tc>
@@ -6076,24 +6368,7 @@
       </w:r>
     </w:p>
   </w:comment>
-  <w:comment w:id="1" w:author="Alexis Brieant" w:date="2025-08-22T12:28:00Z" w:initials="AB">
-    <w:p>
-      <w:r>
-        <w:rPr>
-          <w:rStyle w:val="CommentReference"/>
-        </w:rPr>
-        <w:annotationRef/>
-      </w:r>
-      <w:r>
-        <w:rPr>
-          <w:sz w:val="20"/>
-          <w:szCs w:val="20"/>
-        </w:rPr>
-        <w:t>For nested models only</w:t>
-      </w:r>
-    </w:p>
-  </w:comment>
-  <w:comment w:id="2" w:author="Alexis Brieant" w:date="2026-01-26T14:39:00Z" w:initials="AB">
+  <w:comment w:id="1" w:author="Alexis Brieant" w:date="2026-01-26T14:39:00Z" w:initials="AB">
     <w:p>
       <w:r>
         <w:rPr>
@@ -6115,7 +6390,6 @@
 
 <file path=word/commentsExtended.xml><?xml version="1.0" encoding="utf-8"?>
 <w15:commentsEx xmlns:wpc="http://schemas.microsoft.com/office/word/2010/wordprocessingCanvas" xmlns:cx="http://schemas.microsoft.com/office/drawing/2014/chartex" xmlns:cx1="http://schemas.microsoft.com/office/drawing/2015/9/8/chartex" xmlns:cx2="http://schemas.microsoft.com/office/drawing/2015/10/21/chartex" xmlns:cx3="http://schemas.microsoft.com/office/drawing/2016/5/9/chartex" xmlns:cx4="http://schemas.microsoft.com/office/drawing/2016/5/10/chartex" xmlns:cx5="http://schemas.microsoft.com/office/drawing/2016/5/11/chartex" xmlns:cx6="http://schemas.microsoft.com/office/drawing/2016/5/12/chartex" xmlns:cx7="http://schemas.microsoft.com/office/drawing/2016/5/13/chartex" xmlns:cx8="http://schemas.microsoft.com/office/drawing/2016/5/14/chartex" xmlns:mc="http://schemas.openxmlformats.org/markup-compatibility/2006" xmlns:aink="http://schemas.microsoft.com/office/drawing/2016/ink" xmlns:am3d="http://schemas.microsoft.com/office/drawing/2017/model3d" xmlns:o="urn:schemas-microsoft-com:office:office" xmlns:oel="http://schemas.microsoft.com/office/2019/extlst" xmlns:r="http://schemas.openxmlformats.org/officeDocument/2006/relationships" xmlns:m="http://schemas.openxmlformats.org/officeDocument/2006/math" xmlns:v="urn:schemas-microsoft-com:vml" xmlns:wp14="http://schemas.microsoft.com/office/word/2010/wordprocessingDrawing" xmlns:wp="http://schemas.openxmlformats.org/drawingml/2006/wordprocessingDrawing" xmlns:w10="urn:schemas-microsoft-com:office:word" xmlns:w="http://schemas.openxmlformats.org/wordprocessingml/2006/main" xmlns:w14="http://schemas.microsoft.com/office/word/2010/wordml" xmlns:w15="http://schemas.microsoft.com/office/word/2012/wordml" xmlns:w16cex="http://schemas.microsoft.com/office/word/2018/wordml/cex" xmlns:w16cid="http://schemas.microsoft.com/office/word/2016/wordml/cid" xmlns:w16="http://schemas.microsoft.com/office/word/2018/wordml" xmlns:w16du="http://schemas.microsoft.com/office/word/2023/wordml/word16du" xmlns:w16sdtdh="http://schemas.microsoft.com/office/word/2020/wordml/sdtdatahash" xmlns:w16sdtfl="http://schemas.microsoft.com/office/word/2024/wordml/sdtformatlock" xmlns:w16se="http://schemas.microsoft.com/office/word/2015/wordml/symex" xmlns:wpg="http://schemas.microsoft.com/office/word/2010/wordprocessingGroup" xmlns:wpi="http://schemas.microsoft.com/office/word/2010/wordprocessingInk" xmlns:wne="http://schemas.microsoft.com/office/word/2006/wordml" xmlns:wps="http://schemas.microsoft.com/office/word/2010/wordprocessingShape" mc:Ignorable="w14 w15 w16se w16cid w16 w16cex w16sdtdh w16sdtfl w16du wp14">
-  <w15:commentEx w15:paraId="7F9B9F7B" w15:done="0"/>
   <w15:commentEx w15:paraId="4F6B486A" w15:done="0"/>
   <w15:commentEx w15:paraId="59404078" w15:done="0"/>
 </w15:commentsEx>
@@ -6123,7 +6397,6 @@
 
 <file path=word/commentsExtensible.xml><?xml version="1.0" encoding="utf-8"?>
 <w16cex:commentsExtensible xmlns:wpc="http://schemas.microsoft.com/office/word/2010/wordprocessingCanvas" xmlns:cx="http://schemas.microsoft.com/office/drawing/2014/chartex" xmlns:cx1="http://schemas.microsoft.com/office/drawing/2015/9/8/chartex" xmlns:cx2="http://schemas.microsoft.com/office/drawing/2015/10/21/chartex" xmlns:cx3="http://schemas.microsoft.com/office/drawing/2016/5/9/chartex" xmlns:cx4="http://schemas.microsoft.com/office/drawing/2016/5/10/chartex" xmlns:cx5="http://schemas.microsoft.com/office/drawing/2016/5/11/chartex" xmlns:cx6="http://schemas.microsoft.com/office/drawing/2016/5/12/chartex" xmlns:cx7="http://schemas.microsoft.com/office/drawing/2016/5/13/chartex" xmlns:cx8="http://schemas.microsoft.com/office/drawing/2016/5/14/chartex" xmlns:cr="http://schemas.microsoft.com/office/comments/2020/reactions" xmlns:mc="http://schemas.openxmlformats.org/markup-compatibility/2006" xmlns:aink="http://schemas.microsoft.com/office/drawing/2016/ink" xmlns:am3d="http://schemas.microsoft.com/office/drawing/2017/model3d" xmlns:o="urn:schemas-microsoft-com:office:office" xmlns:oel="http://schemas.microsoft.com/office/2019/extlst" xmlns:r="http://schemas.openxmlformats.org/officeDocument/2006/relationships" xmlns:m="http://schemas.openxmlformats.org/officeDocument/2006/math" xmlns:v="urn:schemas-microsoft-com:vml" xmlns:wp14="http://schemas.microsoft.com/office/word/2010/wordprocessingDrawing" xmlns:wp="http://schemas.openxmlformats.org/drawingml/2006/wordprocessingDrawing" xmlns:w10="urn:schemas-microsoft-com:office:word" xmlns:w="http://schemas.openxmlformats.org/wordprocessingml/2006/main" xmlns:w14="http://schemas.microsoft.com/office/word/2010/wordml" xmlns:w15="http://schemas.microsoft.com/office/word/2012/wordml" xmlns:w16cex="http://schemas.microsoft.com/office/word/2018/wordml/cex" xmlns:w16cid="http://schemas.microsoft.com/office/word/2016/wordml/cid" xmlns:w16="http://schemas.microsoft.com/office/word/2018/wordml" xmlns:w16du="http://schemas.microsoft.com/office/word/2023/wordml/word16du" xmlns:w16sdtdh="http://schemas.microsoft.com/office/word/2020/wordml/sdtdatahash" xmlns:w16sdtfl="http://schemas.microsoft.com/office/word/2024/wordml/sdtformatlock" xmlns:w16se="http://schemas.microsoft.com/office/word/2015/wordml/symex" xmlns:wpg="http://schemas.microsoft.com/office/word/2010/wordprocessingGroup" xmlns:wpi="http://schemas.microsoft.com/office/word/2010/wordprocessingInk" xmlns:wne="http://schemas.microsoft.com/office/word/2006/wordml" xmlns:wps="http://schemas.microsoft.com/office/word/2010/wordprocessingShape" mc:Ignorable="w14 w15 w16se w16cid w16 w16cex w16sdtdh w16sdtfl cr w16du wp14">
-  <w16cex:commentExtensible w16cex:durableId="42F86D46" w16cex:dateUtc="2025-08-22T16:28:00Z"/>
   <w16cex:commentExtensible w16cex:durableId="3AB03CC9" w16cex:dateUtc="2025-08-22T16:28:00Z"/>
   <w16cex:commentExtensible w16cex:durableId="5BCAEF10" w16cex:dateUtc="2026-01-26T19:39:00Z"/>
 </w16cex:commentsExtensible>
@@ -6131,7 +6404,6 @@
 
 <file path=word/commentsIds.xml><?xml version="1.0" encoding="utf-8"?>
 <w16cid:commentsIds xmlns:wpc="http://schemas.microsoft.com/office/word/2010/wordprocessingCanvas" xmlns:cx="http://schemas.microsoft.com/office/drawing/2014/chartex" xmlns:cx1="http://schemas.microsoft.com/office/drawing/2015/9/8/chartex" xmlns:cx2="http://schemas.microsoft.com/office/drawing/2015/10/21/chartex" xmlns:cx3="http://schemas.microsoft.com/office/drawing/2016/5/9/chartex" xmlns:cx4="http://schemas.microsoft.com/office/drawing/2016/5/10/chartex" xmlns:cx5="http://schemas.microsoft.com/office/drawing/2016/5/11/chartex" xmlns:cx6="http://schemas.microsoft.com/office/drawing/2016/5/12/chartex" xmlns:cx7="http://schemas.microsoft.com/office/drawing/2016/5/13/chartex" xmlns:cx8="http://schemas.microsoft.com/office/drawing/2016/5/14/chartex" xmlns:mc="http://schemas.openxmlformats.org/markup-compatibility/2006" xmlns:aink="http://schemas.microsoft.com/office/drawing/2016/ink" xmlns:am3d="http://schemas.microsoft.com/office/drawing/2017/model3d" xmlns:o="urn:schemas-microsoft-com:office:office" xmlns:oel="http://schemas.microsoft.com/office/2019/extlst" xmlns:r="http://schemas.openxmlformats.org/officeDocument/2006/relationships" xmlns:m="http://schemas.openxmlformats.org/officeDocument/2006/math" xmlns:v="urn:schemas-microsoft-com:vml" xmlns:wp14="http://schemas.microsoft.com/office/word/2010/wordprocessingDrawing" xmlns:wp="http://schemas.openxmlformats.org/drawingml/2006/wordprocessingDrawing" xmlns:w10="urn:schemas-microsoft-com:office:word" xmlns:w="http://schemas.openxmlformats.org/wordprocessingml/2006/main" xmlns:w14="http://schemas.microsoft.com/office/word/2010/wordml" xmlns:w15="http://schemas.microsoft.com/office/word/2012/wordml" xmlns:w16cex="http://schemas.microsoft.com/office/word/2018/wordml/cex" xmlns:w16cid="http://schemas.microsoft.com/office/word/2016/wordml/cid" xmlns:w16="http://schemas.microsoft.com/office/word/2018/wordml" xmlns:w16du="http://schemas.microsoft.com/office/word/2023/wordml/word16du" xmlns:w16sdtdh="http://schemas.microsoft.com/office/word/2020/wordml/sdtdatahash" xmlns:w16sdtfl="http://schemas.microsoft.com/office/word/2024/wordml/sdtformatlock" xmlns:w16se="http://schemas.microsoft.com/office/word/2015/wordml/symex" xmlns:wpg="http://schemas.microsoft.com/office/word/2010/wordprocessingGroup" xmlns:wpi="http://schemas.microsoft.com/office/word/2010/wordprocessingInk" xmlns:wne="http://schemas.microsoft.com/office/word/2006/wordml" xmlns:wps="http://schemas.microsoft.com/office/word/2010/wordprocessingShape" mc:Ignorable="w14 w15 w16se w16cid w16 w16cex w16sdtdh w16sdtfl w16du wp14">
-  <w16cid:commentId w16cid:paraId="7F9B9F7B" w16cid:durableId="42F86D46"/>
   <w16cid:commentId w16cid:paraId="4F6B486A" w16cid:durableId="3AB03CC9"/>
   <w16cid:commentId w16cid:paraId="59404078" w16cid:durableId="5BCAEF10"/>
 </w16cid:commentsIds>
@@ -6724,7 +6996,7 @@
   <w:style w:type="paragraph" w:default="1" w:styleId="Normal">
     <w:name w:val="Normal"/>
     <w:qFormat/>
-    <w:rsid w:val="0066759F"/>
+    <w:rsid w:val="002654CF"/>
     <w:rPr>
       <w:rFonts w:ascii="Times New Roman" w:eastAsia="Times New Roman" w:hAnsi="Times New Roman" w:cs="Times New Roman"/>
       <w:kern w:val="0"/>

</xml_diff>

<commit_message>
finished chi sq tests
</commit_message>
<xml_diff>
--- a/GMV_timing_tempo_models/DCN analyses/GMV_fit_indices.docx
+++ b/GMV_timing_tempo_models/DCN analyses/GMV_fit_indices.docx
@@ -3390,7 +3390,7 @@
     <w:tbl>
       <w:tblPr>
         <w:tblStyle w:val="TableGrid3"/>
-        <w:tblW w:w="14504" w:type="dxa"/>
+        <w:tblW w:w="14711" w:type="dxa"/>
         <w:tblInd w:w="-761" w:type="dxa"/>
         <w:tblBorders>
           <w:top w:val="none" w:sz="0" w:space="0" w:color="auto"/>
@@ -3413,9 +3413,9 @@
         <w:gridCol w:w="1041"/>
         <w:gridCol w:w="1041"/>
         <w:gridCol w:w="1041"/>
-        <w:gridCol w:w="1091"/>
-        <w:gridCol w:w="904"/>
-        <w:gridCol w:w="913"/>
+        <w:gridCol w:w="1495"/>
+        <w:gridCol w:w="720"/>
+        <w:gridCol w:w="900"/>
       </w:tblGrid>
       <w:tr>
         <w:trPr>
@@ -3638,7 +3638,7 @@
         </w:tc>
         <w:tc>
           <w:tcPr>
-            <w:tcW w:w="1091" w:type="dxa"/>
+            <w:tcW w:w="1495" w:type="dxa"/>
             <w:tcBorders>
               <w:top w:val="single" w:sz="4" w:space="0" w:color="auto"/>
               <w:bottom w:val="single" w:sz="4" w:space="0" w:color="auto"/>
@@ -3653,7 +3653,6 @@
                 <w:color w:val="000000"/>
               </w:rPr>
             </w:pPr>
-            <w:commentRangeStart w:id="0"/>
             <w:proofErr w:type="spellStart"/>
             <w:r>
               <w:rPr>
@@ -3697,18 +3696,11 @@
               </w:rPr>
               <w:t>)</w:t>
             </w:r>
-            <w:commentRangeEnd w:id="0"/>
-            <w:r>
-              <w:rPr>
-                <w:rStyle w:val="CommentReference"/>
-              </w:rPr>
-              <w:commentReference w:id="0"/>
-            </w:r>
-          </w:p>
-        </w:tc>
-        <w:tc>
-          <w:tcPr>
-            <w:tcW w:w="904" w:type="dxa"/>
+          </w:p>
+        </w:tc>
+        <w:tc>
+          <w:tcPr>
+            <w:tcW w:w="720" w:type="dxa"/>
             <w:tcBorders>
               <w:top w:val="single" w:sz="4" w:space="0" w:color="auto"/>
               <w:bottom w:val="single" w:sz="4" w:space="0" w:color="auto"/>
@@ -3737,7 +3729,7 @@
         </w:tc>
         <w:tc>
           <w:tcPr>
-            <w:tcW w:w="913" w:type="dxa"/>
+            <w:tcW w:w="900" w:type="dxa"/>
             <w:tcBorders>
               <w:top w:val="single" w:sz="4" w:space="0" w:color="auto"/>
               <w:bottom w:val="single" w:sz="4" w:space="0" w:color="auto"/>
@@ -3909,7 +3901,7 @@
         </w:tc>
         <w:tc>
           <w:tcPr>
-            <w:tcW w:w="1091" w:type="dxa"/>
+            <w:tcW w:w="1495" w:type="dxa"/>
             <w:tcBorders>
               <w:top w:val="single" w:sz="4" w:space="0" w:color="auto"/>
             </w:tcBorders>
@@ -3923,7 +3915,7 @@
         </w:tc>
         <w:tc>
           <w:tcPr>
-            <w:tcW w:w="904" w:type="dxa"/>
+            <w:tcW w:w="720" w:type="dxa"/>
             <w:tcBorders>
               <w:top w:val="single" w:sz="4" w:space="0" w:color="auto"/>
             </w:tcBorders>
@@ -3937,7 +3929,7 @@
         </w:tc>
         <w:tc>
           <w:tcPr>
-            <w:tcW w:w="913" w:type="dxa"/>
+            <w:tcW w:w="900" w:type="dxa"/>
             <w:tcBorders>
               <w:top w:val="single" w:sz="4" w:space="0" w:color="auto"/>
             </w:tcBorders>
@@ -4189,35 +4181,35 @@
         </w:tc>
         <w:tc>
           <w:tcPr>
-            <w:tcW w:w="1091" w:type="dxa"/>
-            <w:vAlign w:val="center"/>
-          </w:tcPr>
-          <w:p>
-            <w:pPr>
-              <w:jc w:val="center"/>
-              <w:rPr>
-                <w:bCs/>
-              </w:rPr>
-            </w:pPr>
-          </w:p>
-        </w:tc>
-        <w:tc>
-          <w:tcPr>
-            <w:tcW w:w="904" w:type="dxa"/>
-            <w:vAlign w:val="center"/>
-          </w:tcPr>
-          <w:p>
-            <w:pPr>
-              <w:jc w:val="center"/>
-              <w:rPr>
-                <w:bCs/>
-              </w:rPr>
-            </w:pPr>
-          </w:p>
-        </w:tc>
-        <w:tc>
-          <w:tcPr>
-            <w:tcW w:w="913" w:type="dxa"/>
+            <w:tcW w:w="1495" w:type="dxa"/>
+            <w:vAlign w:val="center"/>
+          </w:tcPr>
+          <w:p>
+            <w:pPr>
+              <w:jc w:val="center"/>
+              <w:rPr>
+                <w:bCs/>
+              </w:rPr>
+            </w:pPr>
+          </w:p>
+        </w:tc>
+        <w:tc>
+          <w:tcPr>
+            <w:tcW w:w="720" w:type="dxa"/>
+            <w:vAlign w:val="center"/>
+          </w:tcPr>
+          <w:p>
+            <w:pPr>
+              <w:jc w:val="center"/>
+              <w:rPr>
+                <w:bCs/>
+              </w:rPr>
+            </w:pPr>
+          </w:p>
+        </w:tc>
+        <w:tc>
+          <w:tcPr>
+            <w:tcW w:w="900" w:type="dxa"/>
             <w:vAlign w:val="center"/>
           </w:tcPr>
           <w:p>
@@ -4367,13 +4359,7 @@
               <w:rPr>
                 <w:bCs/>
               </w:rPr>
-              <w:t>.9</w:t>
-            </w:r>
-            <w:r>
-              <w:rPr>
-                <w:bCs/>
-              </w:rPr>
-              <w:t>0</w:t>
+              <w:t>.90</w:t>
             </w:r>
           </w:p>
         </w:tc>
@@ -4445,27 +4431,46 @@
         </w:tc>
         <w:tc>
           <w:tcPr>
-            <w:tcW w:w="1091" w:type="dxa"/>
-            <w:vAlign w:val="center"/>
-          </w:tcPr>
-          <w:p>
-            <w:pPr>
-              <w:jc w:val="center"/>
-              <w:rPr>
-                <w:bCs/>
-              </w:rPr>
-            </w:pPr>
-            <w:r>
-              <w:rPr>
-                <w:bCs/>
-              </w:rPr>
-              <w:t>Linear vs no growth</w:t>
-            </w:r>
-          </w:p>
-        </w:tc>
-        <w:tc>
-          <w:tcPr>
-            <w:tcW w:w="904" w:type="dxa"/>
+            <w:tcW w:w="1495" w:type="dxa"/>
+            <w:vAlign w:val="center"/>
+          </w:tcPr>
+          <w:p>
+            <w:pPr>
+              <w:jc w:val="center"/>
+              <w:rPr>
+                <w:bCs/>
+                <w:i/>
+                <w:iCs/>
+              </w:rPr>
+            </w:pPr>
+            <w:r>
+              <w:rPr>
+                <w:bCs/>
+                <w:i/>
+                <w:iCs/>
+              </w:rPr>
+              <w:t>Model 2 vs 1</w:t>
+            </w:r>
+          </w:p>
+          <w:p>
+            <w:pPr>
+              <w:jc w:val="center"/>
+              <w:rPr>
+                <w:bCs/>
+                <w:highlight w:val="green"/>
+              </w:rPr>
+            </w:pPr>
+            <w:r>
+              <w:rPr>
+                <w:bCs/>
+              </w:rPr>
+              <w:t>90.07</w:t>
+            </w:r>
+          </w:p>
+        </w:tc>
+        <w:tc>
+          <w:tcPr>
+            <w:tcW w:w="720" w:type="dxa"/>
             <w:vAlign w:val="center"/>
           </w:tcPr>
           <w:p>
@@ -4485,16 +4490,22 @@
         </w:tc>
         <w:tc>
           <w:tcPr>
-            <w:tcW w:w="913" w:type="dxa"/>
-            <w:vAlign w:val="center"/>
-          </w:tcPr>
-          <w:p>
-            <w:pPr>
-              <w:jc w:val="center"/>
-              <w:rPr>
-                <w:bCs/>
-              </w:rPr>
-            </w:pPr>
+            <w:tcW w:w="900" w:type="dxa"/>
+            <w:vAlign w:val="center"/>
+          </w:tcPr>
+          <w:p>
+            <w:pPr>
+              <w:jc w:val="center"/>
+              <w:rPr>
+                <w:bCs/>
+              </w:rPr>
+            </w:pPr>
+            <w:r>
+              <w:rPr>
+                <w:bCs/>
+              </w:rPr>
+              <w:t>&lt; .001</w:t>
+            </w:r>
           </w:p>
         </w:tc>
       </w:tr>
@@ -4640,14 +4651,7 @@
                 <w:b/>
                 <w:bCs/>
               </w:rPr>
-              <w:t>0.</w:t>
-            </w:r>
-            <w:r>
-              <w:rPr>
-                <w:b/>
-                <w:bCs/>
-              </w:rPr>
-              <w:t>0</w:t>
+              <w:t>0.0</w:t>
             </w:r>
             <w:r>
               <w:rPr>
@@ -4769,27 +4773,46 @@
         </w:tc>
         <w:tc>
           <w:tcPr>
-            <w:tcW w:w="1091" w:type="dxa"/>
-            <w:vAlign w:val="center"/>
-          </w:tcPr>
-          <w:p>
-            <w:pPr>
-              <w:jc w:val="center"/>
-              <w:rPr>
-                <w:bCs/>
-              </w:rPr>
-            </w:pPr>
-            <w:r>
-              <w:rPr>
-                <w:bCs/>
-              </w:rPr>
-              <w:t>Quadratic vs linear</w:t>
-            </w:r>
-          </w:p>
-        </w:tc>
-        <w:tc>
-          <w:tcPr>
-            <w:tcW w:w="904" w:type="dxa"/>
+            <w:tcW w:w="1495" w:type="dxa"/>
+            <w:vAlign w:val="center"/>
+          </w:tcPr>
+          <w:p>
+            <w:pPr>
+              <w:jc w:val="center"/>
+              <w:rPr>
+                <w:bCs/>
+                <w:i/>
+                <w:iCs/>
+              </w:rPr>
+            </w:pPr>
+            <w:r>
+              <w:rPr>
+                <w:bCs/>
+                <w:i/>
+                <w:iCs/>
+              </w:rPr>
+              <w:t>Model 3 vs 2</w:t>
+            </w:r>
+          </w:p>
+          <w:p>
+            <w:pPr>
+              <w:jc w:val="center"/>
+              <w:rPr>
+                <w:bCs/>
+                <w:highlight w:val="green"/>
+              </w:rPr>
+            </w:pPr>
+            <w:r>
+              <w:rPr>
+                <w:bCs/>
+              </w:rPr>
+              <w:t>156.07</w:t>
+            </w:r>
+          </w:p>
+        </w:tc>
+        <w:tc>
+          <w:tcPr>
+            <w:tcW w:w="720" w:type="dxa"/>
             <w:vAlign w:val="center"/>
           </w:tcPr>
           <w:p>
@@ -4809,16 +4832,22 @@
         </w:tc>
         <w:tc>
           <w:tcPr>
-            <w:tcW w:w="913" w:type="dxa"/>
-            <w:vAlign w:val="center"/>
-          </w:tcPr>
-          <w:p>
-            <w:pPr>
-              <w:jc w:val="center"/>
-              <w:rPr>
-                <w:bCs/>
-              </w:rPr>
-            </w:pPr>
+            <w:tcW w:w="900" w:type="dxa"/>
+            <w:vAlign w:val="center"/>
+          </w:tcPr>
+          <w:p>
+            <w:pPr>
+              <w:jc w:val="center"/>
+              <w:rPr>
+                <w:bCs/>
+              </w:rPr>
+            </w:pPr>
+            <w:r>
+              <w:rPr>
+                <w:bCs/>
+              </w:rPr>
+              <w:t>&lt; .001</w:t>
+            </w:r>
           </w:p>
         </w:tc>
       </w:tr>
@@ -4845,7 +4874,7 @@
         </w:tc>
         <w:tc>
           <w:tcPr>
-            <w:tcW w:w="11955" w:type="dxa"/>
+            <w:tcW w:w="12162" w:type="dxa"/>
             <w:gridSpan w:val="12"/>
             <w:vAlign w:val="center"/>
           </w:tcPr>
@@ -4857,7 +4886,7 @@
                 <w:iCs/>
               </w:rPr>
             </w:pPr>
-            <w:commentRangeStart w:id="1"/>
+            <w:commentRangeStart w:id="0"/>
             <w:r>
               <w:rPr>
                 <w:i/>
@@ -4865,12 +4894,12 @@
               </w:rPr>
               <w:t>Slope variance not supported; model not identified</w:t>
             </w:r>
-            <w:commentRangeEnd w:id="1"/>
+            <w:commentRangeEnd w:id="0"/>
             <w:r>
               <w:rPr>
                 <w:rStyle w:val="CommentReference"/>
               </w:rPr>
-              <w:commentReference w:id="1"/>
+              <w:commentReference w:id="0"/>
             </w:r>
           </w:p>
         </w:tc>
@@ -5021,35 +5050,35 @@
         </w:tc>
         <w:tc>
           <w:tcPr>
-            <w:tcW w:w="1091" w:type="dxa"/>
-            <w:vAlign w:val="center"/>
-          </w:tcPr>
-          <w:p>
-            <w:pPr>
-              <w:jc w:val="center"/>
-              <w:rPr>
-                <w:bCs/>
-              </w:rPr>
-            </w:pPr>
-          </w:p>
-        </w:tc>
-        <w:tc>
-          <w:tcPr>
-            <w:tcW w:w="904" w:type="dxa"/>
-            <w:vAlign w:val="center"/>
-          </w:tcPr>
-          <w:p>
-            <w:pPr>
-              <w:jc w:val="center"/>
-              <w:rPr>
-                <w:bCs/>
-              </w:rPr>
-            </w:pPr>
-          </w:p>
-        </w:tc>
-        <w:tc>
-          <w:tcPr>
-            <w:tcW w:w="913" w:type="dxa"/>
+            <w:tcW w:w="1495" w:type="dxa"/>
+            <w:vAlign w:val="center"/>
+          </w:tcPr>
+          <w:p>
+            <w:pPr>
+              <w:jc w:val="center"/>
+              <w:rPr>
+                <w:bCs/>
+              </w:rPr>
+            </w:pPr>
+          </w:p>
+        </w:tc>
+        <w:tc>
+          <w:tcPr>
+            <w:tcW w:w="720" w:type="dxa"/>
+            <w:vAlign w:val="center"/>
+          </w:tcPr>
+          <w:p>
+            <w:pPr>
+              <w:jc w:val="center"/>
+              <w:rPr>
+                <w:bCs/>
+              </w:rPr>
+            </w:pPr>
+          </w:p>
+        </w:tc>
+        <w:tc>
+          <w:tcPr>
+            <w:tcW w:w="900" w:type="dxa"/>
             <w:vAlign w:val="center"/>
           </w:tcPr>
           <w:p>
@@ -5295,34 +5324,34 @@
         </w:tc>
         <w:tc>
           <w:tcPr>
-            <w:tcW w:w="1091" w:type="dxa"/>
-            <w:vAlign w:val="center"/>
-          </w:tcPr>
-          <w:p>
-            <w:pPr>
-              <w:rPr>
-                <w:bCs/>
-              </w:rPr>
-            </w:pPr>
-          </w:p>
-        </w:tc>
-        <w:tc>
-          <w:tcPr>
-            <w:tcW w:w="904" w:type="dxa"/>
-            <w:vAlign w:val="center"/>
-          </w:tcPr>
-          <w:p>
-            <w:pPr>
-              <w:jc w:val="center"/>
-              <w:rPr>
-                <w:bCs/>
-              </w:rPr>
-            </w:pPr>
-          </w:p>
-        </w:tc>
-        <w:tc>
-          <w:tcPr>
-            <w:tcW w:w="913" w:type="dxa"/>
+            <w:tcW w:w="1495" w:type="dxa"/>
+            <w:vAlign w:val="center"/>
+          </w:tcPr>
+          <w:p>
+            <w:pPr>
+              <w:rPr>
+                <w:bCs/>
+              </w:rPr>
+            </w:pPr>
+          </w:p>
+        </w:tc>
+        <w:tc>
+          <w:tcPr>
+            <w:tcW w:w="720" w:type="dxa"/>
+            <w:vAlign w:val="center"/>
+          </w:tcPr>
+          <w:p>
+            <w:pPr>
+              <w:jc w:val="center"/>
+              <w:rPr>
+                <w:bCs/>
+              </w:rPr>
+            </w:pPr>
+          </w:p>
+        </w:tc>
+        <w:tc>
+          <w:tcPr>
+            <w:tcW w:w="900" w:type="dxa"/>
             <w:vAlign w:val="center"/>
           </w:tcPr>
           <w:p>
@@ -5562,27 +5591,46 @@
         </w:tc>
         <w:tc>
           <w:tcPr>
-            <w:tcW w:w="1091" w:type="dxa"/>
-            <w:vAlign w:val="center"/>
-          </w:tcPr>
-          <w:p>
-            <w:pPr>
-              <w:jc w:val="center"/>
-              <w:rPr>
-                <w:bCs/>
-              </w:rPr>
-            </w:pPr>
-            <w:r>
-              <w:rPr>
-                <w:bCs/>
-              </w:rPr>
-              <w:t>Linear vs no growth</w:t>
-            </w:r>
-          </w:p>
-        </w:tc>
-        <w:tc>
-          <w:tcPr>
-            <w:tcW w:w="904" w:type="dxa"/>
+            <w:tcW w:w="1495" w:type="dxa"/>
+            <w:vAlign w:val="center"/>
+          </w:tcPr>
+          <w:p>
+            <w:pPr>
+              <w:jc w:val="center"/>
+              <w:rPr>
+                <w:bCs/>
+                <w:i/>
+                <w:iCs/>
+              </w:rPr>
+            </w:pPr>
+            <w:r>
+              <w:rPr>
+                <w:bCs/>
+                <w:i/>
+                <w:iCs/>
+              </w:rPr>
+              <w:t>Model 6 vs 5</w:t>
+            </w:r>
+          </w:p>
+          <w:p>
+            <w:pPr>
+              <w:jc w:val="center"/>
+              <w:rPr>
+                <w:bCs/>
+                <w:highlight w:val="green"/>
+              </w:rPr>
+            </w:pPr>
+            <w:r>
+              <w:rPr>
+                <w:bCs/>
+              </w:rPr>
+              <w:t>1036.76</w:t>
+            </w:r>
+          </w:p>
+        </w:tc>
+        <w:tc>
+          <w:tcPr>
+            <w:tcW w:w="720" w:type="dxa"/>
             <w:vAlign w:val="center"/>
           </w:tcPr>
           <w:p>
@@ -5602,16 +5650,22 @@
         </w:tc>
         <w:tc>
           <w:tcPr>
-            <w:tcW w:w="913" w:type="dxa"/>
-            <w:vAlign w:val="center"/>
-          </w:tcPr>
-          <w:p>
-            <w:pPr>
-              <w:jc w:val="center"/>
-              <w:rPr>
-                <w:bCs/>
-              </w:rPr>
-            </w:pPr>
+            <w:tcW w:w="900" w:type="dxa"/>
+            <w:vAlign w:val="center"/>
+          </w:tcPr>
+          <w:p>
+            <w:pPr>
+              <w:jc w:val="center"/>
+              <w:rPr>
+                <w:bCs/>
+              </w:rPr>
+            </w:pPr>
+            <w:r>
+              <w:rPr>
+                <w:bCs/>
+              </w:rPr>
+              <w:t>&lt; .001</w:t>
+            </w:r>
           </w:p>
         </w:tc>
       </w:tr>
@@ -5827,56 +5881,81 @@
         </w:tc>
         <w:tc>
           <w:tcPr>
-            <w:tcW w:w="1091" w:type="dxa"/>
-            <w:vAlign w:val="center"/>
-          </w:tcPr>
-          <w:p>
-            <w:pPr>
-              <w:jc w:val="center"/>
-              <w:rPr>
-                <w:bCs/>
-              </w:rPr>
-            </w:pPr>
-            <w:r>
-              <w:rPr>
-                <w:bCs/>
-              </w:rPr>
-              <w:t>Quadratic vs linear</w:t>
-            </w:r>
-          </w:p>
-        </w:tc>
-        <w:tc>
-          <w:tcPr>
-            <w:tcW w:w="904" w:type="dxa"/>
-            <w:vAlign w:val="center"/>
-          </w:tcPr>
-          <w:p>
-            <w:pPr>
-              <w:jc w:val="center"/>
-              <w:rPr>
-                <w:bCs/>
-              </w:rPr>
-            </w:pPr>
-            <w:r>
-              <w:rPr>
-                <w:bCs/>
-              </w:rPr>
+            <w:tcW w:w="1495" w:type="dxa"/>
+            <w:vAlign w:val="center"/>
+          </w:tcPr>
+          <w:p>
+            <w:pPr>
+              <w:jc w:val="center"/>
+              <w:rPr>
+                <w:bCs/>
+                <w:i/>
+                <w:iCs/>
+              </w:rPr>
+            </w:pPr>
+            <w:r>
+              <w:rPr>
+                <w:bCs/>
+                <w:i/>
+                <w:iCs/>
+              </w:rPr>
+              <w:t>Model 7 vs 6</w:t>
+            </w:r>
+          </w:p>
+          <w:p>
+            <w:pPr>
+              <w:jc w:val="center"/>
+              <w:rPr>
+                <w:bCs/>
+                <w:highlight w:val="green"/>
+              </w:rPr>
+            </w:pPr>
+            <w:r>
               <w:t>1</w:t>
             </w:r>
-          </w:p>
-        </w:tc>
-        <w:tc>
-          <w:tcPr>
-            <w:tcW w:w="913" w:type="dxa"/>
-            <w:vAlign w:val="center"/>
-          </w:tcPr>
-          <w:p>
-            <w:pPr>
-              <w:jc w:val="center"/>
-              <w:rPr>
-                <w:bCs/>
-              </w:rPr>
-            </w:pPr>
+            <w:r>
+              <w:t>15.63</w:t>
+            </w:r>
+          </w:p>
+        </w:tc>
+        <w:tc>
+          <w:tcPr>
+            <w:tcW w:w="720" w:type="dxa"/>
+            <w:vAlign w:val="center"/>
+          </w:tcPr>
+          <w:p>
+            <w:pPr>
+              <w:jc w:val="center"/>
+              <w:rPr>
+                <w:bCs/>
+              </w:rPr>
+            </w:pPr>
+            <w:r>
+              <w:rPr>
+                <w:bCs/>
+              </w:rPr>
+              <w:t>1</w:t>
+            </w:r>
+          </w:p>
+        </w:tc>
+        <w:tc>
+          <w:tcPr>
+            <w:tcW w:w="900" w:type="dxa"/>
+            <w:vAlign w:val="center"/>
+          </w:tcPr>
+          <w:p>
+            <w:pPr>
+              <w:jc w:val="center"/>
+              <w:rPr>
+                <w:bCs/>
+              </w:rPr>
+            </w:pPr>
+            <w:r>
+              <w:rPr>
+                <w:bCs/>
+              </w:rPr>
+              <w:t>&lt; .001</w:t>
+            </w:r>
           </w:p>
         </w:tc>
       </w:tr>
@@ -6139,7 +6218,7 @@
         </w:tc>
         <w:tc>
           <w:tcPr>
-            <w:tcW w:w="1091" w:type="dxa"/>
+            <w:tcW w:w="1495" w:type="dxa"/>
             <w:tcBorders>
               <w:bottom w:val="single" w:sz="4" w:space="0" w:color="auto"/>
             </w:tcBorders>
@@ -6148,15 +6227,43 @@
           <w:p>
             <w:pPr>
               <w:jc w:val="center"/>
-            </w:pPr>
-            <w:r>
-              <w:t>Latent basis vs linear</w:t>
-            </w:r>
-          </w:p>
-        </w:tc>
-        <w:tc>
-          <w:tcPr>
-            <w:tcW w:w="904" w:type="dxa"/>
+              <w:rPr>
+                <w:i/>
+                <w:iCs/>
+              </w:rPr>
+            </w:pPr>
+            <w:r>
+              <w:rPr>
+                <w:i/>
+                <w:iCs/>
+              </w:rPr>
+              <w:t>Model 8 vs 6</w:t>
+            </w:r>
+          </w:p>
+          <w:p>
+            <w:pPr>
+              <w:jc w:val="center"/>
+              <w:rPr>
+                <w:highlight w:val="green"/>
+              </w:rPr>
+            </w:pPr>
+            <w:r>
+              <w:rPr>
+                <w:bCs/>
+              </w:rPr>
+              <w:t>1</w:t>
+            </w:r>
+            <w:r>
+              <w:rPr>
+                <w:bCs/>
+              </w:rPr>
+              <w:t>73.73</w:t>
+            </w:r>
+          </w:p>
+        </w:tc>
+        <w:tc>
+          <w:tcPr>
+            <w:tcW w:w="720" w:type="dxa"/>
             <w:tcBorders>
               <w:bottom w:val="single" w:sz="4" w:space="0" w:color="auto"/>
             </w:tcBorders>
@@ -6173,7 +6280,7 @@
         </w:tc>
         <w:tc>
           <w:tcPr>
-            <w:tcW w:w="913" w:type="dxa"/>
+            <w:tcW w:w="900" w:type="dxa"/>
             <w:tcBorders>
               <w:bottom w:val="single" w:sz="4" w:space="0" w:color="auto"/>
             </w:tcBorders>
@@ -6186,6 +6293,12 @@
                 <w:bCs/>
               </w:rPr>
             </w:pPr>
+            <w:r>
+              <w:rPr>
+                <w:bCs/>
+              </w:rPr>
+              <w:t>&lt; .001</w:t>
+            </w:r>
           </w:p>
         </w:tc>
       </w:tr>
@@ -6351,24 +6464,7 @@
 
 <file path=word/comments.xml><?xml version="1.0" encoding="utf-8"?>
 <w:comments xmlns:wpc="http://schemas.microsoft.com/office/word/2010/wordprocessingCanvas" xmlns:cx="http://schemas.microsoft.com/office/drawing/2014/chartex" xmlns:cx1="http://schemas.microsoft.com/office/drawing/2015/9/8/chartex" xmlns:cx2="http://schemas.microsoft.com/office/drawing/2015/10/21/chartex" xmlns:cx3="http://schemas.microsoft.com/office/drawing/2016/5/9/chartex" xmlns:cx4="http://schemas.microsoft.com/office/drawing/2016/5/10/chartex" xmlns:cx5="http://schemas.microsoft.com/office/drawing/2016/5/11/chartex" xmlns:cx6="http://schemas.microsoft.com/office/drawing/2016/5/12/chartex" xmlns:cx7="http://schemas.microsoft.com/office/drawing/2016/5/13/chartex" xmlns:cx8="http://schemas.microsoft.com/office/drawing/2016/5/14/chartex" xmlns:mc="http://schemas.openxmlformats.org/markup-compatibility/2006" xmlns:aink="http://schemas.microsoft.com/office/drawing/2016/ink" xmlns:am3d="http://schemas.microsoft.com/office/drawing/2017/model3d" xmlns:o="urn:schemas-microsoft-com:office:office" xmlns:oel="http://schemas.microsoft.com/office/2019/extlst" xmlns:r="http://schemas.openxmlformats.org/officeDocument/2006/relationships" xmlns:m="http://schemas.openxmlformats.org/officeDocument/2006/math" xmlns:v="urn:schemas-microsoft-com:vml" xmlns:wp14="http://schemas.microsoft.com/office/word/2010/wordprocessingDrawing" xmlns:wp="http://schemas.openxmlformats.org/drawingml/2006/wordprocessingDrawing" xmlns:w10="urn:schemas-microsoft-com:office:word" xmlns:w="http://schemas.openxmlformats.org/wordprocessingml/2006/main" xmlns:w14="http://schemas.microsoft.com/office/word/2010/wordml" xmlns:w15="http://schemas.microsoft.com/office/word/2012/wordml" xmlns:w16cex="http://schemas.microsoft.com/office/word/2018/wordml/cex" xmlns:w16cid="http://schemas.microsoft.com/office/word/2016/wordml/cid" xmlns:w16="http://schemas.microsoft.com/office/word/2018/wordml" xmlns:w16du="http://schemas.microsoft.com/office/word/2023/wordml/word16du" xmlns:w16sdtdh="http://schemas.microsoft.com/office/word/2020/wordml/sdtdatahash" xmlns:w16sdtfl="http://schemas.microsoft.com/office/word/2024/wordml/sdtformatlock" xmlns:w16se="http://schemas.microsoft.com/office/word/2015/wordml/symex" xmlns:wpg="http://schemas.microsoft.com/office/word/2010/wordprocessingGroup" xmlns:wpi="http://schemas.microsoft.com/office/word/2010/wordprocessingInk" xmlns:wne="http://schemas.microsoft.com/office/word/2006/wordml" xmlns:wps="http://schemas.microsoft.com/office/word/2010/wordprocessingShape" mc:Ignorable="w14 w15 w16se w16cid w16 w16cex w16sdtdh w16sdtfl w16du wp14">
-  <w:comment w:id="0" w:author="Alexis Brieant" w:date="2025-08-22T12:28:00Z" w:initials="AB">
-    <w:p>
-      <w:r>
-        <w:rPr>
-          <w:rStyle w:val="CommentReference"/>
-        </w:rPr>
-        <w:annotationRef/>
-      </w:r>
-      <w:r>
-        <w:rPr>
-          <w:sz w:val="20"/>
-          <w:szCs w:val="20"/>
-        </w:rPr>
-        <w:t>For nested models only</w:t>
-      </w:r>
-    </w:p>
-  </w:comment>
-  <w:comment w:id="1" w:author="Alexis Brieant" w:date="2026-01-26T14:39:00Z" w:initials="AB">
+  <w:comment w:id="0" w:author="Alexis Brieant" w:date="2026-01-26T14:39:00Z" w:initials="AB">
     <w:p>
       <w:r>
         <w:rPr>
@@ -6390,21 +6486,18 @@
 
 <file path=word/commentsExtended.xml><?xml version="1.0" encoding="utf-8"?>
 <w15:commentsEx xmlns:wpc="http://schemas.microsoft.com/office/word/2010/wordprocessingCanvas" xmlns:cx="http://schemas.microsoft.com/office/drawing/2014/chartex" xmlns:cx1="http://schemas.microsoft.com/office/drawing/2015/9/8/chartex" xmlns:cx2="http://schemas.microsoft.com/office/drawing/2015/10/21/chartex" xmlns:cx3="http://schemas.microsoft.com/office/drawing/2016/5/9/chartex" xmlns:cx4="http://schemas.microsoft.com/office/drawing/2016/5/10/chartex" xmlns:cx5="http://schemas.microsoft.com/office/drawing/2016/5/11/chartex" xmlns:cx6="http://schemas.microsoft.com/office/drawing/2016/5/12/chartex" xmlns:cx7="http://schemas.microsoft.com/office/drawing/2016/5/13/chartex" xmlns:cx8="http://schemas.microsoft.com/office/drawing/2016/5/14/chartex" xmlns:mc="http://schemas.openxmlformats.org/markup-compatibility/2006" xmlns:aink="http://schemas.microsoft.com/office/drawing/2016/ink" xmlns:am3d="http://schemas.microsoft.com/office/drawing/2017/model3d" xmlns:o="urn:schemas-microsoft-com:office:office" xmlns:oel="http://schemas.microsoft.com/office/2019/extlst" xmlns:r="http://schemas.openxmlformats.org/officeDocument/2006/relationships" xmlns:m="http://schemas.openxmlformats.org/officeDocument/2006/math" xmlns:v="urn:schemas-microsoft-com:vml" xmlns:wp14="http://schemas.microsoft.com/office/word/2010/wordprocessingDrawing" xmlns:wp="http://schemas.openxmlformats.org/drawingml/2006/wordprocessingDrawing" xmlns:w10="urn:schemas-microsoft-com:office:word" xmlns:w="http://schemas.openxmlformats.org/wordprocessingml/2006/main" xmlns:w14="http://schemas.microsoft.com/office/word/2010/wordml" xmlns:w15="http://schemas.microsoft.com/office/word/2012/wordml" xmlns:w16cex="http://schemas.microsoft.com/office/word/2018/wordml/cex" xmlns:w16cid="http://schemas.microsoft.com/office/word/2016/wordml/cid" xmlns:w16="http://schemas.microsoft.com/office/word/2018/wordml" xmlns:w16du="http://schemas.microsoft.com/office/word/2023/wordml/word16du" xmlns:w16sdtdh="http://schemas.microsoft.com/office/word/2020/wordml/sdtdatahash" xmlns:w16sdtfl="http://schemas.microsoft.com/office/word/2024/wordml/sdtformatlock" xmlns:w16se="http://schemas.microsoft.com/office/word/2015/wordml/symex" xmlns:wpg="http://schemas.microsoft.com/office/word/2010/wordprocessingGroup" xmlns:wpi="http://schemas.microsoft.com/office/word/2010/wordprocessingInk" xmlns:wne="http://schemas.microsoft.com/office/word/2006/wordml" xmlns:wps="http://schemas.microsoft.com/office/word/2010/wordprocessingShape" mc:Ignorable="w14 w15 w16se w16cid w16 w16cex w16sdtdh w16sdtfl w16du wp14">
-  <w15:commentEx w15:paraId="4F6B486A" w15:done="0"/>
   <w15:commentEx w15:paraId="59404078" w15:done="0"/>
 </w15:commentsEx>
 </file>
 
 <file path=word/commentsExtensible.xml><?xml version="1.0" encoding="utf-8"?>
 <w16cex:commentsExtensible xmlns:wpc="http://schemas.microsoft.com/office/word/2010/wordprocessingCanvas" xmlns:cx="http://schemas.microsoft.com/office/drawing/2014/chartex" xmlns:cx1="http://schemas.microsoft.com/office/drawing/2015/9/8/chartex" xmlns:cx2="http://schemas.microsoft.com/office/drawing/2015/10/21/chartex" xmlns:cx3="http://schemas.microsoft.com/office/drawing/2016/5/9/chartex" xmlns:cx4="http://schemas.microsoft.com/office/drawing/2016/5/10/chartex" xmlns:cx5="http://schemas.microsoft.com/office/drawing/2016/5/11/chartex" xmlns:cx6="http://schemas.microsoft.com/office/drawing/2016/5/12/chartex" xmlns:cx7="http://schemas.microsoft.com/office/drawing/2016/5/13/chartex" xmlns:cx8="http://schemas.microsoft.com/office/drawing/2016/5/14/chartex" xmlns:cr="http://schemas.microsoft.com/office/comments/2020/reactions" xmlns:mc="http://schemas.openxmlformats.org/markup-compatibility/2006" xmlns:aink="http://schemas.microsoft.com/office/drawing/2016/ink" xmlns:am3d="http://schemas.microsoft.com/office/drawing/2017/model3d" xmlns:o="urn:schemas-microsoft-com:office:office" xmlns:oel="http://schemas.microsoft.com/office/2019/extlst" xmlns:r="http://schemas.openxmlformats.org/officeDocument/2006/relationships" xmlns:m="http://schemas.openxmlformats.org/officeDocument/2006/math" xmlns:v="urn:schemas-microsoft-com:vml" xmlns:wp14="http://schemas.microsoft.com/office/word/2010/wordprocessingDrawing" xmlns:wp="http://schemas.openxmlformats.org/drawingml/2006/wordprocessingDrawing" xmlns:w10="urn:schemas-microsoft-com:office:word" xmlns:w="http://schemas.openxmlformats.org/wordprocessingml/2006/main" xmlns:w14="http://schemas.microsoft.com/office/word/2010/wordml" xmlns:w15="http://schemas.microsoft.com/office/word/2012/wordml" xmlns:w16cex="http://schemas.microsoft.com/office/word/2018/wordml/cex" xmlns:w16cid="http://schemas.microsoft.com/office/word/2016/wordml/cid" xmlns:w16="http://schemas.microsoft.com/office/word/2018/wordml" xmlns:w16du="http://schemas.microsoft.com/office/word/2023/wordml/word16du" xmlns:w16sdtdh="http://schemas.microsoft.com/office/word/2020/wordml/sdtdatahash" xmlns:w16sdtfl="http://schemas.microsoft.com/office/word/2024/wordml/sdtformatlock" xmlns:w16se="http://schemas.microsoft.com/office/word/2015/wordml/symex" xmlns:wpg="http://schemas.microsoft.com/office/word/2010/wordprocessingGroup" xmlns:wpi="http://schemas.microsoft.com/office/word/2010/wordprocessingInk" xmlns:wne="http://schemas.microsoft.com/office/word/2006/wordml" xmlns:wps="http://schemas.microsoft.com/office/word/2010/wordprocessingShape" mc:Ignorable="w14 w15 w16se w16cid w16 w16cex w16sdtdh w16sdtfl cr w16du wp14">
-  <w16cex:commentExtensible w16cex:durableId="3AB03CC9" w16cex:dateUtc="2025-08-22T16:28:00Z"/>
   <w16cex:commentExtensible w16cex:durableId="5BCAEF10" w16cex:dateUtc="2026-01-26T19:39:00Z"/>
 </w16cex:commentsExtensible>
 </file>
 
 <file path=word/commentsIds.xml><?xml version="1.0" encoding="utf-8"?>
 <w16cid:commentsIds xmlns:wpc="http://schemas.microsoft.com/office/word/2010/wordprocessingCanvas" xmlns:cx="http://schemas.microsoft.com/office/drawing/2014/chartex" xmlns:cx1="http://schemas.microsoft.com/office/drawing/2015/9/8/chartex" xmlns:cx2="http://schemas.microsoft.com/office/drawing/2015/10/21/chartex" xmlns:cx3="http://schemas.microsoft.com/office/drawing/2016/5/9/chartex" xmlns:cx4="http://schemas.microsoft.com/office/drawing/2016/5/10/chartex" xmlns:cx5="http://schemas.microsoft.com/office/drawing/2016/5/11/chartex" xmlns:cx6="http://schemas.microsoft.com/office/drawing/2016/5/12/chartex" xmlns:cx7="http://schemas.microsoft.com/office/drawing/2016/5/13/chartex" xmlns:cx8="http://schemas.microsoft.com/office/drawing/2016/5/14/chartex" xmlns:mc="http://schemas.openxmlformats.org/markup-compatibility/2006" xmlns:aink="http://schemas.microsoft.com/office/drawing/2016/ink" xmlns:am3d="http://schemas.microsoft.com/office/drawing/2017/model3d" xmlns:o="urn:schemas-microsoft-com:office:office" xmlns:oel="http://schemas.microsoft.com/office/2019/extlst" xmlns:r="http://schemas.openxmlformats.org/officeDocument/2006/relationships" xmlns:m="http://schemas.openxmlformats.org/officeDocument/2006/math" xmlns:v="urn:schemas-microsoft-com:vml" xmlns:wp14="http://schemas.microsoft.com/office/word/2010/wordprocessingDrawing" xmlns:wp="http://schemas.openxmlformats.org/drawingml/2006/wordprocessingDrawing" xmlns:w10="urn:schemas-microsoft-com:office:word" xmlns:w="http://schemas.openxmlformats.org/wordprocessingml/2006/main" xmlns:w14="http://schemas.microsoft.com/office/word/2010/wordml" xmlns:w15="http://schemas.microsoft.com/office/word/2012/wordml" xmlns:w16cex="http://schemas.microsoft.com/office/word/2018/wordml/cex" xmlns:w16cid="http://schemas.microsoft.com/office/word/2016/wordml/cid" xmlns:w16="http://schemas.microsoft.com/office/word/2018/wordml" xmlns:w16du="http://schemas.microsoft.com/office/word/2023/wordml/word16du" xmlns:w16sdtdh="http://schemas.microsoft.com/office/word/2020/wordml/sdtdatahash" xmlns:w16sdtfl="http://schemas.microsoft.com/office/word/2024/wordml/sdtformatlock" xmlns:w16se="http://schemas.microsoft.com/office/word/2015/wordml/symex" xmlns:wpg="http://schemas.microsoft.com/office/word/2010/wordprocessingGroup" xmlns:wpi="http://schemas.microsoft.com/office/word/2010/wordprocessingInk" xmlns:wne="http://schemas.microsoft.com/office/word/2006/wordml" xmlns:wps="http://schemas.microsoft.com/office/word/2010/wordprocessingShape" mc:Ignorable="w14 w15 w16se w16cid w16 w16cex w16sdtdh w16sdtfl w16du wp14">
-  <w16cid:commentId w16cid:paraId="4F6B486A" w16cid:durableId="3AB03CC9"/>
   <w16cid:commentId w16cid:paraId="59404078" w16cid:durableId="5BCAEF10"/>
 </w16cid:commentsIds>
 </file>

</xml_diff>

<commit_message>
ran remaining puberty sensitivity models
</commit_message>
<xml_diff>
--- a/GMV_timing_tempo_models/DCN analyses/GMV_fit_indices.docx
+++ b/GMV_timing_tempo_models/DCN analyses/GMV_fit_indices.docx
@@ -3269,18 +3269,11 @@
       <w:r>
         <w:rPr>
           <w:rFonts w:eastAsia="Calibri"/>
-          <w:highlight w:val="yellow"/>
         </w:rPr>
         <w:t>*</w:t>
       </w:r>
       <w:r>
-        <w:rPr>
-          <w:highlight w:val="yellow"/>
-        </w:rPr>
-        <w:t xml:space="preserve"> The variance and covariances of the linear slope factor were fixed to zero because they were not identified</w:t>
-      </w:r>
-      <w:r>
-        <w:t>.</w:t>
+        <w:t xml:space="preserve"> The variance and covariances of the linear slope factor were fixed to zero because they were not identified.</w:t>
       </w:r>
     </w:p>
     <w:p>
@@ -6406,38 +6399,16 @@
       <w:r>
         <w:rPr>
           <w:rFonts w:eastAsia="Calibri"/>
-          <w:highlight w:val="yellow"/>
         </w:rPr>
         <w:t>*</w:t>
       </w:r>
       <w:r>
-        <w:rPr>
-          <w:highlight w:val="yellow"/>
-        </w:rPr>
         <w:t xml:space="preserve"> The variance and covariances </w:t>
       </w:r>
       <w:r>
-        <w:rPr>
-          <w:highlight w:val="yellow"/>
-        </w:rPr>
-        <w:t xml:space="preserve">of the </w:t>
+        <w:t xml:space="preserve">of the linear slope factor </w:t>
       </w:r>
       <w:r>
-        <w:rPr>
-          <w:highlight w:val="yellow"/>
-        </w:rPr>
-        <w:t xml:space="preserve">linear slope </w:t>
-      </w:r>
-      <w:r>
-        <w:rPr>
-          <w:highlight w:val="yellow"/>
-        </w:rPr>
-        <w:t xml:space="preserve">factor </w:t>
-      </w:r>
-      <w:r>
-        <w:rPr>
-          <w:highlight w:val="yellow"/>
-        </w:rPr>
         <w:t>were fixed to zero because they were not identified</w:t>
       </w:r>
       <w:r>

</xml_diff>